<commit_message>
Upgrade APA research pack and download button
</commit_message>
<xml_diff>
--- a/public/clinical-sociolinguistics-apa7-research-pack.docx
+++ b/public/clinical-sociolinguistics-apa7-research-pack.docx
@@ -213,7 +213,7 @@
                 <w:color w:val="19352D"/>
                 <w:sz w:val="20"/>
               </w:rPr>
-              <w:t>2026 年 8 月 27 日</w:t>
+              <w:t>2026 年 9 月 6 日</w:t>
             </w:r>
           </w:p>
         </w:tc>
@@ -269,7 +269,7 @@
           <w:color w:val="19352D"/>
           <w:sz w:val="24"/>
         </w:rPr>
-        <w:t>本整理包將《Clinical Sociolinguistics》（Ball, 2005）21 章閱讀心得轉譯為研究設計資源，聚焦社會網絡、多語生命史、臨床公平性、識字／語言社會化與語群個案五個主題群。文件以高齡阿美族語與神經認知研究為情境，彙整章節資料、變項操作化、概念路徑、雙軸證據框架、研究缺口優先序與參與式資料流程。每一圖表均附阿美族相關研究的可點擊連結與連接說明，以便追索證據與延伸閱讀。</w:t>
+        <w:t>本整理包將《Clinical Sociolinguistics》（Ball, 2005）21章閱讀心得及《關鍵科技探索—人工智慧》五章課程整理轉譯為研究設計資源。文件以高齡阿美族語與神經認知研究為情境，彙整章節資料、變項操作化、概念路徑、人工智慧知識地圖、雙軸證據框架、研究缺口優先序與參與式資料流程。每一圖表均附阿美族相關研究的可點擊連結與連接說明，以便追索證據與延伸閱讀。</w:t>
       </w:r>
     </w:p>
     <w:p>
@@ -5001,6 +5001,1890 @@
       </w:r>
     </w:p>
     <w:p>
+      <w:r>
+        <w:br w:type="page"/>
+      </w:r>
+    </w:p>
+    <w:p>
+      <w:pPr>
+        <w:keepNext/>
+        <w:spacing w:before="320" w:after="160"/>
+      </w:pPr>
+      <w:r>
+        <w:rPr>
+          <w:rFonts w:ascii="DFKai-SB" w:hAnsi="DFKai-SB" w:eastAsia="DFKai-SB" w:cs="DFKai-SB"/>
+          <w:b/>
+          <w:i w:val="0"/>
+          <w:color w:val="19352D"/>
+          <w:sz w:val="32"/>
+        </w:rPr>
+        <w:t>關鍵科技探索—人工智慧：五章研究轉譯</w:t>
+      </w:r>
+    </w:p>
+    <w:p>
+      <w:pPr>
+        <w:keepNext/>
+        <w:spacing w:before="200" w:after="0"/>
+      </w:pPr>
+      <w:r>
+        <w:rPr>
+          <w:rFonts w:ascii="DFKai-SB" w:hAnsi="DFKai-SB" w:eastAsia="DFKai-SB" w:cs="DFKai-SB"/>
+          <w:b/>
+          <w:i w:val="0"/>
+          <w:color w:val="19352D"/>
+          <w:sz w:val="22"/>
+        </w:rPr>
+        <w:t>表 5</w:t>
+      </w:r>
+    </w:p>
+    <w:p>
+      <w:pPr>
+        <w:keepNext/>
+        <w:spacing w:after="100"/>
+      </w:pPr>
+      <w:r>
+        <w:rPr>
+          <w:rFonts w:ascii="DFKai-SB" w:hAnsi="DFKai-SB" w:eastAsia="DFKai-SB" w:cs="DFKai-SB"/>
+          <w:b w:val="0"/>
+          <w:i/>
+          <w:color w:val="19352D"/>
+          <w:sz w:val="22"/>
+        </w:rPr>
+        <w:t>人工智慧五章、主題單元與阿美族研究連接</w:t>
+      </w:r>
+    </w:p>
+    <w:tbl>
+      <w:tblPr>
+        <w:tblW w:type="dxa" w:w="8844"/>
+        <w:jc w:val="center"/>
+        <w:tblLayout w:type="fixed"/>
+        <w:tblLook w:firstColumn="1" w:firstRow="1" w:lastColumn="0" w:lastRow="0" w:noHBand="0" w:noVBand="1" w:val="04A0"/>
+        <w:tblBorders>
+          <w:top w:val="single" w:sz="6" w:color="C8CFC8"/>
+          <w:left w:val="single" w:sz="6" w:color="C8CFC8"/>
+          <w:bottom w:val="single" w:sz="6" w:color="C8CFC8"/>
+          <w:right w:val="single" w:sz="6" w:color="C8CFC8"/>
+          <w:insideH w:val="single" w:sz="6" w:color="C8CFC8"/>
+          <w:insideV w:val="single" w:sz="6" w:color="C8CFC8"/>
+        </w:tblBorders>
+      </w:tblPr>
+      <w:tblGrid>
+        <w:gridCol w:w="1417"/>
+        <w:gridCol w:w="2267"/>
+        <w:gridCol w:w="2834"/>
+        <w:gridCol w:w="2324"/>
+      </w:tblGrid>
+      <w:tr>
+        <w:trPr>
+          <w:tblHeader/>
+        </w:trPr>
+        <w:tc>
+          <w:tcPr>
+            <w:tcW w:type="dxa" w:w="1417"/>
+            <w:shd w:fill="19352D"/>
+            <w:tcMar>
+              <w:top w:w="90" w:type="dxa"/>
+              <w:left w:w="100" w:type="dxa"/>
+              <w:bottom w:w="90" w:type="dxa"/>
+              <w:right w:w="100" w:type="dxa"/>
+            </w:tcMar>
+            <w:vAlign w:val="center"/>
+          </w:tcPr>
+          <w:p>
+            <w:pPr>
+              <w:spacing w:after="0"/>
+              <w:jc w:val="center"/>
+            </w:pPr>
+            <w:r>
+              <w:rPr>
+                <w:rFonts w:ascii="DFKai-SB" w:hAnsi="DFKai-SB" w:eastAsia="DFKai-SB" w:cs="DFKai-SB"/>
+                <w:b/>
+                <w:i w:val="0"/>
+                <w:color w:val="FFFFFF"/>
+                <w:sz w:val="18"/>
+              </w:rPr>
+              <w:t>章／定位</w:t>
+            </w:r>
+          </w:p>
+        </w:tc>
+        <w:tc>
+          <w:tcPr>
+            <w:tcW w:type="dxa" w:w="2267"/>
+            <w:shd w:fill="19352D"/>
+            <w:tcMar>
+              <w:top w:w="90" w:type="dxa"/>
+              <w:left w:w="100" w:type="dxa"/>
+              <w:bottom w:w="90" w:type="dxa"/>
+              <w:right w:w="100" w:type="dxa"/>
+            </w:tcMar>
+            <w:vAlign w:val="center"/>
+          </w:tcPr>
+          <w:p>
+            <w:pPr>
+              <w:spacing w:after="0"/>
+              <w:jc w:val="center"/>
+            </w:pPr>
+            <w:r>
+              <w:rPr>
+                <w:rFonts w:ascii="DFKai-SB" w:hAnsi="DFKai-SB" w:eastAsia="DFKai-SB" w:cs="DFKai-SB"/>
+                <w:b/>
+                <w:i w:val="0"/>
+                <w:color w:val="FFFFFF"/>
+                <w:sz w:val="18"/>
+              </w:rPr>
+              <w:t>主題單元</w:t>
+            </w:r>
+          </w:p>
+        </w:tc>
+        <w:tc>
+          <w:tcPr>
+            <w:tcW w:type="dxa" w:w="2834"/>
+            <w:shd w:fill="19352D"/>
+            <w:tcMar>
+              <w:top w:w="90" w:type="dxa"/>
+              <w:left w:w="100" w:type="dxa"/>
+              <w:bottom w:w="90" w:type="dxa"/>
+              <w:right w:w="100" w:type="dxa"/>
+            </w:tcMar>
+            <w:vAlign w:val="center"/>
+          </w:tcPr>
+          <w:p>
+            <w:pPr>
+              <w:spacing w:after="0"/>
+              <w:jc w:val="center"/>
+            </w:pPr>
+            <w:r>
+              <w:rPr>
+                <w:rFonts w:ascii="DFKai-SB" w:hAnsi="DFKai-SB" w:eastAsia="DFKai-SB" w:cs="DFKai-SB"/>
+                <w:b/>
+                <w:i w:val="0"/>
+                <w:color w:val="FFFFFF"/>
+                <w:sz w:val="18"/>
+              </w:rPr>
+              <w:t>研究轉譯</w:t>
+            </w:r>
+          </w:p>
+        </w:tc>
+        <w:tc>
+          <w:tcPr>
+            <w:tcW w:type="dxa" w:w="2324"/>
+            <w:shd w:fill="19352D"/>
+            <w:tcMar>
+              <w:top w:w="90" w:type="dxa"/>
+              <w:left w:w="100" w:type="dxa"/>
+              <w:bottom w:w="90" w:type="dxa"/>
+              <w:right w:w="100" w:type="dxa"/>
+            </w:tcMar>
+            <w:vAlign w:val="center"/>
+          </w:tcPr>
+          <w:p>
+            <w:pPr>
+              <w:spacing w:after="0"/>
+              <w:jc w:val="center"/>
+            </w:pPr>
+            <w:r>
+              <w:rPr>
+                <w:rFonts w:ascii="DFKai-SB" w:hAnsi="DFKai-SB" w:eastAsia="DFKai-SB" w:cs="DFKai-SB"/>
+                <w:b/>
+                <w:i w:val="0"/>
+                <w:color w:val="FFFFFF"/>
+                <w:sz w:val="18"/>
+              </w:rPr>
+              <w:t>阿美族研究連接</w:t>
+            </w:r>
+          </w:p>
+        </w:tc>
+      </w:tr>
+      <w:tr>
+        <w:tc>
+          <w:tcPr>
+            <w:tcW w:type="dxa" w:w="1417"/>
+            <w:tcMar>
+              <w:top w:w="90" w:type="dxa"/>
+              <w:left w:w="100" w:type="dxa"/>
+              <w:bottom w:w="90" w:type="dxa"/>
+              <w:right w:w="100" w:type="dxa"/>
+            </w:tcMar>
+            <w:vAlign w:val="center"/>
+          </w:tcPr>
+          <w:p>
+            <w:pPr>
+              <w:spacing w:after="0" w:line="276" w:lineRule="auto"/>
+              <w:jc w:val="left"/>
+            </w:pPr>
+            <w:r>
+              <w:rPr>
+                <w:rFonts w:ascii="DFKai-SB" w:hAnsi="DFKai-SB" w:eastAsia="DFKai-SB" w:cs="DFKai-SB"/>
+                <w:b/>
+                <w:i w:val="0"/>
+                <w:color w:val="19352D"/>
+                <w:sz w:val="17"/>
+              </w:rPr>
+              <w:t>第1章／技術底座</w:t>
+            </w:r>
+          </w:p>
+        </w:tc>
+        <w:tc>
+          <w:tcPr>
+            <w:tcW w:type="dxa" w:w="2267"/>
+            <w:tcMar>
+              <w:top w:w="90" w:type="dxa"/>
+              <w:left w:w="100" w:type="dxa"/>
+              <w:bottom w:w="90" w:type="dxa"/>
+              <w:right w:w="100" w:type="dxa"/>
+            </w:tcMar>
+            <w:vAlign w:val="center"/>
+          </w:tcPr>
+          <w:p>
+            <w:pPr>
+              <w:spacing w:after="0" w:line="276" w:lineRule="auto"/>
+              <w:jc w:val="both"/>
+            </w:pPr>
+            <w:r>
+              <w:rPr>
+                <w:rFonts w:ascii="DFKai-SB" w:hAnsi="DFKai-SB" w:eastAsia="DFKai-SB" w:cs="DFKai-SB"/>
+                <w:b w:val="0"/>
+                <w:i w:val="0"/>
+                <w:color w:val="19352D"/>
+                <w:sz w:val="17"/>
+              </w:rPr>
+              <w:t>AI演進、ANN、機器學習、No-Code、CPU／GPU、資料庫</w:t>
+            </w:r>
+          </w:p>
+        </w:tc>
+        <w:tc>
+          <w:tcPr>
+            <w:tcW w:type="dxa" w:w="2834"/>
+            <w:tcMar>
+              <w:top w:w="90" w:type="dxa"/>
+              <w:left w:w="100" w:type="dxa"/>
+              <w:bottom w:w="90" w:type="dxa"/>
+              <w:right w:w="100" w:type="dxa"/>
+            </w:tcMar>
+            <w:vAlign w:val="center"/>
+          </w:tcPr>
+          <w:p>
+            <w:pPr>
+              <w:spacing w:after="0" w:line="276" w:lineRule="auto"/>
+              <w:jc w:val="both"/>
+            </w:pPr>
+            <w:r>
+              <w:rPr>
+                <w:rFonts w:ascii="DFKai-SB" w:hAnsi="DFKai-SB" w:eastAsia="DFKai-SB" w:cs="DFKai-SB"/>
+                <w:b w:val="0"/>
+                <w:i w:val="0"/>
+                <w:color w:val="19352D"/>
+                <w:sz w:val="17"/>
+              </w:rPr>
+              <w:t>比較臨床特徵、語言特徵及病前語言生態的增量價值</w:t>
+            </w:r>
+          </w:p>
+        </w:tc>
+        <w:tc>
+          <w:tcPr>
+            <w:tcW w:type="dxa" w:w="2324"/>
+            <w:tcMar>
+              <w:top w:w="90" w:type="dxa"/>
+              <w:left w:w="100" w:type="dxa"/>
+              <w:bottom w:w="90" w:type="dxa"/>
+              <w:right w:w="100" w:type="dxa"/>
+            </w:tcMar>
+            <w:vAlign w:val="center"/>
+          </w:tcPr>
+          <w:p>
+            <w:pPr>
+              <w:spacing w:after="0" w:line="276" w:lineRule="auto"/>
+              <w:jc w:val="both"/>
+            </w:pPr>
+            <w:r>
+              <w:rPr>
+                <w:rFonts w:ascii="DFKai-SB" w:hAnsi="DFKai-SB" w:eastAsia="DFKai-SB" w:cs="DFKai-SB"/>
+                <w:b w:val="0"/>
+                <w:i w:val="0"/>
+                <w:color w:val="19352D"/>
+                <w:sz w:val="17"/>
+              </w:rPr>
+              <w:t>以語言活力、代間傳承及使用領域建立病前基準</w:t>
+            </w:r>
+          </w:p>
+        </w:tc>
+      </w:tr>
+      <w:tr>
+        <w:tc>
+          <w:tcPr>
+            <w:tcW w:type="dxa" w:w="1417"/>
+            <w:shd w:fill="F7F3EA"/>
+            <w:tcMar>
+              <w:top w:w="90" w:type="dxa"/>
+              <w:left w:w="100" w:type="dxa"/>
+              <w:bottom w:w="90" w:type="dxa"/>
+              <w:right w:w="100" w:type="dxa"/>
+            </w:tcMar>
+            <w:vAlign w:val="center"/>
+          </w:tcPr>
+          <w:p>
+            <w:pPr>
+              <w:spacing w:after="0" w:line="276" w:lineRule="auto"/>
+              <w:jc w:val="left"/>
+            </w:pPr>
+            <w:r>
+              <w:rPr>
+                <w:rFonts w:ascii="DFKai-SB" w:hAnsi="DFKai-SB" w:eastAsia="DFKai-SB" w:cs="DFKai-SB"/>
+                <w:b/>
+                <w:i w:val="0"/>
+                <w:color w:val="19352D"/>
+                <w:sz w:val="17"/>
+              </w:rPr>
+              <w:t>第2章／臨床決策</w:t>
+            </w:r>
+          </w:p>
+        </w:tc>
+        <w:tc>
+          <w:tcPr>
+            <w:tcW w:type="dxa" w:w="2267"/>
+            <w:shd w:fill="F7F3EA"/>
+            <w:tcMar>
+              <w:top w:w="90" w:type="dxa"/>
+              <w:left w:w="100" w:type="dxa"/>
+              <w:bottom w:w="90" w:type="dxa"/>
+              <w:right w:w="100" w:type="dxa"/>
+            </w:tcMar>
+            <w:vAlign w:val="center"/>
+          </w:tcPr>
+          <w:p>
+            <w:pPr>
+              <w:spacing w:after="0" w:line="276" w:lineRule="auto"/>
+              <w:jc w:val="both"/>
+            </w:pPr>
+            <w:r>
+              <w:rPr>
+                <w:rFonts w:ascii="DFKai-SB" w:hAnsi="DFKai-SB" w:eastAsia="DFKai-SB" w:cs="DFKai-SB"/>
+                <w:b w:val="0"/>
+                <w:i w:val="0"/>
+                <w:color w:val="19352D"/>
+                <w:sz w:val="17"/>
+              </w:rPr>
+              <w:t>問題定義、資料前處理、決策樹與迴歸、模型評估</w:t>
+            </w:r>
+          </w:p>
+        </w:tc>
+        <w:tc>
+          <w:tcPr>
+            <w:tcW w:type="dxa" w:w="2834"/>
+            <w:shd w:fill="F7F3EA"/>
+            <w:tcMar>
+              <w:top w:w="90" w:type="dxa"/>
+              <w:left w:w="100" w:type="dxa"/>
+              <w:bottom w:w="90" w:type="dxa"/>
+              <w:right w:w="100" w:type="dxa"/>
+            </w:tcMar>
+            <w:vAlign w:val="center"/>
+          </w:tcPr>
+          <w:p>
+            <w:pPr>
+              <w:spacing w:after="0" w:line="276" w:lineRule="auto"/>
+              <w:jc w:val="both"/>
+            </w:pPr>
+            <w:r>
+              <w:rPr>
+                <w:rFonts w:ascii="DFKai-SB" w:hAnsi="DFKai-SB" w:eastAsia="DFKai-SB" w:cs="DFKai-SB"/>
+                <w:b w:val="0"/>
+                <w:i w:val="0"/>
+                <w:color w:val="19352D"/>
+                <w:sz w:val="17"/>
+              </w:rPr>
+              <w:t>以受試者切分、校準、敏感度、特異度及錯誤代價評估</w:t>
+            </w:r>
+          </w:p>
+        </w:tc>
+        <w:tc>
+          <w:tcPr>
+            <w:tcW w:type="dxa" w:w="2324"/>
+            <w:shd w:fill="F7F3EA"/>
+            <w:tcMar>
+              <w:top w:w="90" w:type="dxa"/>
+              <w:left w:w="100" w:type="dxa"/>
+              <w:bottom w:w="90" w:type="dxa"/>
+              <w:right w:w="100" w:type="dxa"/>
+            </w:tcMar>
+            <w:vAlign w:val="center"/>
+          </w:tcPr>
+          <w:p>
+            <w:pPr>
+              <w:spacing w:after="0" w:line="276" w:lineRule="auto"/>
+              <w:jc w:val="both"/>
+            </w:pPr>
+            <w:r>
+              <w:rPr>
+                <w:rFonts w:ascii="DFKai-SB" w:hAnsi="DFKai-SB" w:eastAsia="DFKai-SB" w:cs="DFKai-SB"/>
+                <w:b w:val="0"/>
+                <w:i w:val="0"/>
+                <w:color w:val="19352D"/>
+                <w:sz w:val="17"/>
+              </w:rPr>
+              <w:t>避免把方言、聽力、教育與任務陌生造成的低分病理化</w:t>
+            </w:r>
+          </w:p>
+        </w:tc>
+      </w:tr>
+      <w:tr>
+        <w:tc>
+          <w:tcPr>
+            <w:tcW w:type="dxa" w:w="1417"/>
+            <w:tcMar>
+              <w:top w:w="90" w:type="dxa"/>
+              <w:left w:w="100" w:type="dxa"/>
+              <w:bottom w:w="90" w:type="dxa"/>
+              <w:right w:w="100" w:type="dxa"/>
+            </w:tcMar>
+            <w:vAlign w:val="center"/>
+          </w:tcPr>
+          <w:p>
+            <w:pPr>
+              <w:spacing w:after="0" w:line="276" w:lineRule="auto"/>
+              <w:jc w:val="left"/>
+            </w:pPr>
+            <w:r>
+              <w:rPr>
+                <w:rFonts w:ascii="DFKai-SB" w:hAnsi="DFKai-SB" w:eastAsia="DFKai-SB" w:cs="DFKai-SB"/>
+                <w:b/>
+                <w:i w:val="0"/>
+                <w:color w:val="19352D"/>
+                <w:sz w:val="17"/>
+              </w:rPr>
+              <w:t>第3章／特徵辨識</w:t>
+            </w:r>
+          </w:p>
+        </w:tc>
+        <w:tc>
+          <w:tcPr>
+            <w:tcW w:type="dxa" w:w="2267"/>
+            <w:tcMar>
+              <w:top w:w="90" w:type="dxa"/>
+              <w:left w:w="100" w:type="dxa"/>
+              <w:bottom w:w="90" w:type="dxa"/>
+              <w:right w:w="100" w:type="dxa"/>
+            </w:tcMar>
+            <w:vAlign w:val="center"/>
+          </w:tcPr>
+          <w:p>
+            <w:pPr>
+              <w:spacing w:after="0" w:line="276" w:lineRule="auto"/>
+              <w:jc w:val="both"/>
+            </w:pPr>
+            <w:r>
+              <w:rPr>
+                <w:rFonts w:ascii="DFKai-SB" w:hAnsi="DFKai-SB" w:eastAsia="DFKai-SB" w:cs="DFKai-SB"/>
+                <w:b w:val="0"/>
+                <w:i w:val="0"/>
+                <w:color w:val="19352D"/>
+                <w:sz w:val="17"/>
+              </w:rPr>
+              <w:t>像素與特徵圖、CNN、自動駕駛風險與責任</w:t>
+            </w:r>
+          </w:p>
+        </w:tc>
+        <w:tc>
+          <w:tcPr>
+            <w:tcW w:type="dxa" w:w="2834"/>
+            <w:tcMar>
+              <w:top w:w="90" w:type="dxa"/>
+              <w:left w:w="100" w:type="dxa"/>
+              <w:bottom w:w="90" w:type="dxa"/>
+              <w:right w:w="100" w:type="dxa"/>
+            </w:tcMar>
+            <w:vAlign w:val="center"/>
+          </w:tcPr>
+          <w:p>
+            <w:pPr>
+              <w:spacing w:after="0" w:line="276" w:lineRule="auto"/>
+              <w:jc w:val="both"/>
+            </w:pPr>
+            <w:r>
+              <w:rPr>
+                <w:rFonts w:ascii="DFKai-SB" w:hAnsi="DFKai-SB" w:eastAsia="DFKai-SB" w:cs="DFKai-SB"/>
+                <w:b w:val="0"/>
+                <w:i w:val="0"/>
+                <w:color w:val="19352D"/>
+                <w:sz w:val="17"/>
+              </w:rPr>
+              <w:t>將影像局部特徵學習類比到語音頻譜；檢查設備與背景捷徑</w:t>
+            </w:r>
+          </w:p>
+        </w:tc>
+        <w:tc>
+          <w:tcPr>
+            <w:tcW w:type="dxa" w:w="2324"/>
+            <w:tcMar>
+              <w:top w:w="90" w:type="dxa"/>
+              <w:left w:w="100" w:type="dxa"/>
+              <w:bottom w:w="90" w:type="dxa"/>
+              <w:right w:w="100" w:type="dxa"/>
+            </w:tcMar>
+            <w:vAlign w:val="center"/>
+          </w:tcPr>
+          <w:p>
+            <w:pPr>
+              <w:spacing w:after="0" w:line="276" w:lineRule="auto"/>
+              <w:jc w:val="both"/>
+            </w:pPr>
+            <w:r>
+              <w:rPr>
+                <w:rFonts w:ascii="DFKai-SB" w:hAnsi="DFKai-SB" w:eastAsia="DFKai-SB" w:cs="DFKai-SB"/>
+                <w:b w:val="0"/>
+                <w:i w:val="0"/>
+                <w:color w:val="19352D"/>
+                <w:sz w:val="17"/>
+              </w:rPr>
+              <w:t>跨錄音設備、場域、部落及方言進行外部驗證</w:t>
+            </w:r>
+          </w:p>
+        </w:tc>
+      </w:tr>
+      <w:tr>
+        <w:tc>
+          <w:tcPr>
+            <w:tcW w:type="dxa" w:w="1417"/>
+            <w:shd w:fill="F7F3EA"/>
+            <w:tcMar>
+              <w:top w:w="90" w:type="dxa"/>
+              <w:left w:w="100" w:type="dxa"/>
+              <w:bottom w:w="90" w:type="dxa"/>
+              <w:right w:w="100" w:type="dxa"/>
+            </w:tcMar>
+            <w:vAlign w:val="center"/>
+          </w:tcPr>
+          <w:p>
+            <w:pPr>
+              <w:spacing w:after="0" w:line="276" w:lineRule="auto"/>
+              <w:jc w:val="left"/>
+            </w:pPr>
+            <w:r>
+              <w:rPr>
+                <w:rFonts w:ascii="DFKai-SB" w:hAnsi="DFKai-SB" w:eastAsia="DFKai-SB" w:cs="DFKai-SB"/>
+                <w:b/>
+                <w:i w:val="0"/>
+                <w:color w:val="19352D"/>
+                <w:sz w:val="17"/>
+              </w:rPr>
+              <w:t>第4章／語言模型</w:t>
+            </w:r>
+          </w:p>
+        </w:tc>
+        <w:tc>
+          <w:tcPr>
+            <w:tcW w:type="dxa" w:w="2267"/>
+            <w:shd w:fill="F7F3EA"/>
+            <w:tcMar>
+              <w:top w:w="90" w:type="dxa"/>
+              <w:left w:w="100" w:type="dxa"/>
+              <w:bottom w:w="90" w:type="dxa"/>
+              <w:right w:w="100" w:type="dxa"/>
+            </w:tcMar>
+            <w:vAlign w:val="center"/>
+          </w:tcPr>
+          <w:p>
+            <w:pPr>
+              <w:spacing w:after="0" w:line="276" w:lineRule="auto"/>
+              <w:jc w:val="both"/>
+            </w:pPr>
+            <w:r>
+              <w:rPr>
+                <w:rFonts w:ascii="DFKai-SB" w:hAnsi="DFKai-SB" w:eastAsia="DFKai-SB" w:cs="DFKai-SB"/>
+                <w:b w:val="0"/>
+                <w:i w:val="0"/>
+                <w:color w:val="19352D"/>
+                <w:sz w:val="17"/>
+              </w:rPr>
+              <w:t>NLP、Token、詞向量、Transformer、BERT、GPT</w:t>
+            </w:r>
+          </w:p>
+        </w:tc>
+        <w:tc>
+          <w:tcPr>
+            <w:tcW w:type="dxa" w:w="2834"/>
+            <w:shd w:fill="F7F3EA"/>
+            <w:tcMar>
+              <w:top w:w="90" w:type="dxa"/>
+              <w:left w:w="100" w:type="dxa"/>
+              <w:bottom w:w="90" w:type="dxa"/>
+              <w:right w:w="100" w:type="dxa"/>
+            </w:tcMar>
+            <w:vAlign w:val="center"/>
+          </w:tcPr>
+          <w:p>
+            <w:pPr>
+              <w:spacing w:after="0" w:line="276" w:lineRule="auto"/>
+              <w:jc w:val="both"/>
+            </w:pPr>
+            <w:r>
+              <w:rPr>
+                <w:rFonts w:ascii="DFKai-SB" w:hAnsi="DFKai-SB" w:eastAsia="DFKai-SB" w:cs="DFKai-SB"/>
+                <w:b w:val="0"/>
+                <w:i w:val="0"/>
+                <w:color w:val="19352D"/>
+                <w:sz w:val="17"/>
+              </w:rPr>
+              <w:t>比較字元、子詞與詞素切分；保存語碼轉換及敘事脈絡</w:t>
+            </w:r>
+          </w:p>
+        </w:tc>
+        <w:tc>
+          <w:tcPr>
+            <w:tcW w:type="dxa" w:w="2324"/>
+            <w:shd w:fill="F7F3EA"/>
+            <w:tcMar>
+              <w:top w:w="90" w:type="dxa"/>
+              <w:left w:w="100" w:type="dxa"/>
+              <w:bottom w:w="90" w:type="dxa"/>
+              <w:right w:w="100" w:type="dxa"/>
+            </w:tcMar>
+            <w:vAlign w:val="center"/>
+          </w:tcPr>
+          <w:p>
+            <w:pPr>
+              <w:spacing w:after="0" w:line="276" w:lineRule="auto"/>
+              <w:jc w:val="both"/>
+            </w:pPr>
+            <w:r>
+              <w:rPr>
+                <w:rFonts w:ascii="DFKai-SB" w:hAnsi="DFKai-SB" w:eastAsia="DFKai-SB" w:cs="DFKai-SB"/>
+                <w:b w:val="0"/>
+                <w:i w:val="0"/>
+                <w:color w:val="19352D"/>
+                <w:sz w:val="17"/>
+              </w:rPr>
+              <w:t>檢驗通用切詞器對阿美語構詞與低資源語料的不公平</w:t>
+            </w:r>
+          </w:p>
+        </w:tc>
+      </w:tr>
+      <w:tr>
+        <w:tc>
+          <w:tcPr>
+            <w:tcW w:type="dxa" w:w="1417"/>
+            <w:tcMar>
+              <w:top w:w="90" w:type="dxa"/>
+              <w:left w:w="100" w:type="dxa"/>
+              <w:bottom w:w="90" w:type="dxa"/>
+              <w:right w:w="100" w:type="dxa"/>
+            </w:tcMar>
+            <w:vAlign w:val="center"/>
+          </w:tcPr>
+          <w:p>
+            <w:pPr>
+              <w:spacing w:after="0" w:line="276" w:lineRule="auto"/>
+              <w:jc w:val="left"/>
+            </w:pPr>
+            <w:r>
+              <w:rPr>
+                <w:rFonts w:ascii="DFKai-SB" w:hAnsi="DFKai-SB" w:eastAsia="DFKai-SB" w:cs="DFKai-SB"/>
+                <w:b/>
+                <w:i w:val="0"/>
+                <w:color w:val="19352D"/>
+                <w:sz w:val="17"/>
+              </w:rPr>
+              <w:t>第5章／可信任治理</w:t>
+            </w:r>
+          </w:p>
+        </w:tc>
+        <w:tc>
+          <w:tcPr>
+            <w:tcW w:type="dxa" w:w="2267"/>
+            <w:tcMar>
+              <w:top w:w="90" w:type="dxa"/>
+              <w:left w:w="100" w:type="dxa"/>
+              <w:bottom w:w="90" w:type="dxa"/>
+              <w:right w:w="100" w:type="dxa"/>
+            </w:tcMar>
+            <w:vAlign w:val="center"/>
+          </w:tcPr>
+          <w:p>
+            <w:pPr>
+              <w:spacing w:after="0" w:line="276" w:lineRule="auto"/>
+              <w:jc w:val="both"/>
+            </w:pPr>
+            <w:r>
+              <w:rPr>
+                <w:rFonts w:ascii="DFKai-SB" w:hAnsi="DFKai-SB" w:eastAsia="DFKai-SB" w:cs="DFKai-SB"/>
+                <w:b w:val="0"/>
+                <w:i w:val="0"/>
+                <w:color w:val="19352D"/>
+                <w:sz w:val="17"/>
+              </w:rPr>
+              <w:t>穩健性、可解釋性、公平性、責任與Deepfake</w:t>
+            </w:r>
+          </w:p>
+        </w:tc>
+        <w:tc>
+          <w:tcPr>
+            <w:tcW w:type="dxa" w:w="2834"/>
+            <w:tcMar>
+              <w:top w:w="90" w:type="dxa"/>
+              <w:left w:w="100" w:type="dxa"/>
+              <w:bottom w:w="90" w:type="dxa"/>
+              <w:right w:w="100" w:type="dxa"/>
+            </w:tcMar>
+            <w:vAlign w:val="center"/>
+          </w:tcPr>
+          <w:p>
+            <w:pPr>
+              <w:spacing w:after="0" w:line="276" w:lineRule="auto"/>
+              <w:jc w:val="both"/>
+            </w:pPr>
+            <w:r>
+              <w:rPr>
+                <w:rFonts w:ascii="DFKai-SB" w:hAnsi="DFKai-SB" w:eastAsia="DFKai-SB" w:cs="DFKai-SB"/>
+                <w:b w:val="0"/>
+                <w:i w:val="0"/>
+                <w:color w:val="19352D"/>
+                <w:sz w:val="17"/>
+              </w:rPr>
+              <w:t>整合跨場域驗證、個案解釋、群體錯誤率與生命週期治理</w:t>
+            </w:r>
+          </w:p>
+        </w:tc>
+        <w:tc>
+          <w:tcPr>
+            <w:tcW w:type="dxa" w:w="2324"/>
+            <w:tcMar>
+              <w:top w:w="90" w:type="dxa"/>
+              <w:left w:w="100" w:type="dxa"/>
+              <w:bottom w:w="90" w:type="dxa"/>
+              <w:right w:w="100" w:type="dxa"/>
+            </w:tcMar>
+            <w:vAlign w:val="center"/>
+          </w:tcPr>
+          <w:p>
+            <w:pPr>
+              <w:spacing w:after="0" w:line="276" w:lineRule="auto"/>
+              <w:jc w:val="both"/>
+            </w:pPr>
+            <w:r>
+              <w:rPr>
+                <w:rFonts w:ascii="DFKai-SB" w:hAnsi="DFKai-SB" w:eastAsia="DFKai-SB" w:cs="DFKai-SB"/>
+                <w:b w:val="0"/>
+                <w:i w:val="0"/>
+                <w:color w:val="19352D"/>
+                <w:sz w:val="17"/>
+              </w:rPr>
+              <w:t>採分層同意、社群共同解釋、用途限制與可撤回機制</w:t>
+            </w:r>
+          </w:p>
+        </w:tc>
+      </w:tr>
+    </w:tbl>
+    <w:p>
+      <w:pPr>
+        <w:spacing w:before="80" w:after="200" w:line="300" w:lineRule="auto"/>
+      </w:pPr>
+      <w:r>
+        <w:rPr>
+          <w:rFonts w:ascii="DFKai-SB" w:hAnsi="DFKai-SB" w:eastAsia="DFKai-SB" w:cs="DFKai-SB"/>
+          <w:b w:val="0"/>
+          <w:i/>
+          <w:color w:val="19352D"/>
+          <w:sz w:val="20"/>
+        </w:rPr>
+        <w:t>註。</w:t>
+      </w:r>
+      <w:r>
+        <w:rPr>
+          <w:rFonts w:ascii="DFKai-SB" w:hAnsi="DFKai-SB" w:eastAsia="DFKai-SB" w:cs="DFKai-SB"/>
+          <w:b w:val="0"/>
+          <w:i w:val="0"/>
+          <w:color w:val="19352D"/>
+          <w:sz w:val="20"/>
+        </w:rPr>
+        <w:t xml:space="preserve">陳誼誠的語言活力研究可為第一、二章提供代間與使用領域基準；Hast及Sifo Lakaw的研究則把數位平台、家庭語言實踐、社群參與與去殖民化治理連接到第四、五章。 </w:t>
+      </w:r>
+      <w:hyperlink r:id="rId10">
+        <w:r>
+          <w:rPr>
+            <w:rFonts w:ascii="DFKai-SB" w:hAnsi="DFKai-SB" w:eastAsia="DFKai-SB" w:cs="DFKai-SB"/>
+            <w:color w:val="0563C1"/>
+            <w:u w:val="single"/>
+            <w:sz w:val="22"/>
+          </w:rPr>
+          <w:t>陳誼誠（2017）</w:t>
+        </w:r>
+      </w:hyperlink>
+      <w:r>
+        <w:rPr>
+          <w:rFonts w:ascii="DFKai-SB" w:hAnsi="DFKai-SB" w:eastAsia="DFKai-SB" w:cs="DFKai-SB"/>
+          <w:b w:val="0"/>
+          <w:i w:val="0"/>
+          <w:color w:val="19352D"/>
+          <w:sz w:val="20"/>
+        </w:rPr>
+        <w:t>；</w:t>
+      </w:r>
+      <w:hyperlink r:id="rId13">
+        <w:r>
+          <w:rPr>
+            <w:rFonts w:ascii="DFKai-SB" w:hAnsi="DFKai-SB" w:eastAsia="DFKai-SB" w:cs="DFKai-SB"/>
+            <w:color w:val="0563C1"/>
+            <w:u w:val="single"/>
+            <w:sz w:val="22"/>
+          </w:rPr>
+          <w:t>Hast（2023）</w:t>
+        </w:r>
+      </w:hyperlink>
+      <w:r>
+        <w:rPr>
+          <w:rFonts w:ascii="DFKai-SB" w:hAnsi="DFKai-SB" w:eastAsia="DFKai-SB" w:cs="DFKai-SB"/>
+          <w:b w:val="0"/>
+          <w:i w:val="0"/>
+          <w:color w:val="19352D"/>
+          <w:sz w:val="20"/>
+        </w:rPr>
+        <w:t>；</w:t>
+      </w:r>
+      <w:hyperlink r:id="rId11">
+        <w:r>
+          <w:rPr>
+            <w:rFonts w:ascii="DFKai-SB" w:hAnsi="DFKai-SB" w:eastAsia="DFKai-SB" w:cs="DFKai-SB"/>
+            <w:color w:val="0563C1"/>
+            <w:u w:val="single"/>
+            <w:sz w:val="22"/>
+          </w:rPr>
+          <w:t>Sifo Lakaw（2024）</w:t>
+        </w:r>
+      </w:hyperlink>
+      <w:r>
+        <w:rPr>
+          <w:rFonts w:ascii="DFKai-SB" w:hAnsi="DFKai-SB" w:eastAsia="DFKai-SB" w:cs="DFKai-SB"/>
+          <w:b w:val="0"/>
+          <w:i w:val="0"/>
+          <w:color w:val="19352D"/>
+          <w:sz w:val="20"/>
+        </w:rPr>
+        <w:t>。</w:t>
+      </w:r>
+    </w:p>
+    <w:p>
+      <w:pPr>
+        <w:keepNext/>
+        <w:spacing w:before="200" w:after="0"/>
+      </w:pPr>
+      <w:r>
+        <w:rPr>
+          <w:rFonts w:ascii="DFKai-SB" w:hAnsi="DFKai-SB" w:eastAsia="DFKai-SB" w:cs="DFKai-SB"/>
+          <w:b/>
+          <w:i w:val="0"/>
+          <w:color w:val="19352D"/>
+          <w:sz w:val="22"/>
+        </w:rPr>
+        <w:t>圖 4</w:t>
+      </w:r>
+    </w:p>
+    <w:p>
+      <w:pPr>
+        <w:keepNext/>
+        <w:spacing w:after="100"/>
+      </w:pPr>
+      <w:r>
+        <w:rPr>
+          <w:rFonts w:ascii="DFKai-SB" w:hAnsi="DFKai-SB" w:eastAsia="DFKai-SB" w:cs="DFKai-SB"/>
+          <w:b w:val="0"/>
+          <w:i/>
+          <w:color w:val="19352D"/>
+          <w:sz w:val="22"/>
+        </w:rPr>
+        <w:t>五章人工智慧知識路徑與阿美族研究主軸</w:t>
+      </w:r>
+    </w:p>
+    <w:p>
+      <w:pPr>
+        <w:spacing w:after="0"/>
+        <w:jc w:val="center"/>
+      </w:pPr>
+      <w:r>
+        <w:drawing>
+          <wp:inline xmlns:a="http://schemas.openxmlformats.org/drawingml/2006/main" xmlns:pic="http://schemas.openxmlformats.org/drawingml/2006/picture">
+            <wp:extent cx="5715000" cy="3294062"/>
+            <wp:docPr id="4" name="Picture 4"/>
+            <wp:cNvGraphicFramePr>
+              <a:graphicFrameLocks noChangeAspect="1"/>
+            </wp:cNvGraphicFramePr>
+            <a:graphic>
+              <a:graphicData uri="http://schemas.openxmlformats.org/drawingml/2006/picture">
+                <pic:pic>
+                  <pic:nvPicPr>
+                    <pic:cNvPr id="0" name="figure-4-ai-path.png"/>
+                    <pic:cNvPicPr/>
+                  </pic:nvPicPr>
+                  <pic:blipFill>
+                    <a:blip r:embed="rId19"/>
+                    <a:stretch>
+                      <a:fillRect/>
+                    </a:stretch>
+                  </pic:blipFill>
+                  <pic:spPr>
+                    <a:xfrm>
+                      <a:off x="0" y="0"/>
+                      <a:ext cx="5715000" cy="3294062"/>
+                    </a:xfrm>
+                    <a:prstGeom prst="rect"/>
+                  </pic:spPr>
+                </pic:pic>
+              </a:graphicData>
+            </a:graphic>
+          </wp:inline>
+        </w:drawing>
+      </w:r>
+    </w:p>
+    <w:p>
+      <w:pPr>
+        <w:spacing w:before="80" w:after="200" w:line="300" w:lineRule="auto"/>
+      </w:pPr>
+      <w:r>
+        <w:rPr>
+          <w:rFonts w:ascii="DFKai-SB" w:hAnsi="DFKai-SB" w:eastAsia="DFKai-SB" w:cs="DFKai-SB"/>
+          <w:b w:val="0"/>
+          <w:i/>
+          <w:color w:val="19352D"/>
+          <w:sz w:val="20"/>
+        </w:rPr>
+        <w:t>註。</w:t>
+      </w:r>
+      <w:r>
+        <w:rPr>
+          <w:rFonts w:ascii="DFKai-SB" w:hAnsi="DFKai-SB" w:eastAsia="DFKai-SB" w:cs="DFKai-SB"/>
+          <w:b w:val="0"/>
+          <w:i w:val="0"/>
+          <w:color w:val="19352D"/>
+          <w:sz w:val="20"/>
+        </w:rPr>
+        <w:t xml:space="preserve">本圖把五章串成由技術底座到可信任治理的路徑；阿美族研究主軸不是末端應用，而是同時約束問題定義、資料、模型與治理。語言活力、數位實踐社群及家庭語言去殖民化研究可分別支撐病前基準、平台語料與社群治理。 </w:t>
+      </w:r>
+      <w:hyperlink r:id="rId10">
+        <w:r>
+          <w:rPr>
+            <w:rFonts w:ascii="DFKai-SB" w:hAnsi="DFKai-SB" w:eastAsia="DFKai-SB" w:cs="DFKai-SB"/>
+            <w:color w:val="0563C1"/>
+            <w:u w:val="single"/>
+            <w:sz w:val="22"/>
+          </w:rPr>
+          <w:t>語言活力研究</w:t>
+        </w:r>
+      </w:hyperlink>
+      <w:r>
+        <w:rPr>
+          <w:rFonts w:ascii="DFKai-SB" w:hAnsi="DFKai-SB" w:eastAsia="DFKai-SB" w:cs="DFKai-SB"/>
+          <w:b w:val="0"/>
+          <w:i w:val="0"/>
+          <w:color w:val="19352D"/>
+          <w:sz w:val="20"/>
+        </w:rPr>
+        <w:t>；</w:t>
+      </w:r>
+      <w:hyperlink r:id="rId13">
+        <w:r>
+          <w:rPr>
+            <w:rFonts w:ascii="DFKai-SB" w:hAnsi="DFKai-SB" w:eastAsia="DFKai-SB" w:cs="DFKai-SB"/>
+            <w:color w:val="0563C1"/>
+            <w:u w:val="single"/>
+            <w:sz w:val="22"/>
+          </w:rPr>
+          <w:t>數位民族誌</w:t>
+        </w:r>
+      </w:hyperlink>
+      <w:r>
+        <w:rPr>
+          <w:rFonts w:ascii="DFKai-SB" w:hAnsi="DFKai-SB" w:eastAsia="DFKai-SB" w:cs="DFKai-SB"/>
+          <w:b w:val="0"/>
+          <w:i w:val="0"/>
+          <w:color w:val="19352D"/>
+          <w:sz w:val="20"/>
+        </w:rPr>
+        <w:t>；</w:t>
+      </w:r>
+      <w:hyperlink r:id="rId11">
+        <w:r>
+          <w:rPr>
+            <w:rFonts w:ascii="DFKai-SB" w:hAnsi="DFKai-SB" w:eastAsia="DFKai-SB" w:cs="DFKai-SB"/>
+            <w:color w:val="0563C1"/>
+            <w:u w:val="single"/>
+            <w:sz w:val="22"/>
+          </w:rPr>
+          <w:t>家庭語言去殖民化</w:t>
+        </w:r>
+      </w:hyperlink>
+      <w:r>
+        <w:rPr>
+          <w:rFonts w:ascii="DFKai-SB" w:hAnsi="DFKai-SB" w:eastAsia="DFKai-SB" w:cs="DFKai-SB"/>
+          <w:b w:val="0"/>
+          <w:i w:val="0"/>
+          <w:color w:val="19352D"/>
+          <w:sz w:val="20"/>
+        </w:rPr>
+        <w:t>。</w:t>
+      </w:r>
+    </w:p>
+    <w:p>
+      <w:pPr>
+        <w:keepNext/>
+        <w:spacing w:before="200" w:after="0"/>
+      </w:pPr>
+      <w:r>
+        <w:rPr>
+          <w:rFonts w:ascii="DFKai-SB" w:hAnsi="DFKai-SB" w:eastAsia="DFKai-SB" w:cs="DFKai-SB"/>
+          <w:b/>
+          <w:i w:val="0"/>
+          <w:color w:val="19352D"/>
+          <w:sz w:val="22"/>
+        </w:rPr>
+        <w:t>表 6</w:t>
+      </w:r>
+    </w:p>
+    <w:p>
+      <w:pPr>
+        <w:keepNext/>
+        <w:spacing w:after="100"/>
+      </w:pPr>
+      <w:r>
+        <w:rPr>
+          <w:rFonts w:ascii="DFKai-SB" w:hAnsi="DFKai-SB" w:eastAsia="DFKai-SB" w:cs="DFKai-SB"/>
+          <w:b w:val="0"/>
+          <w:i/>
+          <w:color w:val="19352D"/>
+          <w:sz w:val="22"/>
+        </w:rPr>
+        <w:t>人工智慧整合研究缺口與可驗證設計</w:t>
+      </w:r>
+    </w:p>
+    <w:tbl>
+      <w:tblPr>
+        <w:tblW w:type="dxa" w:w="8844"/>
+        <w:jc w:val="center"/>
+        <w:tblLayout w:type="fixed"/>
+        <w:tblLook w:firstColumn="1" w:firstRow="1" w:lastColumn="0" w:lastRow="0" w:noHBand="0" w:noVBand="1" w:val="04A0"/>
+        <w:tblBorders>
+          <w:top w:val="single" w:sz="6" w:color="C8CFC8"/>
+          <w:left w:val="single" w:sz="6" w:color="C8CFC8"/>
+          <w:bottom w:val="single" w:sz="6" w:color="C8CFC8"/>
+          <w:right w:val="single" w:sz="6" w:color="C8CFC8"/>
+          <w:insideH w:val="single" w:sz="6" w:color="C8CFC8"/>
+          <w:insideV w:val="single" w:sz="6" w:color="C8CFC8"/>
+        </w:tblBorders>
+      </w:tblPr>
+      <w:tblGrid>
+        <w:gridCol w:w="2267"/>
+        <w:gridCol w:w="2154"/>
+        <w:gridCol w:w="2721"/>
+        <w:gridCol w:w="1700"/>
+      </w:tblGrid>
+      <w:tr>
+        <w:trPr>
+          <w:tblHeader/>
+        </w:trPr>
+        <w:tc>
+          <w:tcPr>
+            <w:tcW w:type="dxa" w:w="2267"/>
+            <w:shd w:fill="19352D"/>
+            <w:tcMar>
+              <w:top w:w="90" w:type="dxa"/>
+              <w:left w:w="100" w:type="dxa"/>
+              <w:bottom w:w="90" w:type="dxa"/>
+              <w:right w:w="100" w:type="dxa"/>
+            </w:tcMar>
+            <w:vAlign w:val="center"/>
+          </w:tcPr>
+          <w:p>
+            <w:pPr>
+              <w:spacing w:after="0"/>
+              <w:jc w:val="center"/>
+            </w:pPr>
+            <w:r>
+              <w:rPr>
+                <w:rFonts w:ascii="DFKai-SB" w:hAnsi="DFKai-SB" w:eastAsia="DFKai-SB" w:cs="DFKai-SB"/>
+                <w:b/>
+                <w:i w:val="0"/>
+                <w:color w:val="FFFFFF"/>
+                <w:sz w:val="18"/>
+              </w:rPr>
+              <w:t>研究缺口</w:t>
+            </w:r>
+          </w:p>
+        </w:tc>
+        <w:tc>
+          <w:tcPr>
+            <w:tcW w:type="dxa" w:w="2154"/>
+            <w:shd w:fill="19352D"/>
+            <w:tcMar>
+              <w:top w:w="90" w:type="dxa"/>
+              <w:left w:w="100" w:type="dxa"/>
+              <w:bottom w:w="90" w:type="dxa"/>
+              <w:right w:w="100" w:type="dxa"/>
+            </w:tcMar>
+            <w:vAlign w:val="center"/>
+          </w:tcPr>
+          <w:p>
+            <w:pPr>
+              <w:spacing w:after="0"/>
+              <w:jc w:val="center"/>
+            </w:pPr>
+            <w:r>
+              <w:rPr>
+                <w:rFonts w:ascii="DFKai-SB" w:hAnsi="DFKai-SB" w:eastAsia="DFKai-SB" w:cs="DFKai-SB"/>
+                <w:b/>
+                <w:i w:val="0"/>
+                <w:color w:val="FFFFFF"/>
+                <w:sz w:val="18"/>
+              </w:rPr>
+              <w:t>風險</w:t>
+            </w:r>
+          </w:p>
+        </w:tc>
+        <w:tc>
+          <w:tcPr>
+            <w:tcW w:type="dxa" w:w="2721"/>
+            <w:shd w:fill="19352D"/>
+            <w:tcMar>
+              <w:top w:w="90" w:type="dxa"/>
+              <w:left w:w="100" w:type="dxa"/>
+              <w:bottom w:w="90" w:type="dxa"/>
+              <w:right w:w="100" w:type="dxa"/>
+            </w:tcMar>
+            <w:vAlign w:val="center"/>
+          </w:tcPr>
+          <w:p>
+            <w:pPr>
+              <w:spacing w:after="0"/>
+              <w:jc w:val="center"/>
+            </w:pPr>
+            <w:r>
+              <w:rPr>
+                <w:rFonts w:ascii="DFKai-SB" w:hAnsi="DFKai-SB" w:eastAsia="DFKai-SB" w:cs="DFKai-SB"/>
+                <w:b/>
+                <w:i w:val="0"/>
+                <w:color w:val="FFFFFF"/>
+                <w:sz w:val="18"/>
+              </w:rPr>
+              <w:t>可驗證設計</w:t>
+            </w:r>
+          </w:p>
+        </w:tc>
+        <w:tc>
+          <w:tcPr>
+            <w:tcW w:type="dxa" w:w="1700"/>
+            <w:shd w:fill="19352D"/>
+            <w:tcMar>
+              <w:top w:w="90" w:type="dxa"/>
+              <w:left w:w="100" w:type="dxa"/>
+              <w:bottom w:w="90" w:type="dxa"/>
+              <w:right w:w="100" w:type="dxa"/>
+            </w:tcMar>
+            <w:vAlign w:val="center"/>
+          </w:tcPr>
+          <w:p>
+            <w:pPr>
+              <w:spacing w:after="0"/>
+              <w:jc w:val="center"/>
+            </w:pPr>
+            <w:r>
+              <w:rPr>
+                <w:rFonts w:ascii="DFKai-SB" w:hAnsi="DFKai-SB" w:eastAsia="DFKai-SB" w:cs="DFKai-SB"/>
+                <w:b/>
+                <w:i w:val="0"/>
+                <w:color w:val="FFFFFF"/>
+                <w:sz w:val="18"/>
+              </w:rPr>
+              <w:t>與阿美族研究的關係</w:t>
+            </w:r>
+          </w:p>
+        </w:tc>
+      </w:tr>
+      <w:tr>
+        <w:tc>
+          <w:tcPr>
+            <w:tcW w:type="dxa" w:w="2267"/>
+            <w:tcMar>
+              <w:top w:w="90" w:type="dxa"/>
+              <w:left w:w="100" w:type="dxa"/>
+              <w:bottom w:w="90" w:type="dxa"/>
+              <w:right w:w="100" w:type="dxa"/>
+            </w:tcMar>
+            <w:vAlign w:val="center"/>
+          </w:tcPr>
+          <w:p>
+            <w:pPr>
+              <w:spacing w:after="0" w:line="276" w:lineRule="auto"/>
+              <w:jc w:val="left"/>
+            </w:pPr>
+            <w:r>
+              <w:rPr>
+                <w:rFonts w:ascii="DFKai-SB" w:hAnsi="DFKai-SB" w:eastAsia="DFKai-SB" w:cs="DFKai-SB"/>
+                <w:b/>
+                <w:i w:val="0"/>
+                <w:color w:val="19352D"/>
+                <w:sz w:val="17"/>
+              </w:rPr>
+              <w:t>病前語言生態未進入模型</w:t>
+            </w:r>
+          </w:p>
+        </w:tc>
+        <w:tc>
+          <w:tcPr>
+            <w:tcW w:type="dxa" w:w="2154"/>
+            <w:tcMar>
+              <w:top w:w="90" w:type="dxa"/>
+              <w:left w:w="100" w:type="dxa"/>
+              <w:bottom w:w="90" w:type="dxa"/>
+              <w:right w:w="100" w:type="dxa"/>
+            </w:tcMar>
+            <w:vAlign w:val="center"/>
+          </w:tcPr>
+          <w:p>
+            <w:pPr>
+              <w:spacing w:after="0" w:line="276" w:lineRule="auto"/>
+              <w:jc w:val="both"/>
+            </w:pPr>
+            <w:r>
+              <w:rPr>
+                <w:rFonts w:ascii="DFKai-SB" w:hAnsi="DFKai-SB" w:eastAsia="DFKai-SB" w:cs="DFKai-SB"/>
+                <w:b w:val="0"/>
+                <w:i w:val="0"/>
+                <w:color w:val="19352D"/>
+                <w:sz w:val="17"/>
+              </w:rPr>
+              <w:t>把語言轉移或少用誤認為認知退化</w:t>
+            </w:r>
+          </w:p>
+        </w:tc>
+        <w:tc>
+          <w:tcPr>
+            <w:tcW w:type="dxa" w:w="2721"/>
+            <w:tcMar>
+              <w:top w:w="90" w:type="dxa"/>
+              <w:left w:w="100" w:type="dxa"/>
+              <w:bottom w:w="90" w:type="dxa"/>
+              <w:right w:w="100" w:type="dxa"/>
+            </w:tcMar>
+            <w:vAlign w:val="center"/>
+          </w:tcPr>
+          <w:p>
+            <w:pPr>
+              <w:spacing w:after="0" w:line="276" w:lineRule="auto"/>
+              <w:jc w:val="both"/>
+            </w:pPr>
+            <w:r>
+              <w:rPr>
+                <w:rFonts w:ascii="DFKai-SB" w:hAnsi="DFKai-SB" w:eastAsia="DFKai-SB" w:cs="DFKai-SB"/>
+                <w:b w:val="0"/>
+                <w:i w:val="0"/>
+                <w:color w:val="19352D"/>
+                <w:sz w:val="17"/>
+              </w:rPr>
+              <w:t>比較加入病前語言生態前後的效能、校準與錯誤個案</w:t>
+            </w:r>
+          </w:p>
+        </w:tc>
+        <w:tc>
+          <w:tcPr>
+            <w:tcW w:type="dxa" w:w="1700"/>
+            <w:tcMar>
+              <w:top w:w="90" w:type="dxa"/>
+              <w:left w:w="100" w:type="dxa"/>
+              <w:bottom w:w="90" w:type="dxa"/>
+              <w:right w:w="100" w:type="dxa"/>
+            </w:tcMar>
+            <w:vAlign w:val="center"/>
+          </w:tcPr>
+          <w:p>
+            <w:pPr>
+              <w:spacing w:after="0" w:line="276" w:lineRule="auto"/>
+              <w:jc w:val="both"/>
+            </w:pPr>
+            <w:r>
+              <w:rPr>
+                <w:rFonts w:ascii="DFKai-SB" w:hAnsi="DFKai-SB" w:eastAsia="DFKai-SB" w:cs="DFKai-SB"/>
+                <w:b w:val="0"/>
+                <w:i w:val="0"/>
+                <w:color w:val="19352D"/>
+                <w:sz w:val="17"/>
+              </w:rPr>
+              <w:t>連接語言活力、代間傳承與使用領域研究</w:t>
+            </w:r>
+          </w:p>
+        </w:tc>
+      </w:tr>
+      <w:tr>
+        <w:tc>
+          <w:tcPr>
+            <w:tcW w:type="dxa" w:w="2267"/>
+            <w:shd w:fill="F7F3EA"/>
+            <w:tcMar>
+              <w:top w:w="90" w:type="dxa"/>
+              <w:left w:w="100" w:type="dxa"/>
+              <w:bottom w:w="90" w:type="dxa"/>
+              <w:right w:w="100" w:type="dxa"/>
+            </w:tcMar>
+            <w:vAlign w:val="center"/>
+          </w:tcPr>
+          <w:p>
+            <w:pPr>
+              <w:spacing w:after="0" w:line="276" w:lineRule="auto"/>
+              <w:jc w:val="left"/>
+            </w:pPr>
+            <w:r>
+              <w:rPr>
+                <w:rFonts w:ascii="DFKai-SB" w:hAnsi="DFKai-SB" w:eastAsia="DFKai-SB" w:cs="DFKai-SB"/>
+                <w:b/>
+                <w:i w:val="0"/>
+                <w:color w:val="19352D"/>
+                <w:sz w:val="17"/>
+              </w:rPr>
+              <w:t>阿美語Tokenization缺少比較</w:t>
+            </w:r>
+          </w:p>
+        </w:tc>
+        <w:tc>
+          <w:tcPr>
+            <w:tcW w:type="dxa" w:w="2154"/>
+            <w:shd w:fill="F7F3EA"/>
+            <w:tcMar>
+              <w:top w:w="90" w:type="dxa"/>
+              <w:left w:w="100" w:type="dxa"/>
+              <w:bottom w:w="90" w:type="dxa"/>
+              <w:right w:w="100" w:type="dxa"/>
+            </w:tcMar>
+            <w:vAlign w:val="center"/>
+          </w:tcPr>
+          <w:p>
+            <w:pPr>
+              <w:spacing w:after="0" w:line="276" w:lineRule="auto"/>
+              <w:jc w:val="both"/>
+            </w:pPr>
+            <w:r>
+              <w:rPr>
+                <w:rFonts w:ascii="DFKai-SB" w:hAnsi="DFKai-SB" w:eastAsia="DFKai-SB" w:cs="DFKai-SB"/>
+                <w:b w:val="0"/>
+                <w:i w:val="0"/>
+                <w:color w:val="19352D"/>
+                <w:sz w:val="17"/>
+              </w:rPr>
+              <w:t>詞素被過度切碎，與華語比較不公平</w:t>
+            </w:r>
+          </w:p>
+        </w:tc>
+        <w:tc>
+          <w:tcPr>
+            <w:tcW w:type="dxa" w:w="2721"/>
+            <w:shd w:fill="F7F3EA"/>
+            <w:tcMar>
+              <w:top w:w="90" w:type="dxa"/>
+              <w:left w:w="100" w:type="dxa"/>
+              <w:bottom w:w="90" w:type="dxa"/>
+              <w:right w:w="100" w:type="dxa"/>
+            </w:tcMar>
+            <w:vAlign w:val="center"/>
+          </w:tcPr>
+          <w:p>
+            <w:pPr>
+              <w:spacing w:after="0" w:line="276" w:lineRule="auto"/>
+              <w:jc w:val="both"/>
+            </w:pPr>
+            <w:r>
+              <w:rPr>
+                <w:rFonts w:ascii="DFKai-SB" w:hAnsi="DFKai-SB" w:eastAsia="DFKai-SB" w:cs="DFKai-SB"/>
+                <w:b w:val="0"/>
+                <w:i w:val="0"/>
+                <w:color w:val="19352D"/>
+                <w:sz w:val="17"/>
+              </w:rPr>
+              <w:t>比較字元、子詞、詞素與語言學導向切分</w:t>
+            </w:r>
+          </w:p>
+        </w:tc>
+        <w:tc>
+          <w:tcPr>
+            <w:tcW w:type="dxa" w:w="1700"/>
+            <w:shd w:fill="F7F3EA"/>
+            <w:tcMar>
+              <w:top w:w="90" w:type="dxa"/>
+              <w:left w:w="100" w:type="dxa"/>
+              <w:bottom w:w="90" w:type="dxa"/>
+              <w:right w:w="100" w:type="dxa"/>
+            </w:tcMar>
+            <w:vAlign w:val="center"/>
+          </w:tcPr>
+          <w:p>
+            <w:pPr>
+              <w:spacing w:after="0" w:line="276" w:lineRule="auto"/>
+              <w:jc w:val="both"/>
+            </w:pPr>
+            <w:r>
+              <w:rPr>
+                <w:rFonts w:ascii="DFKai-SB" w:hAnsi="DFKai-SB" w:eastAsia="DFKai-SB" w:cs="DFKai-SB"/>
+                <w:b w:val="0"/>
+                <w:i w:val="0"/>
+                <w:color w:val="19352D"/>
+                <w:sz w:val="17"/>
+              </w:rPr>
+              <w:t>由族語使用者驗證構詞與語碼轉換的功能</w:t>
+            </w:r>
+          </w:p>
+        </w:tc>
+      </w:tr>
+      <w:tr>
+        <w:tc>
+          <w:tcPr>
+            <w:tcW w:type="dxa" w:w="2267"/>
+            <w:tcMar>
+              <w:top w:w="90" w:type="dxa"/>
+              <w:left w:w="100" w:type="dxa"/>
+              <w:bottom w:w="90" w:type="dxa"/>
+              <w:right w:w="100" w:type="dxa"/>
+            </w:tcMar>
+            <w:vAlign w:val="center"/>
+          </w:tcPr>
+          <w:p>
+            <w:pPr>
+              <w:spacing w:after="0" w:line="276" w:lineRule="auto"/>
+              <w:jc w:val="left"/>
+            </w:pPr>
+            <w:r>
+              <w:rPr>
+                <w:rFonts w:ascii="DFKai-SB" w:hAnsi="DFKai-SB" w:eastAsia="DFKai-SB" w:cs="DFKai-SB"/>
+                <w:b/>
+                <w:i w:val="0"/>
+                <w:color w:val="19352D"/>
+                <w:sz w:val="17"/>
+              </w:rPr>
+              <w:t>跨部落／方言外部驗證不足</w:t>
+            </w:r>
+          </w:p>
+        </w:tc>
+        <w:tc>
+          <w:tcPr>
+            <w:tcW w:type="dxa" w:w="2154"/>
+            <w:tcMar>
+              <w:top w:w="90" w:type="dxa"/>
+              <w:left w:w="100" w:type="dxa"/>
+              <w:bottom w:w="90" w:type="dxa"/>
+              <w:right w:w="100" w:type="dxa"/>
+            </w:tcMar>
+            <w:vAlign w:val="center"/>
+          </w:tcPr>
+          <w:p>
+            <w:pPr>
+              <w:spacing w:after="0" w:line="276" w:lineRule="auto"/>
+              <w:jc w:val="both"/>
+            </w:pPr>
+            <w:r>
+              <w:rPr>
+                <w:rFonts w:ascii="DFKai-SB" w:hAnsi="DFKai-SB" w:eastAsia="DFKai-SB" w:cs="DFKai-SB"/>
+                <w:b w:val="0"/>
+                <w:i w:val="0"/>
+                <w:color w:val="19352D"/>
+                <w:sz w:val="17"/>
+              </w:rPr>
+              <w:t>模型記住來源或錄音條件</w:t>
+            </w:r>
+          </w:p>
+        </w:tc>
+        <w:tc>
+          <w:tcPr>
+            <w:tcW w:type="dxa" w:w="2721"/>
+            <w:tcMar>
+              <w:top w:w="90" w:type="dxa"/>
+              <w:left w:w="100" w:type="dxa"/>
+              <w:bottom w:w="90" w:type="dxa"/>
+              <w:right w:w="100" w:type="dxa"/>
+            </w:tcMar>
+            <w:vAlign w:val="center"/>
+          </w:tcPr>
+          <w:p>
+            <w:pPr>
+              <w:spacing w:after="0" w:line="276" w:lineRule="auto"/>
+              <w:jc w:val="both"/>
+            </w:pPr>
+            <w:r>
+              <w:rPr>
+                <w:rFonts w:ascii="DFKai-SB" w:hAnsi="DFKai-SB" w:eastAsia="DFKai-SB" w:cs="DFKai-SB"/>
+                <w:b w:val="0"/>
+                <w:i w:val="0"/>
+                <w:color w:val="19352D"/>
+                <w:sz w:val="17"/>
+              </w:rPr>
+              <w:t>留一部落、留一方言、跨設備與跨任務測試</w:t>
+            </w:r>
+          </w:p>
+        </w:tc>
+        <w:tc>
+          <w:tcPr>
+            <w:tcW w:type="dxa" w:w="1700"/>
+            <w:tcMar>
+              <w:top w:w="90" w:type="dxa"/>
+              <w:left w:w="100" w:type="dxa"/>
+              <w:bottom w:w="90" w:type="dxa"/>
+              <w:right w:w="100" w:type="dxa"/>
+            </w:tcMar>
+            <w:vAlign w:val="center"/>
+          </w:tcPr>
+          <w:p>
+            <w:pPr>
+              <w:spacing w:after="0" w:line="276" w:lineRule="auto"/>
+              <w:jc w:val="both"/>
+            </w:pPr>
+            <w:r>
+              <w:rPr>
+                <w:rFonts w:ascii="DFKai-SB" w:hAnsi="DFKai-SB" w:eastAsia="DFKai-SB" w:cs="DFKai-SB"/>
+                <w:b w:val="0"/>
+                <w:i w:val="0"/>
+                <w:color w:val="19352D"/>
+                <w:sz w:val="17"/>
+              </w:rPr>
+              <w:t>避免單一場域被誤當成全體阿美族</w:t>
+            </w:r>
+          </w:p>
+        </w:tc>
+      </w:tr>
+      <w:tr>
+        <w:tc>
+          <w:tcPr>
+            <w:tcW w:type="dxa" w:w="2267"/>
+            <w:shd w:fill="F7F3EA"/>
+            <w:tcMar>
+              <w:top w:w="90" w:type="dxa"/>
+              <w:left w:w="100" w:type="dxa"/>
+              <w:bottom w:w="90" w:type="dxa"/>
+              <w:right w:w="100" w:type="dxa"/>
+            </w:tcMar>
+            <w:vAlign w:val="center"/>
+          </w:tcPr>
+          <w:p>
+            <w:pPr>
+              <w:spacing w:after="0" w:line="276" w:lineRule="auto"/>
+              <w:jc w:val="left"/>
+            </w:pPr>
+            <w:r>
+              <w:rPr>
+                <w:rFonts w:ascii="DFKai-SB" w:hAnsi="DFKai-SB" w:eastAsia="DFKai-SB" w:cs="DFKai-SB"/>
+                <w:b/>
+                <w:i w:val="0"/>
+                <w:color w:val="19352D"/>
+                <w:sz w:val="17"/>
+              </w:rPr>
+              <w:t>個案解釋缺少社會語言層</w:t>
+            </w:r>
+          </w:p>
+        </w:tc>
+        <w:tc>
+          <w:tcPr>
+            <w:tcW w:type="dxa" w:w="2154"/>
+            <w:shd w:fill="F7F3EA"/>
+            <w:tcMar>
+              <w:top w:w="90" w:type="dxa"/>
+              <w:left w:w="100" w:type="dxa"/>
+              <w:bottom w:w="90" w:type="dxa"/>
+              <w:right w:w="100" w:type="dxa"/>
+            </w:tcMar>
+            <w:vAlign w:val="center"/>
+          </w:tcPr>
+          <w:p>
+            <w:pPr>
+              <w:spacing w:after="0" w:line="276" w:lineRule="auto"/>
+              <w:jc w:val="both"/>
+            </w:pPr>
+            <w:r>
+              <w:rPr>
+                <w:rFonts w:ascii="DFKai-SB" w:hAnsi="DFKai-SB" w:eastAsia="DFKai-SB" w:cs="DFKai-SB"/>
+                <w:b w:val="0"/>
+                <w:i w:val="0"/>
+                <w:color w:val="19352D"/>
+                <w:sz w:val="17"/>
+              </w:rPr>
+              <w:t>方言、教育或識字被當成疾病特徵</w:t>
+            </w:r>
+          </w:p>
+        </w:tc>
+        <w:tc>
+          <w:tcPr>
+            <w:tcW w:type="dxa" w:w="2721"/>
+            <w:shd w:fill="F7F3EA"/>
+            <w:tcMar>
+              <w:top w:w="90" w:type="dxa"/>
+              <w:left w:w="100" w:type="dxa"/>
+              <w:bottom w:w="90" w:type="dxa"/>
+              <w:right w:w="100" w:type="dxa"/>
+            </w:tcMar>
+            <w:vAlign w:val="center"/>
+          </w:tcPr>
+          <w:p>
+            <w:pPr>
+              <w:spacing w:after="0" w:line="276" w:lineRule="auto"/>
+              <w:jc w:val="both"/>
+            </w:pPr>
+            <w:r>
+              <w:rPr>
+                <w:rFonts w:ascii="DFKai-SB" w:hAnsi="DFKai-SB" w:eastAsia="DFKai-SB" w:cs="DFKai-SB"/>
+                <w:b w:val="0"/>
+                <w:i w:val="0"/>
+                <w:color w:val="19352D"/>
+                <w:sz w:val="17"/>
+              </w:rPr>
+              <w:t>以反事實與特徵貢獻檢查替代解釋，交由社群複核</w:t>
+            </w:r>
+          </w:p>
+        </w:tc>
+        <w:tc>
+          <w:tcPr>
+            <w:tcW w:type="dxa" w:w="1700"/>
+            <w:shd w:fill="F7F3EA"/>
+            <w:tcMar>
+              <w:top w:w="90" w:type="dxa"/>
+              <w:left w:w="100" w:type="dxa"/>
+              <w:bottom w:w="90" w:type="dxa"/>
+              <w:right w:w="100" w:type="dxa"/>
+            </w:tcMar>
+            <w:vAlign w:val="center"/>
+          </w:tcPr>
+          <w:p>
+            <w:pPr>
+              <w:spacing w:after="0" w:line="276" w:lineRule="auto"/>
+              <w:jc w:val="both"/>
+            </w:pPr>
+            <w:r>
+              <w:rPr>
+                <w:rFonts w:ascii="DFKai-SB" w:hAnsi="DFKai-SB" w:eastAsia="DFKai-SB" w:cs="DFKai-SB"/>
+                <w:b w:val="0"/>
+                <w:i w:val="0"/>
+                <w:color w:val="19352D"/>
+                <w:sz w:val="17"/>
+              </w:rPr>
+              <w:t>連接家庭語言實踐、文化健康與跨文化溝通</w:t>
+            </w:r>
+          </w:p>
+        </w:tc>
+      </w:tr>
+      <w:tr>
+        <w:tc>
+          <w:tcPr>
+            <w:tcW w:type="dxa" w:w="2267"/>
+            <w:tcMar>
+              <w:top w:w="90" w:type="dxa"/>
+              <w:left w:w="100" w:type="dxa"/>
+              <w:bottom w:w="90" w:type="dxa"/>
+              <w:right w:w="100" w:type="dxa"/>
+            </w:tcMar>
+            <w:vAlign w:val="center"/>
+          </w:tcPr>
+          <w:p>
+            <w:pPr>
+              <w:spacing w:after="0" w:line="276" w:lineRule="auto"/>
+              <w:jc w:val="left"/>
+            </w:pPr>
+            <w:r>
+              <w:rPr>
+                <w:rFonts w:ascii="DFKai-SB" w:hAnsi="DFKai-SB" w:eastAsia="DFKai-SB" w:cs="DFKai-SB"/>
+                <w:b/>
+                <w:i w:val="0"/>
+                <w:color w:val="19352D"/>
+                <w:sz w:val="17"/>
+              </w:rPr>
+              <w:t>AI生命週期治理尚未操作化</w:t>
+            </w:r>
+          </w:p>
+        </w:tc>
+        <w:tc>
+          <w:tcPr>
+            <w:tcW w:type="dxa" w:w="2154"/>
+            <w:tcMar>
+              <w:top w:w="90" w:type="dxa"/>
+              <w:left w:w="100" w:type="dxa"/>
+              <w:bottom w:w="90" w:type="dxa"/>
+              <w:right w:w="100" w:type="dxa"/>
+            </w:tcMar>
+            <w:vAlign w:val="center"/>
+          </w:tcPr>
+          <w:p>
+            <w:pPr>
+              <w:spacing w:after="0" w:line="276" w:lineRule="auto"/>
+              <w:jc w:val="both"/>
+            </w:pPr>
+            <w:r>
+              <w:rPr>
+                <w:rFonts w:ascii="DFKai-SB" w:hAnsi="DFKai-SB" w:eastAsia="DFKai-SB" w:cs="DFKai-SB"/>
+                <w:b w:val="0"/>
+                <w:i w:val="0"/>
+                <w:color w:val="19352D"/>
+                <w:sz w:val="17"/>
+              </w:rPr>
+              <w:t>同意被擴張到模型再利用或公開生成</w:t>
+            </w:r>
+          </w:p>
+        </w:tc>
+        <w:tc>
+          <w:tcPr>
+            <w:tcW w:type="dxa" w:w="2721"/>
+            <w:tcMar>
+              <w:top w:w="90" w:type="dxa"/>
+              <w:left w:w="100" w:type="dxa"/>
+              <w:bottom w:w="90" w:type="dxa"/>
+              <w:right w:w="100" w:type="dxa"/>
+            </w:tcMar>
+            <w:vAlign w:val="center"/>
+          </w:tcPr>
+          <w:p>
+            <w:pPr>
+              <w:spacing w:after="0" w:line="276" w:lineRule="auto"/>
+              <w:jc w:val="both"/>
+            </w:pPr>
+            <w:r>
+              <w:rPr>
+                <w:rFonts w:ascii="DFKai-SB" w:hAnsi="DFKai-SB" w:eastAsia="DFKai-SB" w:cs="DFKai-SB"/>
+                <w:b w:val="0"/>
+                <w:i w:val="0"/>
+                <w:color w:val="19352D"/>
+                <w:sz w:val="17"/>
+              </w:rPr>
+              <w:t>分層同意、用途登錄、撤回演練、事件通報與定期回饋</w:t>
+            </w:r>
+          </w:p>
+        </w:tc>
+        <w:tc>
+          <w:tcPr>
+            <w:tcW w:type="dxa" w:w="1700"/>
+            <w:tcMar>
+              <w:top w:w="90" w:type="dxa"/>
+              <w:left w:w="100" w:type="dxa"/>
+              <w:bottom w:w="90" w:type="dxa"/>
+              <w:right w:w="100" w:type="dxa"/>
+            </w:tcMar>
+            <w:vAlign w:val="center"/>
+          </w:tcPr>
+          <w:p>
+            <w:pPr>
+              <w:spacing w:after="0" w:line="276" w:lineRule="auto"/>
+              <w:jc w:val="both"/>
+            </w:pPr>
+            <w:r>
+              <w:rPr>
+                <w:rFonts w:ascii="DFKai-SB" w:hAnsi="DFKai-SB" w:eastAsia="DFKai-SB" w:cs="DFKai-SB"/>
+                <w:b w:val="0"/>
+                <w:i w:val="0"/>
+                <w:color w:val="19352D"/>
+                <w:sz w:val="17"/>
+              </w:rPr>
+              <w:t>將資料主權落實為可稽核、可撤回的治理程序</w:t>
+            </w:r>
+          </w:p>
+        </w:tc>
+      </w:tr>
+    </w:tbl>
+    <w:p>
+      <w:pPr>
+        <w:spacing w:before="80" w:after="200" w:line="300" w:lineRule="auto"/>
+      </w:pPr>
+      <w:r>
+        <w:rPr>
+          <w:rFonts w:ascii="DFKai-SB" w:hAnsi="DFKai-SB" w:eastAsia="DFKai-SB" w:cs="DFKai-SB"/>
+          <w:b w:val="0"/>
+          <w:i/>
+          <w:color w:val="19352D"/>
+          <w:sz w:val="20"/>
+        </w:rPr>
+        <w:t>註。</w:t>
+      </w:r>
+      <w:r>
+        <w:rPr>
+          <w:rFonts w:ascii="DFKai-SB" w:hAnsi="DFKai-SB" w:eastAsia="DFKai-SB" w:cs="DFKai-SB"/>
+          <w:b w:val="0"/>
+          <w:i w:val="0"/>
+          <w:color w:val="19352D"/>
+          <w:sz w:val="20"/>
+        </w:rPr>
+        <w:t xml:space="preserve">Sifo Lakaw及Hast均顯示族語資料的家庭、社群與數位平台脈絡不能被技術流程取代；蕭惠美與全俊儒則支撐文化轉譯、醫療資源、信任及跨文化溝通必須進入模型驗證。 </w:t>
+      </w:r>
+      <w:hyperlink r:id="rId11">
+        <w:r>
+          <w:rPr>
+            <w:rFonts w:ascii="DFKai-SB" w:hAnsi="DFKai-SB" w:eastAsia="DFKai-SB" w:cs="DFKai-SB"/>
+            <w:color w:val="0563C1"/>
+            <w:u w:val="single"/>
+            <w:sz w:val="22"/>
+          </w:rPr>
+          <w:t>Sifo Lakaw（2024）</w:t>
+        </w:r>
+      </w:hyperlink>
+      <w:r>
+        <w:rPr>
+          <w:rFonts w:ascii="DFKai-SB" w:hAnsi="DFKai-SB" w:eastAsia="DFKai-SB" w:cs="DFKai-SB"/>
+          <w:b w:val="0"/>
+          <w:i w:val="0"/>
+          <w:color w:val="19352D"/>
+          <w:sz w:val="20"/>
+        </w:rPr>
+        <w:t>；</w:t>
+      </w:r>
+      <w:hyperlink r:id="rId13">
+        <w:r>
+          <w:rPr>
+            <w:rFonts w:ascii="DFKai-SB" w:hAnsi="DFKai-SB" w:eastAsia="DFKai-SB" w:cs="DFKai-SB"/>
+            <w:color w:val="0563C1"/>
+            <w:u w:val="single"/>
+            <w:sz w:val="22"/>
+          </w:rPr>
+          <w:t>Hast（2023）</w:t>
+        </w:r>
+      </w:hyperlink>
+      <w:r>
+        <w:rPr>
+          <w:rFonts w:ascii="DFKai-SB" w:hAnsi="DFKai-SB" w:eastAsia="DFKai-SB" w:cs="DFKai-SB"/>
+          <w:b w:val="0"/>
+          <w:i w:val="0"/>
+          <w:color w:val="19352D"/>
+          <w:sz w:val="20"/>
+        </w:rPr>
+        <w:t>；</w:t>
+      </w:r>
+      <w:hyperlink r:id="rId14">
+        <w:r>
+          <w:rPr>
+            <w:rFonts w:ascii="DFKai-SB" w:hAnsi="DFKai-SB" w:eastAsia="DFKai-SB" w:cs="DFKai-SB"/>
+            <w:color w:val="0563C1"/>
+            <w:u w:val="single"/>
+            <w:sz w:val="22"/>
+          </w:rPr>
+          <w:t>蕭惠美（2025）</w:t>
+        </w:r>
+      </w:hyperlink>
+      <w:r>
+        <w:rPr>
+          <w:rFonts w:ascii="DFKai-SB" w:hAnsi="DFKai-SB" w:eastAsia="DFKai-SB" w:cs="DFKai-SB"/>
+          <w:b w:val="0"/>
+          <w:i w:val="0"/>
+          <w:color w:val="19352D"/>
+          <w:sz w:val="20"/>
+        </w:rPr>
+        <w:t>；</w:t>
+      </w:r>
+      <w:hyperlink r:id="rId15">
+        <w:r>
+          <w:rPr>
+            <w:rFonts w:ascii="DFKai-SB" w:hAnsi="DFKai-SB" w:eastAsia="DFKai-SB" w:cs="DFKai-SB"/>
+            <w:color w:val="0563C1"/>
+            <w:u w:val="single"/>
+            <w:sz w:val="22"/>
+          </w:rPr>
+          <w:t>全俊儒（2025）</w:t>
+        </w:r>
+      </w:hyperlink>
+      <w:r>
+        <w:rPr>
+          <w:rFonts w:ascii="DFKai-SB" w:hAnsi="DFKai-SB" w:eastAsia="DFKai-SB" w:cs="DFKai-SB"/>
+          <w:b w:val="0"/>
+          <w:i w:val="0"/>
+          <w:color w:val="19352D"/>
+          <w:sz w:val="20"/>
+        </w:rPr>
+        <w:t>。</w:t>
+      </w:r>
+    </w:p>
+    <w:p>
       <w:pPr>
         <w:keepNext/>
         <w:spacing w:before="320" w:after="160"/>
@@ -5304,6 +7188,22 @@
           <w:sz w:val="20"/>
         </w:rPr>
         <w:t>圖 3：七階段流程依序為共同定義問題、多語生命史與同意、聽力／健康背景、自然互動語料、雙語／方言任務、社群共同詮釋、分級保存／撤回／回饋。</w:t>
+      </w:r>
+    </w:p>
+    <w:p>
+      <w:pPr>
+        <w:spacing w:after="160" w:line="360" w:lineRule="auto"/>
+        <w:jc w:val="both"/>
+      </w:pPr>
+      <w:r>
+        <w:rPr>
+          <w:rFonts w:ascii="DFKai-SB" w:hAnsi="DFKai-SB" w:eastAsia="DFKai-SB" w:cs="DFKai-SB"/>
+          <w:b w:val="0"/>
+          <w:i w:val="0"/>
+          <w:color w:val="19352D"/>
+          <w:sz w:val="20"/>
+        </w:rPr>
+        <w:t>圖 4：五個水平階段由左至右排列，依序為技術底座、臨床決策、特徵辨識、語言模型與可信任治理；五者共同指向下方的阿美族研究主軸，包括病前語言生態、語言／認知特徵、外部驗證與社群治理。</w:t>
       </w:r>
     </w:p>
     <w:sectPr>

</xml_diff>

<commit_message>
Expand APA 7 Word reference section
</commit_message>
<xml_diff>
--- a/public/clinical-sociolinguistics-apa7-research-pack.docx
+++ b/public/clinical-sociolinguistics-apa7-research-pack.docx
@@ -6950,8 +6950,42 @@
     </w:p>
     <w:p>
       <w:pPr>
+        <w:spacing w:after="240" w:line="360" w:lineRule="auto"/>
+        <w:jc w:val="both"/>
+      </w:pPr>
+      <w:r>
+        <w:rPr>
+          <w:rFonts w:ascii="DFKai-SB" w:hAnsi="DFKai-SB" w:eastAsia="DFKai-SB" w:cs="DFKai-SB"/>
+          <w:b w:val="0"/>
+          <w:i w:val="0"/>
+          <w:color w:val="19352D"/>
+          <w:sz w:val="20"/>
+        </w:rPr>
+        <w:t>本節依 APA 第 7 版及一般學術期刊投稿格式編排：不加序號、雙行距、0.5 吋懸掛縮排，DOI 與永久網址使用可點擊連結。</w:t>
+      </w:r>
+    </w:p>
+    <w:p>
+      <w:pPr>
+        <w:keepNext/>
+        <w:spacing w:before="200" w:after="160"/>
+      </w:pPr>
+      <w:r>
+        <w:rPr>
+          <w:rFonts w:ascii="DFKai-SB" w:hAnsi="DFKai-SB" w:eastAsia="DFKai-SB" w:cs="DFKai-SB"/>
+          <w:b/>
+          <w:i w:val="0"/>
+          <w:color w:val="D7653E"/>
+          <w:sz w:val="26"/>
+        </w:rPr>
+        <w:t>中文及臺灣學位論文</w:t>
+      </w:r>
+    </w:p>
+    <w:p>
+      <w:pPr>
+        <w:widowControl/>
         <w:spacing w:line="480" w:lineRule="auto" w:after="0"/>
         <w:ind w:left="720" w:hanging="720"/>
+        <w:jc w:val="left"/>
       </w:pPr>
       <w:r>
         <w:rPr>
@@ -6961,13 +6995,45 @@
           <w:color w:val="19352D"/>
           <w:sz w:val="22"/>
         </w:rPr>
-        <w:t>Ball, M. J. (Ed.). (2005). Clinical sociolinguistics. Blackwell Publishing.</w:t>
       </w:r>
+      <w:r>
+        <w:rPr>
+          <w:rFonts w:ascii="DFKai-SB" w:hAnsi="DFKai-SB" w:eastAsia="DFKai-SB" w:cs="DFKai-SB"/>
+          <w:b w:val="0"/>
+          <w:i/>
+          <w:color w:val="19352D"/>
+          <w:sz w:val="22"/>
+        </w:rPr>
+        <w:t>'Mafana' Kaku!'：台灣原住民族語共學園中的兒童能動性及語言選擇</w:t>
+      </w:r>
+      <w:r>
+        <w:rPr>
+          <w:rFonts w:ascii="DFKai-SB" w:hAnsi="DFKai-SB" w:eastAsia="DFKai-SB" w:cs="DFKai-SB"/>
+          <w:b w:val="0"/>
+          <w:i w:val="0"/>
+          <w:color w:val="19352D"/>
+          <w:sz w:val="22"/>
+        </w:rPr>
+        <w:t>（無日期）。［學位論文］。臺灣博碩士論文知識加值系統。</w:t>
+      </w:r>
+      <w:hyperlink r:id="rId20">
+        <w:r>
+          <w:rPr>
+            <w:rFonts w:ascii="DFKai-SB" w:hAnsi="DFKai-SB" w:eastAsia="DFKai-SB" w:cs="DFKai-SB"/>
+            <w:color w:val="0563C1"/>
+            <w:u w:val="single"/>
+            <w:sz w:val="22"/>
+          </w:rPr>
+          <w:t>https://hdl.handle.net/11296/ebnt3u</w:t>
+        </w:r>
+      </w:hyperlink>
     </w:p>
     <w:p>
       <w:pPr>
+        <w:widowControl/>
         <w:spacing w:line="480" w:lineRule="auto" w:after="0"/>
         <w:ind w:left="720" w:hanging="720"/>
+        <w:jc w:val="left"/>
       </w:pPr>
       <w:r>
         <w:rPr>
@@ -6977,9 +7043,28 @@
           <w:color w:val="19352D"/>
           <w:sz w:val="22"/>
         </w:rPr>
-        <w:t xml:space="preserve">Hast, A. C. (2023). Mipaselak to sowal no Pangcah: A digital ethnography of two open 'Amis/Pangcah language platforms, 'Amis MoeDict and 'Amis Wikipitiya [Master's thesis, National Dong Hwa University]. </w:t>
       </w:r>
-      <w:hyperlink r:id="rId13">
+      <w:r>
+        <w:rPr>
+          <w:rFonts w:ascii="DFKai-SB" w:hAnsi="DFKai-SB" w:eastAsia="DFKai-SB" w:cs="DFKai-SB"/>
+          <w:b w:val="0"/>
+          <w:i/>
+          <w:color w:val="19352D"/>
+          <w:sz w:val="22"/>
+        </w:rPr>
+        <w:t>'O pirayray no kiwkay to sowal no Pangcah': Entanglements of Pangcah Language Revitalization With(in) the Presbyterian Church of Taiwan</w:t>
+      </w:r>
+      <w:r>
+        <w:rPr>
+          <w:rFonts w:ascii="DFKai-SB" w:hAnsi="DFKai-SB" w:eastAsia="DFKai-SB" w:cs="DFKai-SB"/>
+          <w:b w:val="0"/>
+          <w:i w:val="0"/>
+          <w:color w:val="19352D"/>
+          <w:sz w:val="22"/>
+        </w:rPr>
+        <w:t>（無日期）。［學位論文］。臺灣博碩士論文知識加值系統。</w:t>
+      </w:r>
+      <w:hyperlink r:id="rId21">
         <w:r>
           <w:rPr>
             <w:rFonts w:ascii="DFKai-SB" w:hAnsi="DFKai-SB" w:eastAsia="DFKai-SB" w:cs="DFKai-SB"/>
@@ -6987,14 +7072,16 @@
             <w:u w:val="single"/>
             <w:sz w:val="22"/>
           </w:rPr>
-          <w:t>https://ndltd.ncl.edu.tw/cgi-bin/gs32/gsweb.cgi/login?o=dnclcdr&amp;s=id%3D%22112NDHU5577003%22.&amp;searchmode=basic</w:t>
+          <w:t>https://hdl.handle.net/11296/7stda5</w:t>
         </w:r>
       </w:hyperlink>
     </w:p>
     <w:p>
       <w:pPr>
+        <w:widowControl/>
         <w:spacing w:line="480" w:lineRule="auto" w:after="0"/>
         <w:ind w:left="720" w:hanging="720"/>
+        <w:jc w:val="left"/>
       </w:pPr>
       <w:r>
         <w:rPr>
@@ -7004,9 +7091,19 @@
           <w:color w:val="19352D"/>
           <w:sz w:val="22"/>
         </w:rPr>
-        <w:t xml:space="preserve">Sifo Lakaw. (2024). O Pangcah kami, misanoPangcah kami i loma': Misawaday a misanoholam a parod no Pangcah i Taywan [Doctoral dissertation, National Dong Hwa University]. </w:t>
+        <w:t xml:space="preserve">Hast, A. C. (2023). </w:t>
       </w:r>
-      <w:hyperlink r:id="rId11">
+      <w:r>
+        <w:rPr>
+          <w:rFonts w:ascii="DFKai-SB" w:hAnsi="DFKai-SB" w:eastAsia="DFKai-SB" w:cs="DFKai-SB"/>
+          <w:b w:val="0"/>
+          <w:i/>
+          <w:color w:val="19352D"/>
+          <w:sz w:val="22"/>
+        </w:rPr>
+        <w:t xml:space="preserve">Mipaselak to sowal no Pangcah: A digital ethnography of two open 'Amis/Pangcah language platforms, 'Amis MoeDict and 'Amis Wikipitiya [Master's thesis, National Dong Hwa University]. </w:t>
+      </w:r>
+      <w:hyperlink r:id="rId22">
         <w:r>
           <w:rPr>
             <w:rFonts w:ascii="DFKai-SB" w:hAnsi="DFKai-SB" w:eastAsia="DFKai-SB" w:cs="DFKai-SB"/>
@@ -7014,14 +7111,16 @@
             <w:u w:val="single"/>
             <w:sz w:val="22"/>
           </w:rPr>
-          <w:t>https://ndltd.ncl.edu.tw/cgi-bin/gs32/gsweb.cgi/login?o=dnclcdr&amp;s=id%3D%22112NDHU5577013%22.&amp;searchmode=basic</w:t>
+          <w:t>https://hdl.handle.net/11296/32zv6m</w:t>
         </w:r>
       </w:hyperlink>
     </w:p>
     <w:p>
       <w:pPr>
+        <w:widowControl/>
         <w:spacing w:line="480" w:lineRule="auto" w:after="0"/>
         <w:ind w:left="720" w:hanging="720"/>
+        <w:jc w:val="left"/>
       </w:pPr>
       <w:r>
         <w:rPr>
@@ -7031,7 +7130,104 @@
           <w:color w:val="19352D"/>
           <w:sz w:val="22"/>
         </w:rPr>
-        <w:t>全俊儒（2025）。《跨文化溝通對原住民醫病關係的影響—以南投某教學醫院為例》［碩士論文，南開科技大學］。</w:t>
+        <w:t xml:space="preserve">Sifo Lakaw. (2024). </w:t>
+      </w:r>
+      <w:r>
+        <w:rPr>
+          <w:rFonts w:ascii="DFKai-SB" w:hAnsi="DFKai-SB" w:eastAsia="DFKai-SB" w:cs="DFKai-SB"/>
+          <w:b w:val="0"/>
+          <w:i/>
+          <w:color w:val="19352D"/>
+          <w:sz w:val="22"/>
+        </w:rPr>
+        <w:t xml:space="preserve">O Pangcah kami, misanoPangcah kami i loma': Misawaday a misanoholam a parod no Pangcah i Taywan [Doctoral dissertation, National Dong Hwa University]. </w:t>
+      </w:r>
+      <w:hyperlink r:id="rId23">
+        <w:r>
+          <w:rPr>
+            <w:rFonts w:ascii="DFKai-SB" w:hAnsi="DFKai-SB" w:eastAsia="DFKai-SB" w:cs="DFKai-SB"/>
+            <w:color w:val="0563C1"/>
+            <w:u w:val="single"/>
+            <w:sz w:val="22"/>
+          </w:rPr>
+          <w:t>https://hdl.handle.net/11296/7y8gqp</w:t>
+        </w:r>
+      </w:hyperlink>
+    </w:p>
+    <w:p>
+      <w:pPr>
+        <w:widowControl/>
+        <w:spacing w:line="480" w:lineRule="auto" w:after="0"/>
+        <w:ind w:left="720" w:hanging="720"/>
+        <w:jc w:val="left"/>
+      </w:pPr>
+      <w:r>
+        <w:rPr>
+          <w:rFonts w:ascii="DFKai-SB" w:hAnsi="DFKai-SB" w:eastAsia="DFKai-SB" w:cs="DFKai-SB"/>
+          <w:b w:val="0"/>
+          <w:i w:val="0"/>
+          <w:color w:val="19352D"/>
+          <w:sz w:val="22"/>
+        </w:rPr>
+      </w:r>
+      <w:r>
+        <w:rPr>
+          <w:rFonts w:ascii="DFKai-SB" w:hAnsi="DFKai-SB" w:eastAsia="DFKai-SB" w:cs="DFKai-SB"/>
+          <w:b w:val="0"/>
+          <w:i/>
+          <w:color w:val="19352D"/>
+          <w:sz w:val="22"/>
+        </w:rPr>
+        <w:t>以生成式人工智慧建立稀少性語言之影片生成系統</w:t>
+      </w:r>
+      <w:r>
+        <w:rPr>
+          <w:rFonts w:ascii="DFKai-SB" w:hAnsi="DFKai-SB" w:eastAsia="DFKai-SB" w:cs="DFKai-SB"/>
+          <w:b w:val="0"/>
+          <w:i w:val="0"/>
+          <w:color w:val="19352D"/>
+          <w:sz w:val="22"/>
+        </w:rPr>
+        <w:t>（無日期）。［學位論文］。臺灣博碩士論文知識加值系統。</w:t>
+      </w:r>
+      <w:hyperlink r:id="rId24">
+        <w:r>
+          <w:rPr>
+            <w:rFonts w:ascii="DFKai-SB" w:hAnsi="DFKai-SB" w:eastAsia="DFKai-SB" w:cs="DFKai-SB"/>
+            <w:color w:val="0563C1"/>
+            <w:u w:val="single"/>
+            <w:sz w:val="22"/>
+          </w:rPr>
+          <w:t>https://hdl.handle.net/11296/d42g2a</w:t>
+        </w:r>
+      </w:hyperlink>
+    </w:p>
+    <w:p>
+      <w:pPr>
+        <w:widowControl/>
+        <w:spacing w:line="480" w:lineRule="auto" w:after="0"/>
+        <w:ind w:left="720" w:hanging="720"/>
+        <w:jc w:val="left"/>
+      </w:pPr>
+      <w:r>
+        <w:rPr>
+          <w:rFonts w:ascii="DFKai-SB" w:hAnsi="DFKai-SB" w:eastAsia="DFKai-SB" w:cs="DFKai-SB"/>
+          <w:b w:val="0"/>
+          <w:i w:val="0"/>
+          <w:color w:val="19352D"/>
+          <w:sz w:val="22"/>
+        </w:rPr>
+        <w:t>全俊儒（2025）。</w:t>
+      </w:r>
+      <w:r>
+        <w:rPr>
+          <w:rFonts w:ascii="DFKai-SB" w:hAnsi="DFKai-SB" w:eastAsia="DFKai-SB" w:cs="DFKai-SB"/>
+          <w:b w:val="0"/>
+          <w:i/>
+          <w:color w:val="19352D"/>
+          <w:sz w:val="22"/>
+        </w:rPr>
+        <w:t>跨文化溝通對原住民醫病關係的影響：以南投某教學醫院為例［碩士論文，南開科技大學］。</w:t>
       </w:r>
       <w:hyperlink r:id="rId15">
         <w:r>
@@ -7047,8 +7243,10 @@
     </w:p>
     <w:p>
       <w:pPr>
+        <w:widowControl/>
         <w:spacing w:line="480" w:lineRule="auto" w:after="0"/>
         <w:ind w:left="720" w:hanging="720"/>
+        <w:jc w:val="left"/>
       </w:pPr>
       <w:r>
         <w:rPr>
@@ -7058,7 +7256,689 @@
           <w:color w:val="19352D"/>
           <w:sz w:val="22"/>
         </w:rPr>
-        <w:t>張文翊（2024）。《文化敏感音樂治療應用於部落長者預防及延緩失能之成效探討》［碩士論文，輔仁大學］。</w:t>
+      </w:r>
+      <w:r>
+        <w:rPr>
+          <w:rFonts w:ascii="DFKai-SB" w:hAnsi="DFKai-SB" w:eastAsia="DFKai-SB" w:cs="DFKai-SB"/>
+          <w:b w:val="0"/>
+          <w:i/>
+          <w:color w:val="19352D"/>
+          <w:sz w:val="22"/>
+        </w:rPr>
+        <w:t>北部阿美語勺會厭肌塞音、喉塞音及滑音之音韻地位研究</w:t>
+      </w:r>
+      <w:r>
+        <w:rPr>
+          <w:rFonts w:ascii="DFKai-SB" w:hAnsi="DFKai-SB" w:eastAsia="DFKai-SB" w:cs="DFKai-SB"/>
+          <w:b w:val="0"/>
+          <w:i w:val="0"/>
+          <w:color w:val="19352D"/>
+          <w:sz w:val="22"/>
+        </w:rPr>
+        <w:t>（無日期）。［學位論文］。臺灣博碩士論文知識加值系統。</w:t>
+      </w:r>
+      <w:hyperlink r:id="rId25">
+        <w:r>
+          <w:rPr>
+            <w:rFonts w:ascii="DFKai-SB" w:hAnsi="DFKai-SB" w:eastAsia="DFKai-SB" w:cs="DFKai-SB"/>
+            <w:color w:val="0563C1"/>
+            <w:u w:val="single"/>
+            <w:sz w:val="22"/>
+          </w:rPr>
+          <w:t>https://hdl.handle.net/11296/est84r</w:t>
+        </w:r>
+      </w:hyperlink>
+    </w:p>
+    <w:p>
+      <w:pPr>
+        <w:widowControl/>
+        <w:spacing w:line="480" w:lineRule="auto" w:after="0"/>
+        <w:ind w:left="720" w:hanging="720"/>
+        <w:jc w:val="left"/>
+      </w:pPr>
+      <w:r>
+        <w:rPr>
+          <w:rFonts w:ascii="DFKai-SB" w:hAnsi="DFKai-SB" w:eastAsia="DFKai-SB" w:cs="DFKai-SB"/>
+          <w:b w:val="0"/>
+          <w:i w:val="0"/>
+          <w:color w:val="19352D"/>
+          <w:sz w:val="22"/>
+        </w:rPr>
+      </w:r>
+      <w:r>
+        <w:rPr>
+          <w:rFonts w:ascii="DFKai-SB" w:hAnsi="DFKai-SB" w:eastAsia="DFKai-SB" w:cs="DFKai-SB"/>
+          <w:b w:val="0"/>
+          <w:i/>
+          <w:color w:val="19352D"/>
+          <w:sz w:val="22"/>
+        </w:rPr>
+        <w:t>卑南語學習的批評分析：法語與卑南語之語言教材比較</w:t>
+      </w:r>
+      <w:r>
+        <w:rPr>
+          <w:rFonts w:ascii="DFKai-SB" w:hAnsi="DFKai-SB" w:eastAsia="DFKai-SB" w:cs="DFKai-SB"/>
+          <w:b w:val="0"/>
+          <w:i w:val="0"/>
+          <w:color w:val="19352D"/>
+          <w:sz w:val="22"/>
+        </w:rPr>
+        <w:t>（無日期）。［學位論文］。臺灣博碩士論文知識加值系統。</w:t>
+      </w:r>
+      <w:hyperlink r:id="rId26">
+        <w:r>
+          <w:rPr>
+            <w:rFonts w:ascii="DFKai-SB" w:hAnsi="DFKai-SB" w:eastAsia="DFKai-SB" w:cs="DFKai-SB"/>
+            <w:color w:val="0563C1"/>
+            <w:u w:val="single"/>
+            <w:sz w:val="22"/>
+          </w:rPr>
+          <w:t>https://hdl.handle.net/11296/87vbv2</w:t>
+        </w:r>
+      </w:hyperlink>
+    </w:p>
+    <w:p>
+      <w:pPr>
+        <w:widowControl/>
+        <w:spacing w:line="480" w:lineRule="auto" w:after="0"/>
+        <w:ind w:left="720" w:hanging="720"/>
+        <w:jc w:val="left"/>
+      </w:pPr>
+      <w:r>
+        <w:rPr>
+          <w:rFonts w:ascii="DFKai-SB" w:hAnsi="DFKai-SB" w:eastAsia="DFKai-SB" w:cs="DFKai-SB"/>
+          <w:b w:val="0"/>
+          <w:i w:val="0"/>
+          <w:color w:val="19352D"/>
+          <w:sz w:val="22"/>
+        </w:rPr>
+      </w:r>
+      <w:r>
+        <w:rPr>
+          <w:rFonts w:ascii="DFKai-SB" w:hAnsi="DFKai-SB" w:eastAsia="DFKai-SB" w:cs="DFKai-SB"/>
+          <w:b w:val="0"/>
+          <w:i/>
+          <w:color w:val="19352D"/>
+          <w:sz w:val="22"/>
+        </w:rPr>
+        <w:t>原住民族群主流化之研究：族語復振的政策與現況評估</w:t>
+      </w:r>
+      <w:r>
+        <w:rPr>
+          <w:rFonts w:ascii="DFKai-SB" w:hAnsi="DFKai-SB" w:eastAsia="DFKai-SB" w:cs="DFKai-SB"/>
+          <w:b w:val="0"/>
+          <w:i w:val="0"/>
+          <w:color w:val="19352D"/>
+          <w:sz w:val="22"/>
+        </w:rPr>
+        <w:t>（無日期）。［學位論文］。臺灣博碩士論文知識加值系統。</w:t>
+      </w:r>
+      <w:hyperlink r:id="rId27">
+        <w:r>
+          <w:rPr>
+            <w:rFonts w:ascii="DFKai-SB" w:hAnsi="DFKai-SB" w:eastAsia="DFKai-SB" w:cs="DFKai-SB"/>
+            <w:color w:val="0563C1"/>
+            <w:u w:val="single"/>
+            <w:sz w:val="22"/>
+          </w:rPr>
+          <w:t>https://hdl.handle.net/11296/3532x2</w:t>
+        </w:r>
+      </w:hyperlink>
+    </w:p>
+    <w:p>
+      <w:pPr>
+        <w:widowControl/>
+        <w:spacing w:line="480" w:lineRule="auto" w:after="0"/>
+        <w:ind w:left="720" w:hanging="720"/>
+        <w:jc w:val="left"/>
+      </w:pPr>
+      <w:r>
+        <w:rPr>
+          <w:rFonts w:ascii="DFKai-SB" w:hAnsi="DFKai-SB" w:eastAsia="DFKai-SB" w:cs="DFKai-SB"/>
+          <w:b w:val="0"/>
+          <w:i w:val="0"/>
+          <w:color w:val="19352D"/>
+          <w:sz w:val="22"/>
+        </w:rPr>
+      </w:r>
+      <w:r>
+        <w:rPr>
+          <w:rFonts w:ascii="DFKai-SB" w:hAnsi="DFKai-SB" w:eastAsia="DFKai-SB" w:cs="DFKai-SB"/>
+          <w:b w:val="0"/>
+          <w:i/>
+          <w:color w:val="19352D"/>
+          <w:sz w:val="22"/>
+        </w:rPr>
+        <w:t>原住民族語復振之研究</w:t>
+      </w:r>
+      <w:r>
+        <w:rPr>
+          <w:rFonts w:ascii="DFKai-SB" w:hAnsi="DFKai-SB" w:eastAsia="DFKai-SB" w:cs="DFKai-SB"/>
+          <w:b w:val="0"/>
+          <w:i w:val="0"/>
+          <w:color w:val="19352D"/>
+          <w:sz w:val="22"/>
+        </w:rPr>
+        <w:t>（無日期）。［學位論文］。臺灣博碩士論文知識加值系統。</w:t>
+      </w:r>
+      <w:hyperlink r:id="rId28">
+        <w:r>
+          <w:rPr>
+            <w:rFonts w:ascii="DFKai-SB" w:hAnsi="DFKai-SB" w:eastAsia="DFKai-SB" w:cs="DFKai-SB"/>
+            <w:color w:val="0563C1"/>
+            <w:u w:val="single"/>
+            <w:sz w:val="22"/>
+          </w:rPr>
+          <w:t>https://hdl.handle.net/11296/988976</w:t>
+        </w:r>
+      </w:hyperlink>
+    </w:p>
+    <w:p>
+      <w:pPr>
+        <w:widowControl/>
+        <w:spacing w:line="480" w:lineRule="auto" w:after="0"/>
+        <w:ind w:left="720" w:hanging="720"/>
+        <w:jc w:val="left"/>
+      </w:pPr>
+      <w:r>
+        <w:rPr>
+          <w:rFonts w:ascii="DFKai-SB" w:hAnsi="DFKai-SB" w:eastAsia="DFKai-SB" w:cs="DFKai-SB"/>
+          <w:b w:val="0"/>
+          <w:i w:val="0"/>
+          <w:color w:val="19352D"/>
+          <w:sz w:val="22"/>
+        </w:rPr>
+      </w:r>
+      <w:r>
+        <w:rPr>
+          <w:rFonts w:ascii="DFKai-SB" w:hAnsi="DFKai-SB" w:eastAsia="DFKai-SB" w:cs="DFKai-SB"/>
+          <w:b w:val="0"/>
+          <w:i/>
+          <w:color w:val="19352D"/>
+          <w:sz w:val="22"/>
+        </w:rPr>
+        <w:t>原住民族語復振之研究―以賽德克族眉溪部落為例</w:t>
+      </w:r>
+      <w:r>
+        <w:rPr>
+          <w:rFonts w:ascii="DFKai-SB" w:hAnsi="DFKai-SB" w:eastAsia="DFKai-SB" w:cs="DFKai-SB"/>
+          <w:b w:val="0"/>
+          <w:i w:val="0"/>
+          <w:color w:val="19352D"/>
+          <w:sz w:val="22"/>
+        </w:rPr>
+        <w:t>（無日期）。［學位論文］。臺灣博碩士論文知識加值系統。</w:t>
+      </w:r>
+      <w:hyperlink r:id="rId29">
+        <w:r>
+          <w:rPr>
+            <w:rFonts w:ascii="DFKai-SB" w:hAnsi="DFKai-SB" w:eastAsia="DFKai-SB" w:cs="DFKai-SB"/>
+            <w:color w:val="0563C1"/>
+            <w:u w:val="single"/>
+            <w:sz w:val="22"/>
+          </w:rPr>
+          <w:t>https://hdl.handle.net/11296/8hm8u8</w:t>
+        </w:r>
+      </w:hyperlink>
+    </w:p>
+    <w:p>
+      <w:pPr>
+        <w:widowControl/>
+        <w:spacing w:line="480" w:lineRule="auto" w:after="0"/>
+        <w:ind w:left="720" w:hanging="720"/>
+        <w:jc w:val="left"/>
+      </w:pPr>
+      <w:r>
+        <w:rPr>
+          <w:rFonts w:ascii="DFKai-SB" w:hAnsi="DFKai-SB" w:eastAsia="DFKai-SB" w:cs="DFKai-SB"/>
+          <w:b w:val="0"/>
+          <w:i w:val="0"/>
+          <w:color w:val="19352D"/>
+          <w:sz w:val="22"/>
+        </w:rPr>
+      </w:r>
+      <w:r>
+        <w:rPr>
+          <w:rFonts w:ascii="DFKai-SB" w:hAnsi="DFKai-SB" w:eastAsia="DFKai-SB" w:cs="DFKai-SB"/>
+          <w:b w:val="0"/>
+          <w:i/>
+          <w:color w:val="19352D"/>
+          <w:sz w:val="22"/>
+        </w:rPr>
+        <w:t>原住民族語復振之研究：以臺東射馬干部落為例</w:t>
+      </w:r>
+      <w:r>
+        <w:rPr>
+          <w:rFonts w:ascii="DFKai-SB" w:hAnsi="DFKai-SB" w:eastAsia="DFKai-SB" w:cs="DFKai-SB"/>
+          <w:b w:val="0"/>
+          <w:i w:val="0"/>
+          <w:color w:val="19352D"/>
+          <w:sz w:val="22"/>
+        </w:rPr>
+        <w:t>（無日期）。［學位論文］。臺灣博碩士論文知識加值系統。</w:t>
+      </w:r>
+      <w:hyperlink r:id="rId30">
+        <w:r>
+          <w:rPr>
+            <w:rFonts w:ascii="DFKai-SB" w:hAnsi="DFKai-SB" w:eastAsia="DFKai-SB" w:cs="DFKai-SB"/>
+            <w:color w:val="0563C1"/>
+            <w:u w:val="single"/>
+            <w:sz w:val="22"/>
+          </w:rPr>
+          <w:t>https://hdl.handle.net/11296/e345g2</w:t>
+        </w:r>
+      </w:hyperlink>
+    </w:p>
+    <w:p>
+      <w:pPr>
+        <w:widowControl/>
+        <w:spacing w:line="480" w:lineRule="auto" w:after="0"/>
+        <w:ind w:left="720" w:hanging="720"/>
+        <w:jc w:val="left"/>
+      </w:pPr>
+      <w:r>
+        <w:rPr>
+          <w:rFonts w:ascii="DFKai-SB" w:hAnsi="DFKai-SB" w:eastAsia="DFKai-SB" w:cs="DFKai-SB"/>
+          <w:b w:val="0"/>
+          <w:i w:val="0"/>
+          <w:color w:val="19352D"/>
+          <w:sz w:val="22"/>
+        </w:rPr>
+      </w:r>
+      <w:r>
+        <w:rPr>
+          <w:rFonts w:ascii="DFKai-SB" w:hAnsi="DFKai-SB" w:eastAsia="DFKai-SB" w:cs="DFKai-SB"/>
+          <w:b w:val="0"/>
+          <w:i/>
+          <w:color w:val="19352D"/>
+          <w:sz w:val="22"/>
+        </w:rPr>
+        <w:t>原住民族語言書寫系統符號教學研究─以Akiyo教師阿美族語教學為例</w:t>
+      </w:r>
+      <w:r>
+        <w:rPr>
+          <w:rFonts w:ascii="DFKai-SB" w:hAnsi="DFKai-SB" w:eastAsia="DFKai-SB" w:cs="DFKai-SB"/>
+          <w:b w:val="0"/>
+          <w:i w:val="0"/>
+          <w:color w:val="19352D"/>
+          <w:sz w:val="22"/>
+        </w:rPr>
+        <w:t>（無日期）。［學位論文］。臺灣博碩士論文知識加值系統。</w:t>
+      </w:r>
+      <w:hyperlink r:id="rId31">
+        <w:r>
+          <w:rPr>
+            <w:rFonts w:ascii="DFKai-SB" w:hAnsi="DFKai-SB" w:eastAsia="DFKai-SB" w:cs="DFKai-SB"/>
+            <w:color w:val="0563C1"/>
+            <w:u w:val="single"/>
+            <w:sz w:val="22"/>
+          </w:rPr>
+          <w:t>https://hdl.handle.net/11296/ttb246</w:t>
+        </w:r>
+      </w:hyperlink>
+    </w:p>
+    <w:p>
+      <w:pPr>
+        <w:widowControl/>
+        <w:spacing w:line="480" w:lineRule="auto" w:after="0"/>
+        <w:ind w:left="720" w:hanging="720"/>
+        <w:jc w:val="left"/>
+      </w:pPr>
+      <w:r>
+        <w:rPr>
+          <w:rFonts w:ascii="DFKai-SB" w:hAnsi="DFKai-SB" w:eastAsia="DFKai-SB" w:cs="DFKai-SB"/>
+          <w:b w:val="0"/>
+          <w:i w:val="0"/>
+          <w:color w:val="19352D"/>
+          <w:sz w:val="22"/>
+        </w:rPr>
+      </w:r>
+      <w:r>
+        <w:rPr>
+          <w:rFonts w:ascii="DFKai-SB" w:hAnsi="DFKai-SB" w:eastAsia="DFKai-SB" w:cs="DFKai-SB"/>
+          <w:b w:val="0"/>
+          <w:i/>
+          <w:color w:val="19352D"/>
+          <w:sz w:val="22"/>
+        </w:rPr>
+        <w:t>台北ina的族語日常</w:t>
+      </w:r>
+      <w:r>
+        <w:rPr>
+          <w:rFonts w:ascii="DFKai-SB" w:hAnsi="DFKai-SB" w:eastAsia="DFKai-SB" w:cs="DFKai-SB"/>
+          <w:b w:val="0"/>
+          <w:i w:val="0"/>
+          <w:color w:val="19352D"/>
+          <w:sz w:val="22"/>
+        </w:rPr>
+        <w:t>（無日期）。［學位論文］。臺灣博碩士論文知識加值系統。</w:t>
+      </w:r>
+      <w:hyperlink r:id="rId32">
+        <w:r>
+          <w:rPr>
+            <w:rFonts w:ascii="DFKai-SB" w:hAnsi="DFKai-SB" w:eastAsia="DFKai-SB" w:cs="DFKai-SB"/>
+            <w:color w:val="0563C1"/>
+            <w:u w:val="single"/>
+            <w:sz w:val="22"/>
+          </w:rPr>
+          <w:t>https://hdl.handle.net/11296/fd8y6s</w:t>
+        </w:r>
+      </w:hyperlink>
+    </w:p>
+    <w:p>
+      <w:pPr>
+        <w:widowControl/>
+        <w:spacing w:line="480" w:lineRule="auto" w:after="0"/>
+        <w:ind w:left="720" w:hanging="720"/>
+        <w:jc w:val="left"/>
+      </w:pPr>
+      <w:r>
+        <w:rPr>
+          <w:rFonts w:ascii="DFKai-SB" w:hAnsi="DFKai-SB" w:eastAsia="DFKai-SB" w:cs="DFKai-SB"/>
+          <w:b w:val="0"/>
+          <w:i w:val="0"/>
+          <w:color w:val="19352D"/>
+          <w:sz w:val="22"/>
+        </w:rPr>
+      </w:r>
+      <w:r>
+        <w:rPr>
+          <w:rFonts w:ascii="DFKai-SB" w:hAnsi="DFKai-SB" w:eastAsia="DFKai-SB" w:cs="DFKai-SB"/>
+          <w:b w:val="0"/>
+          <w:i/>
+          <w:color w:val="19352D"/>
+          <w:sz w:val="22"/>
+        </w:rPr>
+        <w:t>台灣原住民族政策的發展：透過身份、語言、生計的分析</w:t>
+      </w:r>
+      <w:r>
+        <w:rPr>
+          <w:rFonts w:ascii="DFKai-SB" w:hAnsi="DFKai-SB" w:eastAsia="DFKai-SB" w:cs="DFKai-SB"/>
+          <w:b w:val="0"/>
+          <w:i w:val="0"/>
+          <w:color w:val="19352D"/>
+          <w:sz w:val="22"/>
+        </w:rPr>
+        <w:t>（無日期）。［學位論文］。臺灣博碩士論文知識加值系統。</w:t>
+      </w:r>
+      <w:hyperlink r:id="rId33">
+        <w:r>
+          <w:rPr>
+            <w:rFonts w:ascii="DFKai-SB" w:hAnsi="DFKai-SB" w:eastAsia="DFKai-SB" w:cs="DFKai-SB"/>
+            <w:color w:val="0563C1"/>
+            <w:u w:val="single"/>
+            <w:sz w:val="22"/>
+          </w:rPr>
+          <w:t>https://hdl.handle.net/11296/hj5zt6</w:t>
+        </w:r>
+      </w:hyperlink>
+    </w:p>
+    <w:p>
+      <w:pPr>
+        <w:widowControl/>
+        <w:spacing w:line="480" w:lineRule="auto" w:after="0"/>
+        <w:ind w:left="720" w:hanging="720"/>
+        <w:jc w:val="left"/>
+      </w:pPr>
+      <w:r>
+        <w:rPr>
+          <w:rFonts w:ascii="DFKai-SB" w:hAnsi="DFKai-SB" w:eastAsia="DFKai-SB" w:cs="DFKai-SB"/>
+          <w:b w:val="0"/>
+          <w:i w:val="0"/>
+          <w:color w:val="19352D"/>
+          <w:sz w:val="22"/>
+        </w:rPr>
+      </w:r>
+      <w:r>
+        <w:rPr>
+          <w:rFonts w:ascii="DFKai-SB" w:hAnsi="DFKai-SB" w:eastAsia="DFKai-SB" w:cs="DFKai-SB"/>
+          <w:b w:val="0"/>
+          <w:i/>
+          <w:color w:val="19352D"/>
+          <w:sz w:val="22"/>
+        </w:rPr>
+        <w:t>台灣原住民族語言能力認證制度之評估</w:t>
+      </w:r>
+      <w:r>
+        <w:rPr>
+          <w:rFonts w:ascii="DFKai-SB" w:hAnsi="DFKai-SB" w:eastAsia="DFKai-SB" w:cs="DFKai-SB"/>
+          <w:b w:val="0"/>
+          <w:i w:val="0"/>
+          <w:color w:val="19352D"/>
+          <w:sz w:val="22"/>
+        </w:rPr>
+        <w:t>（無日期）。［學位論文］。臺灣博碩士論文知識加值系統。</w:t>
+      </w:r>
+      <w:hyperlink r:id="rId34">
+        <w:r>
+          <w:rPr>
+            <w:rFonts w:ascii="DFKai-SB" w:hAnsi="DFKai-SB" w:eastAsia="DFKai-SB" w:cs="DFKai-SB"/>
+            <w:color w:val="0563C1"/>
+            <w:u w:val="single"/>
+            <w:sz w:val="22"/>
+          </w:rPr>
+          <w:t>https://hdl.handle.net/11296/ksj3v2</w:t>
+        </w:r>
+      </w:hyperlink>
+    </w:p>
+    <w:p>
+      <w:pPr>
+        <w:widowControl/>
+        <w:spacing w:line="480" w:lineRule="auto" w:after="0"/>
+        <w:ind w:left="720" w:hanging="720"/>
+        <w:jc w:val="left"/>
+      </w:pPr>
+      <w:r>
+        <w:rPr>
+          <w:rFonts w:ascii="DFKai-SB" w:hAnsi="DFKai-SB" w:eastAsia="DFKai-SB" w:cs="DFKai-SB"/>
+          <w:b w:val="0"/>
+          <w:i w:val="0"/>
+          <w:color w:val="19352D"/>
+          <w:sz w:val="22"/>
+        </w:rPr>
+      </w:r>
+      <w:r>
+        <w:rPr>
+          <w:rFonts w:ascii="DFKai-SB" w:hAnsi="DFKai-SB" w:eastAsia="DFKai-SB" w:cs="DFKai-SB"/>
+          <w:b w:val="0"/>
+          <w:i/>
+          <w:color w:val="19352D"/>
+          <w:sz w:val="22"/>
+        </w:rPr>
+        <w:t>台灣少數民族語言政策評估之研究－以花蓮縣轄內原住民族為例</w:t>
+      </w:r>
+      <w:r>
+        <w:rPr>
+          <w:rFonts w:ascii="DFKai-SB" w:hAnsi="DFKai-SB" w:eastAsia="DFKai-SB" w:cs="DFKai-SB"/>
+          <w:b w:val="0"/>
+          <w:i w:val="0"/>
+          <w:color w:val="19352D"/>
+          <w:sz w:val="22"/>
+        </w:rPr>
+        <w:t>（無日期）。［學位論文］。臺灣博碩士論文知識加值系統。</w:t>
+      </w:r>
+      <w:hyperlink r:id="rId35">
+        <w:r>
+          <w:rPr>
+            <w:rFonts w:ascii="DFKai-SB" w:hAnsi="DFKai-SB" w:eastAsia="DFKai-SB" w:cs="DFKai-SB"/>
+            <w:color w:val="0563C1"/>
+            <w:u w:val="single"/>
+            <w:sz w:val="22"/>
+          </w:rPr>
+          <w:t>https://hdl.handle.net/11296/4s74pj</w:t>
+        </w:r>
+      </w:hyperlink>
+    </w:p>
+    <w:p>
+      <w:pPr>
+        <w:widowControl/>
+        <w:spacing w:line="480" w:lineRule="auto" w:after="0"/>
+        <w:ind w:left="720" w:hanging="720"/>
+        <w:jc w:val="left"/>
+      </w:pPr>
+      <w:r>
+        <w:rPr>
+          <w:rFonts w:ascii="DFKai-SB" w:hAnsi="DFKai-SB" w:eastAsia="DFKai-SB" w:cs="DFKai-SB"/>
+          <w:b w:val="0"/>
+          <w:i w:val="0"/>
+          <w:color w:val="19352D"/>
+          <w:sz w:val="22"/>
+        </w:rPr>
+      </w:r>
+      <w:r>
+        <w:rPr>
+          <w:rFonts w:ascii="DFKai-SB" w:hAnsi="DFKai-SB" w:eastAsia="DFKai-SB" w:cs="DFKai-SB"/>
+          <w:b w:val="0"/>
+          <w:i/>
+          <w:color w:val="19352D"/>
+          <w:sz w:val="22"/>
+        </w:rPr>
+        <w:t>台灣與紐西蘭原住民族語言政策之比較分析</w:t>
+      </w:r>
+      <w:r>
+        <w:rPr>
+          <w:rFonts w:ascii="DFKai-SB" w:hAnsi="DFKai-SB" w:eastAsia="DFKai-SB" w:cs="DFKai-SB"/>
+          <w:b w:val="0"/>
+          <w:i w:val="0"/>
+          <w:color w:val="19352D"/>
+          <w:sz w:val="22"/>
+        </w:rPr>
+        <w:t>（無日期）。［學位論文］。臺灣博碩士論文知識加值系統。</w:t>
+      </w:r>
+      <w:hyperlink r:id="rId36">
+        <w:r>
+          <w:rPr>
+            <w:rFonts w:ascii="DFKai-SB" w:hAnsi="DFKai-SB" w:eastAsia="DFKai-SB" w:cs="DFKai-SB"/>
+            <w:color w:val="0563C1"/>
+            <w:u w:val="single"/>
+            <w:sz w:val="22"/>
+          </w:rPr>
+          <w:t>https://hdl.handle.net/11296/tskv3z</w:t>
+        </w:r>
+      </w:hyperlink>
+    </w:p>
+    <w:p>
+      <w:pPr>
+        <w:widowControl/>
+        <w:spacing w:line="480" w:lineRule="auto" w:after="0"/>
+        <w:ind w:left="720" w:hanging="720"/>
+        <w:jc w:val="left"/>
+      </w:pPr>
+      <w:r>
+        <w:rPr>
+          <w:rFonts w:ascii="DFKai-SB" w:hAnsi="DFKai-SB" w:eastAsia="DFKai-SB" w:cs="DFKai-SB"/>
+          <w:b w:val="0"/>
+          <w:i w:val="0"/>
+          <w:color w:val="19352D"/>
+          <w:sz w:val="22"/>
+        </w:rPr>
+      </w:r>
+      <w:r>
+        <w:rPr>
+          <w:rFonts w:ascii="DFKai-SB" w:hAnsi="DFKai-SB" w:eastAsia="DFKai-SB" w:cs="DFKai-SB"/>
+          <w:b w:val="0"/>
+          <w:i/>
+          <w:color w:val="19352D"/>
+          <w:sz w:val="22"/>
+        </w:rPr>
+        <w:t>台語失語症病人詞彙理解之腦事件相關電位研究</w:t>
+      </w:r>
+      <w:r>
+        <w:rPr>
+          <w:rFonts w:ascii="DFKai-SB" w:hAnsi="DFKai-SB" w:eastAsia="DFKai-SB" w:cs="DFKai-SB"/>
+          <w:b w:val="0"/>
+          <w:i w:val="0"/>
+          <w:color w:val="19352D"/>
+          <w:sz w:val="22"/>
+        </w:rPr>
+        <w:t>（無日期）。［學位論文］。臺灣博碩士論文知識加值系統。</w:t>
+      </w:r>
+      <w:hyperlink r:id="rId37">
+        <w:r>
+          <w:rPr>
+            <w:rFonts w:ascii="DFKai-SB" w:hAnsi="DFKai-SB" w:eastAsia="DFKai-SB" w:cs="DFKai-SB"/>
+            <w:color w:val="0563C1"/>
+            <w:u w:val="single"/>
+            <w:sz w:val="22"/>
+          </w:rPr>
+          <w:t>https://hdl.handle.net/11296/j2s6t8</w:t>
+        </w:r>
+      </w:hyperlink>
+    </w:p>
+    <w:p>
+      <w:pPr>
+        <w:widowControl/>
+        <w:spacing w:line="480" w:lineRule="auto" w:after="0"/>
+        <w:ind w:left="720" w:hanging="720"/>
+        <w:jc w:val="left"/>
+      </w:pPr>
+      <w:r>
+        <w:rPr>
+          <w:rFonts w:ascii="DFKai-SB" w:hAnsi="DFKai-SB" w:eastAsia="DFKai-SB" w:cs="DFKai-SB"/>
+          <w:b w:val="0"/>
+          <w:i w:val="0"/>
+          <w:color w:val="19352D"/>
+          <w:sz w:val="22"/>
+        </w:rPr>
+      </w:r>
+      <w:r>
+        <w:rPr>
+          <w:rFonts w:ascii="DFKai-SB" w:hAnsi="DFKai-SB" w:eastAsia="DFKai-SB" w:cs="DFKai-SB"/>
+          <w:b w:val="0"/>
+          <w:i/>
+          <w:color w:val="19352D"/>
+          <w:sz w:val="22"/>
+        </w:rPr>
+        <w:t>左右腦腦傷患者語用測驗表現之研究</w:t>
+      </w:r>
+      <w:r>
+        <w:rPr>
+          <w:rFonts w:ascii="DFKai-SB" w:hAnsi="DFKai-SB" w:eastAsia="DFKai-SB" w:cs="DFKai-SB"/>
+          <w:b w:val="0"/>
+          <w:i w:val="0"/>
+          <w:color w:val="19352D"/>
+          <w:sz w:val="22"/>
+        </w:rPr>
+        <w:t>（無日期）。［學位論文］。臺灣博碩士論文知識加值系統。</w:t>
+      </w:r>
+      <w:hyperlink r:id="rId38">
+        <w:r>
+          <w:rPr>
+            <w:rFonts w:ascii="DFKai-SB" w:hAnsi="DFKai-SB" w:eastAsia="DFKai-SB" w:cs="DFKai-SB"/>
+            <w:color w:val="0563C1"/>
+            <w:u w:val="single"/>
+            <w:sz w:val="22"/>
+          </w:rPr>
+          <w:t>https://hdl.handle.net/11296/2h9m7y</w:t>
+        </w:r>
+      </w:hyperlink>
+    </w:p>
+    <w:p>
+      <w:pPr>
+        <w:widowControl/>
+        <w:spacing w:line="480" w:lineRule="auto" w:after="0"/>
+        <w:ind w:left="720" w:hanging="720"/>
+        <w:jc w:val="left"/>
+      </w:pPr>
+      <w:r>
+        <w:rPr>
+          <w:rFonts w:ascii="DFKai-SB" w:hAnsi="DFKai-SB" w:eastAsia="DFKai-SB" w:cs="DFKai-SB"/>
+          <w:b w:val="0"/>
+          <w:i w:val="0"/>
+          <w:color w:val="19352D"/>
+          <w:sz w:val="22"/>
+        </w:rPr>
+        <w:t>張文翊（2024）。</w:t>
+      </w:r>
+      <w:r>
+        <w:rPr>
+          <w:rFonts w:ascii="DFKai-SB" w:hAnsi="DFKai-SB" w:eastAsia="DFKai-SB" w:cs="DFKai-SB"/>
+          <w:b w:val="0"/>
+          <w:i/>
+          <w:color w:val="19352D"/>
+          <w:sz w:val="22"/>
+        </w:rPr>
+        <w:t>文化敏感音樂治療應用於部落長者預防及延緩失能之成效探討［碩士論文，輔仁大學］。</w:t>
       </w:r>
       <w:hyperlink r:id="rId17">
         <w:r>
@@ -7074,8 +7954,10 @@
     </w:p>
     <w:p>
       <w:pPr>
+        <w:widowControl/>
         <w:spacing w:line="480" w:lineRule="auto" w:after="0"/>
         <w:ind w:left="720" w:hanging="720"/>
+        <w:jc w:val="left"/>
       </w:pPr>
       <w:r>
         <w:rPr>
@@ -7085,9 +7967,28 @@
           <w:color w:val="19352D"/>
           <w:sz w:val="22"/>
         </w:rPr>
-        <w:t>陳誼誠（2017）。《阿美族語的語言活力》［博士論文，國立政治大學］。</w:t>
       </w:r>
-      <w:hyperlink r:id="rId10">
+      <w:r>
+        <w:rPr>
+          <w:rFonts w:ascii="DFKai-SB" w:hAnsi="DFKai-SB" w:eastAsia="DFKai-SB" w:cs="DFKai-SB"/>
+          <w:b w:val="0"/>
+          <w:i/>
+          <w:color w:val="19352D"/>
+          <w:sz w:val="22"/>
+        </w:rPr>
+        <w:t>從南投縣Toda（都達）母語實踐與傳承探討賽德克族的族群認同</w:t>
+      </w:r>
+      <w:r>
+        <w:rPr>
+          <w:rFonts w:ascii="DFKai-SB" w:hAnsi="DFKai-SB" w:eastAsia="DFKai-SB" w:cs="DFKai-SB"/>
+          <w:b w:val="0"/>
+          <w:i w:val="0"/>
+          <w:color w:val="19352D"/>
+          <w:sz w:val="22"/>
+        </w:rPr>
+        <w:t>（無日期）。［學位論文］。臺灣博碩士論文知識加值系統。</w:t>
+      </w:r>
+      <w:hyperlink r:id="rId39">
         <w:r>
           <w:rPr>
             <w:rFonts w:ascii="DFKai-SB" w:hAnsi="DFKai-SB" w:eastAsia="DFKai-SB" w:cs="DFKai-SB"/>
@@ -7095,14 +7996,16 @@
             <w:u w:val="single"/>
             <w:sz w:val="22"/>
           </w:rPr>
-          <w:t>https://ndltd.ncl.edu.tw/cgi-bin/gs32/gsweb.cgi?o=dnclcdr&amp;s=id%3D%22105NCCU5100005%22.&amp;searchmode=basic</w:t>
+          <w:t>https://hdl.handle.net/11296/sx92qb</w:t>
         </w:r>
       </w:hyperlink>
     </w:p>
     <w:p>
       <w:pPr>
+        <w:widowControl/>
         <w:spacing w:line="480" w:lineRule="auto" w:after="0"/>
         <w:ind w:left="720" w:hanging="720"/>
+        <w:jc w:val="left"/>
       </w:pPr>
       <w:r>
         <w:rPr>
@@ -7112,7 +8015,401 @@
           <w:color w:val="19352D"/>
           <w:sz w:val="22"/>
         </w:rPr>
-        <w:t>蕭惠美（2025）。《以層級分析法探討提升原住民健康識能轉譯之關鍵成功因素》［碩士論文，國立屏東科技大學］。</w:t>
+      </w:r>
+      <w:r>
+        <w:rPr>
+          <w:rFonts w:ascii="DFKai-SB" w:hAnsi="DFKai-SB" w:eastAsia="DFKai-SB" w:cs="DFKai-SB"/>
+          <w:b w:val="0"/>
+          <w:i/>
+          <w:color w:val="19352D"/>
+          <w:sz w:val="22"/>
+        </w:rPr>
+        <w:t>從沉浸式族語教學幼兒園到太魯閣族語復振-以花蓮太魯閣族原鄉地區為例</w:t>
+      </w:r>
+      <w:r>
+        <w:rPr>
+          <w:rFonts w:ascii="DFKai-SB" w:hAnsi="DFKai-SB" w:eastAsia="DFKai-SB" w:cs="DFKai-SB"/>
+          <w:b w:val="0"/>
+          <w:i w:val="0"/>
+          <w:color w:val="19352D"/>
+          <w:sz w:val="22"/>
+        </w:rPr>
+        <w:t>（無日期）。［學位論文］。臺灣博碩士論文知識加值系統。</w:t>
+      </w:r>
+      <w:hyperlink r:id="rId40">
+        <w:r>
+          <w:rPr>
+            <w:rFonts w:ascii="DFKai-SB" w:hAnsi="DFKai-SB" w:eastAsia="DFKai-SB" w:cs="DFKai-SB"/>
+            <w:color w:val="0563C1"/>
+            <w:u w:val="single"/>
+            <w:sz w:val="22"/>
+          </w:rPr>
+          <w:t>https://hdl.handle.net/11296/2ahnqq</w:t>
+        </w:r>
+      </w:hyperlink>
+    </w:p>
+    <w:p>
+      <w:pPr>
+        <w:widowControl/>
+        <w:spacing w:line="480" w:lineRule="auto" w:after="0"/>
+        <w:ind w:left="720" w:hanging="720"/>
+        <w:jc w:val="left"/>
+      </w:pPr>
+      <w:r>
+        <w:rPr>
+          <w:rFonts w:ascii="DFKai-SB" w:hAnsi="DFKai-SB" w:eastAsia="DFKai-SB" w:cs="DFKai-SB"/>
+          <w:b w:val="0"/>
+          <w:i w:val="0"/>
+          <w:color w:val="19352D"/>
+          <w:sz w:val="22"/>
+        </w:rPr>
+      </w:r>
+      <w:r>
+        <w:rPr>
+          <w:rFonts w:ascii="DFKai-SB" w:hAnsi="DFKai-SB" w:eastAsia="DFKai-SB" w:cs="DFKai-SB"/>
+          <w:b w:val="0"/>
+          <w:i/>
+          <w:color w:val="19352D"/>
+          <w:sz w:val="22"/>
+        </w:rPr>
+        <w:t>成功阿美的教會活動及其教育意義</w:t>
+      </w:r>
+      <w:r>
+        <w:rPr>
+          <w:rFonts w:ascii="DFKai-SB" w:hAnsi="DFKai-SB" w:eastAsia="DFKai-SB" w:cs="DFKai-SB"/>
+          <w:b w:val="0"/>
+          <w:i w:val="0"/>
+          <w:color w:val="19352D"/>
+          <w:sz w:val="22"/>
+        </w:rPr>
+        <w:t>（無日期）。［學位論文］。臺灣博碩士論文知識加值系統。</w:t>
+      </w:r>
+      <w:hyperlink r:id="rId41">
+        <w:r>
+          <w:rPr>
+            <w:rFonts w:ascii="DFKai-SB" w:hAnsi="DFKai-SB" w:eastAsia="DFKai-SB" w:cs="DFKai-SB"/>
+            <w:color w:val="0563C1"/>
+            <w:u w:val="single"/>
+            <w:sz w:val="22"/>
+          </w:rPr>
+          <w:t>https://hdl.handle.net/11296/ss7m84</w:t>
+        </w:r>
+      </w:hyperlink>
+    </w:p>
+    <w:p>
+      <w:pPr>
+        <w:widowControl/>
+        <w:spacing w:line="480" w:lineRule="auto" w:after="0"/>
+        <w:ind w:left="720" w:hanging="720"/>
+        <w:jc w:val="left"/>
+      </w:pPr>
+      <w:r>
+        <w:rPr>
+          <w:rFonts w:ascii="DFKai-SB" w:hAnsi="DFKai-SB" w:eastAsia="DFKai-SB" w:cs="DFKai-SB"/>
+          <w:b w:val="0"/>
+          <w:i w:val="0"/>
+          <w:color w:val="19352D"/>
+          <w:sz w:val="22"/>
+        </w:rPr>
+      </w:r>
+      <w:r>
+        <w:rPr>
+          <w:rFonts w:ascii="DFKai-SB" w:hAnsi="DFKai-SB" w:eastAsia="DFKai-SB" w:cs="DFKai-SB"/>
+          <w:b w:val="0"/>
+          <w:i/>
+          <w:color w:val="19352D"/>
+          <w:sz w:val="22"/>
+        </w:rPr>
+        <w:t>族群文化與親密關係:七位都市排灣族女性的觀點</w:t>
+      </w:r>
+      <w:r>
+        <w:rPr>
+          <w:rFonts w:ascii="DFKai-SB" w:hAnsi="DFKai-SB" w:eastAsia="DFKai-SB" w:cs="DFKai-SB"/>
+          <w:b w:val="0"/>
+          <w:i w:val="0"/>
+          <w:color w:val="19352D"/>
+          <w:sz w:val="22"/>
+        </w:rPr>
+        <w:t>（無日期）。［學位論文］。臺灣博碩士論文知識加值系統。</w:t>
+      </w:r>
+      <w:hyperlink r:id="rId42">
+        <w:r>
+          <w:rPr>
+            <w:rFonts w:ascii="DFKai-SB" w:hAnsi="DFKai-SB" w:eastAsia="DFKai-SB" w:cs="DFKai-SB"/>
+            <w:color w:val="0563C1"/>
+            <w:u w:val="single"/>
+            <w:sz w:val="22"/>
+          </w:rPr>
+          <w:t>https://hdl.handle.net/11296/x8ykx6</w:t>
+        </w:r>
+      </w:hyperlink>
+    </w:p>
+    <w:p>
+      <w:pPr>
+        <w:widowControl/>
+        <w:spacing w:line="480" w:lineRule="auto" w:after="0"/>
+        <w:ind w:left="720" w:hanging="720"/>
+        <w:jc w:val="left"/>
+      </w:pPr>
+      <w:r>
+        <w:rPr>
+          <w:rFonts w:ascii="DFKai-SB" w:hAnsi="DFKai-SB" w:eastAsia="DFKai-SB" w:cs="DFKai-SB"/>
+          <w:b w:val="0"/>
+          <w:i w:val="0"/>
+          <w:color w:val="19352D"/>
+          <w:sz w:val="22"/>
+        </w:rPr>
+      </w:r>
+      <w:r>
+        <w:rPr>
+          <w:rFonts w:ascii="DFKai-SB" w:hAnsi="DFKai-SB" w:eastAsia="DFKai-SB" w:cs="DFKai-SB"/>
+          <w:b w:val="0"/>
+          <w:i/>
+          <w:color w:val="19352D"/>
+          <w:sz w:val="22"/>
+        </w:rPr>
+        <w:t>民俗文學分析在語言教學中的研究︰以花蓮縣太巴塱部落《創世神話》為例</w:t>
+      </w:r>
+      <w:r>
+        <w:rPr>
+          <w:rFonts w:ascii="DFKai-SB" w:hAnsi="DFKai-SB" w:eastAsia="DFKai-SB" w:cs="DFKai-SB"/>
+          <w:b w:val="0"/>
+          <w:i w:val="0"/>
+          <w:color w:val="19352D"/>
+          <w:sz w:val="22"/>
+        </w:rPr>
+        <w:t>（無日期）。［學位論文］。臺灣博碩士論文知識加值系統。</w:t>
+      </w:r>
+      <w:hyperlink r:id="rId43">
+        <w:r>
+          <w:rPr>
+            <w:rFonts w:ascii="DFKai-SB" w:hAnsi="DFKai-SB" w:eastAsia="DFKai-SB" w:cs="DFKai-SB"/>
+            <w:color w:val="0563C1"/>
+            <w:u w:val="single"/>
+            <w:sz w:val="22"/>
+          </w:rPr>
+          <w:t>https://hdl.handle.net/11296/tfy9xt</w:t>
+        </w:r>
+      </w:hyperlink>
+    </w:p>
+    <w:p>
+      <w:pPr>
+        <w:widowControl/>
+        <w:spacing w:line="480" w:lineRule="auto" w:after="0"/>
+        <w:ind w:left="720" w:hanging="720"/>
+        <w:jc w:val="left"/>
+      </w:pPr>
+      <w:r>
+        <w:rPr>
+          <w:rFonts w:ascii="DFKai-SB" w:hAnsi="DFKai-SB" w:eastAsia="DFKai-SB" w:cs="DFKai-SB"/>
+          <w:b w:val="0"/>
+          <w:i w:val="0"/>
+          <w:color w:val="19352D"/>
+          <w:sz w:val="22"/>
+        </w:rPr>
+      </w:r>
+      <w:r>
+        <w:rPr>
+          <w:rFonts w:ascii="DFKai-SB" w:hAnsi="DFKai-SB" w:eastAsia="DFKai-SB" w:cs="DFKai-SB"/>
+          <w:b w:val="0"/>
+          <w:i/>
+          <w:color w:val="19352D"/>
+          <w:sz w:val="22"/>
+        </w:rPr>
+        <w:t>臺灣原住民族幼兒園實施沉浸式族語教學之研究</w:t>
+      </w:r>
+      <w:r>
+        <w:rPr>
+          <w:rFonts w:ascii="DFKai-SB" w:hAnsi="DFKai-SB" w:eastAsia="DFKai-SB" w:cs="DFKai-SB"/>
+          <w:b w:val="0"/>
+          <w:i w:val="0"/>
+          <w:color w:val="19352D"/>
+          <w:sz w:val="22"/>
+        </w:rPr>
+        <w:t>（無日期）。［學位論文］。臺灣博碩士論文知識加值系統。</w:t>
+      </w:r>
+      <w:hyperlink r:id="rId44">
+        <w:r>
+          <w:rPr>
+            <w:rFonts w:ascii="DFKai-SB" w:hAnsi="DFKai-SB" w:eastAsia="DFKai-SB" w:cs="DFKai-SB"/>
+            <w:color w:val="0563C1"/>
+            <w:u w:val="single"/>
+            <w:sz w:val="22"/>
+          </w:rPr>
+          <w:t>https://hdl.handle.net/11296/39d4b2</w:t>
+        </w:r>
+      </w:hyperlink>
+    </w:p>
+    <w:p>
+      <w:pPr>
+        <w:widowControl/>
+        <w:spacing w:line="480" w:lineRule="auto" w:after="0"/>
+        <w:ind w:left="720" w:hanging="720"/>
+        <w:jc w:val="left"/>
+      </w:pPr>
+      <w:r>
+        <w:rPr>
+          <w:rFonts w:ascii="DFKai-SB" w:hAnsi="DFKai-SB" w:eastAsia="DFKai-SB" w:cs="DFKai-SB"/>
+          <w:b w:val="0"/>
+          <w:i w:val="0"/>
+          <w:color w:val="19352D"/>
+          <w:sz w:val="22"/>
+        </w:rPr>
+      </w:r>
+      <w:r>
+        <w:rPr>
+          <w:rFonts w:ascii="DFKai-SB" w:hAnsi="DFKai-SB" w:eastAsia="DFKai-SB" w:cs="DFKai-SB"/>
+          <w:b w:val="0"/>
+          <w:i/>
+          <w:color w:val="19352D"/>
+          <w:sz w:val="22"/>
+        </w:rPr>
+        <w:t>臺灣原住民族語政策之批判論述分析</w:t>
+      </w:r>
+      <w:r>
+        <w:rPr>
+          <w:rFonts w:ascii="DFKai-SB" w:hAnsi="DFKai-SB" w:eastAsia="DFKai-SB" w:cs="DFKai-SB"/>
+          <w:b w:val="0"/>
+          <w:i w:val="0"/>
+          <w:color w:val="19352D"/>
+          <w:sz w:val="22"/>
+        </w:rPr>
+        <w:t>（無日期）。［學位論文］。臺灣博碩士論文知識加值系統。</w:t>
+      </w:r>
+      <w:hyperlink r:id="rId45">
+        <w:r>
+          <w:rPr>
+            <w:rFonts w:ascii="DFKai-SB" w:hAnsi="DFKai-SB" w:eastAsia="DFKai-SB" w:cs="DFKai-SB"/>
+            <w:color w:val="0563C1"/>
+            <w:u w:val="single"/>
+            <w:sz w:val="22"/>
+          </w:rPr>
+          <w:t>https://hdl.handle.net/11296/rr6tz7</w:t>
+        </w:r>
+      </w:hyperlink>
+    </w:p>
+    <w:p>
+      <w:pPr>
+        <w:widowControl/>
+        <w:spacing w:line="480" w:lineRule="auto" w:after="0"/>
+        <w:ind w:left="720" w:hanging="720"/>
+        <w:jc w:val="left"/>
+      </w:pPr>
+      <w:r>
+        <w:rPr>
+          <w:rFonts w:ascii="DFKai-SB" w:hAnsi="DFKai-SB" w:eastAsia="DFKai-SB" w:cs="DFKai-SB"/>
+          <w:b w:val="0"/>
+          <w:i w:val="0"/>
+          <w:color w:val="19352D"/>
+          <w:sz w:val="22"/>
+        </w:rPr>
+      </w:r>
+      <w:r>
+        <w:rPr>
+          <w:rFonts w:ascii="DFKai-SB" w:hAnsi="DFKai-SB" w:eastAsia="DFKai-SB" w:cs="DFKai-SB"/>
+          <w:b w:val="0"/>
+          <w:i/>
+          <w:color w:val="19352D"/>
+          <w:sz w:val="22"/>
+        </w:rPr>
+        <w:t>花蓮地區阿美族語語言之調查：維持與轉移</w:t>
+      </w:r>
+      <w:r>
+        <w:rPr>
+          <w:rFonts w:ascii="DFKai-SB" w:hAnsi="DFKai-SB" w:eastAsia="DFKai-SB" w:cs="DFKai-SB"/>
+          <w:b w:val="0"/>
+          <w:i w:val="0"/>
+          <w:color w:val="19352D"/>
+          <w:sz w:val="22"/>
+        </w:rPr>
+        <w:t>（無日期）。［學位論文］。臺灣博碩士論文知識加值系統。</w:t>
+      </w:r>
+      <w:hyperlink r:id="rId46">
+        <w:r>
+          <w:rPr>
+            <w:rFonts w:ascii="DFKai-SB" w:hAnsi="DFKai-SB" w:eastAsia="DFKai-SB" w:cs="DFKai-SB"/>
+            <w:color w:val="0563C1"/>
+            <w:u w:val="single"/>
+            <w:sz w:val="22"/>
+          </w:rPr>
+          <w:t>https://hdl.handle.net/11296/f7p9hg</w:t>
+        </w:r>
+      </w:hyperlink>
+    </w:p>
+    <w:p>
+      <w:pPr>
+        <w:widowControl/>
+        <w:spacing w:line="480" w:lineRule="auto" w:after="0"/>
+        <w:ind w:left="720" w:hanging="720"/>
+        <w:jc w:val="left"/>
+      </w:pPr>
+      <w:r>
+        <w:rPr>
+          <w:rFonts w:ascii="DFKai-SB" w:hAnsi="DFKai-SB" w:eastAsia="DFKai-SB" w:cs="DFKai-SB"/>
+          <w:b w:val="0"/>
+          <w:i w:val="0"/>
+          <w:color w:val="19352D"/>
+          <w:sz w:val="22"/>
+        </w:rPr>
+      </w:r>
+      <w:r>
+        <w:rPr>
+          <w:rFonts w:ascii="DFKai-SB" w:hAnsi="DFKai-SB" w:eastAsia="DFKai-SB" w:cs="DFKai-SB"/>
+          <w:b w:val="0"/>
+          <w:i/>
+          <w:color w:val="19352D"/>
+          <w:sz w:val="22"/>
+        </w:rPr>
+        <w:t>花蓮太魯閣語語言轉移與減退－以支亞干部落為例－</w:t>
+      </w:r>
+      <w:r>
+        <w:rPr>
+          <w:rFonts w:ascii="DFKai-SB" w:hAnsi="DFKai-SB" w:eastAsia="DFKai-SB" w:cs="DFKai-SB"/>
+          <w:b w:val="0"/>
+          <w:i w:val="0"/>
+          <w:color w:val="19352D"/>
+          <w:sz w:val="22"/>
+        </w:rPr>
+        <w:t>（無日期）。［學位論文］。臺灣博碩士論文知識加值系統。</w:t>
+      </w:r>
+      <w:hyperlink r:id="rId47">
+        <w:r>
+          <w:rPr>
+            <w:rFonts w:ascii="DFKai-SB" w:hAnsi="DFKai-SB" w:eastAsia="DFKai-SB" w:cs="DFKai-SB"/>
+            <w:color w:val="0563C1"/>
+            <w:u w:val="single"/>
+            <w:sz w:val="22"/>
+          </w:rPr>
+          <w:t>https://hdl.handle.net/11296/b7z923</w:t>
+        </w:r>
+      </w:hyperlink>
+    </w:p>
+    <w:p>
+      <w:pPr>
+        <w:widowControl/>
+        <w:spacing w:line="480" w:lineRule="auto" w:after="0"/>
+        <w:ind w:left="720" w:hanging="720"/>
+        <w:jc w:val="left"/>
+      </w:pPr>
+      <w:r>
+        <w:rPr>
+          <w:rFonts w:ascii="DFKai-SB" w:hAnsi="DFKai-SB" w:eastAsia="DFKai-SB" w:cs="DFKai-SB"/>
+          <w:b w:val="0"/>
+          <w:i w:val="0"/>
+          <w:color w:val="19352D"/>
+          <w:sz w:val="22"/>
+        </w:rPr>
+        <w:t>蕭惠美（2025）。</w:t>
+      </w:r>
+      <w:r>
+        <w:rPr>
+          <w:rFonts w:ascii="DFKai-SB" w:hAnsi="DFKai-SB" w:eastAsia="DFKai-SB" w:cs="DFKai-SB"/>
+          <w:b w:val="0"/>
+          <w:i/>
+          <w:color w:val="19352D"/>
+          <w:sz w:val="22"/>
+        </w:rPr>
+        <w:t>以層級分析法探討提升原住民健康識能轉譯之關鍵成功因素［碩士論文，國立屏東科技大學］。</w:t>
       </w:r>
       <w:hyperlink r:id="rId14">
         <w:r>
@@ -7125,6 +8422,1369 @@
           <w:t>https://ndltd.ncl.edu.tw/cgi-bin/gs32/gsweb.cgi/login?o=dnclcdr&amp;s=id%3D%22113NPUS5457005%22.&amp;searchmode=basic</w:t>
         </w:r>
       </w:hyperlink>
+    </w:p>
+    <w:p>
+      <w:pPr>
+        <w:widowControl/>
+        <w:spacing w:line="480" w:lineRule="auto" w:after="0"/>
+        <w:ind w:left="720" w:hanging="720"/>
+        <w:jc w:val="left"/>
+      </w:pPr>
+      <w:r>
+        <w:rPr>
+          <w:rFonts w:ascii="DFKai-SB" w:hAnsi="DFKai-SB" w:eastAsia="DFKai-SB" w:cs="DFKai-SB"/>
+          <w:b w:val="0"/>
+          <w:i w:val="0"/>
+          <w:color w:val="19352D"/>
+          <w:sz w:val="22"/>
+        </w:rPr>
+      </w:r>
+      <w:r>
+        <w:rPr>
+          <w:rFonts w:ascii="DFKai-SB" w:hAnsi="DFKai-SB" w:eastAsia="DFKai-SB" w:cs="DFKai-SB"/>
+          <w:b w:val="0"/>
+          <w:i/>
+          <w:color w:val="19352D"/>
+          <w:sz w:val="22"/>
+        </w:rPr>
+        <w:t>近代國家體制下學校教育對台東和平部落阿美族人語言使用變遷之研究</w:t>
+      </w:r>
+      <w:r>
+        <w:rPr>
+          <w:rFonts w:ascii="DFKai-SB" w:hAnsi="DFKai-SB" w:eastAsia="DFKai-SB" w:cs="DFKai-SB"/>
+          <w:b w:val="0"/>
+          <w:i w:val="0"/>
+          <w:color w:val="19352D"/>
+          <w:sz w:val="22"/>
+        </w:rPr>
+        <w:t>（無日期）。［學位論文］。臺灣博碩士論文知識加值系統。</w:t>
+      </w:r>
+      <w:hyperlink r:id="rId48">
+        <w:r>
+          <w:rPr>
+            <w:rFonts w:ascii="DFKai-SB" w:hAnsi="DFKai-SB" w:eastAsia="DFKai-SB" w:cs="DFKai-SB"/>
+            <w:color w:val="0563C1"/>
+            <w:u w:val="single"/>
+            <w:sz w:val="22"/>
+          </w:rPr>
+          <w:t>https://hdl.handle.net/11296/r8yfx3</w:t>
+        </w:r>
+      </w:hyperlink>
+    </w:p>
+    <w:p>
+      <w:pPr>
+        <w:widowControl/>
+        <w:spacing w:line="480" w:lineRule="auto" w:after="0"/>
+        <w:ind w:left="720" w:hanging="720"/>
+        <w:jc w:val="left"/>
+      </w:pPr>
+      <w:r>
+        <w:rPr>
+          <w:rFonts w:ascii="DFKai-SB" w:hAnsi="DFKai-SB" w:eastAsia="DFKai-SB" w:cs="DFKai-SB"/>
+          <w:b w:val="0"/>
+          <w:i w:val="0"/>
+          <w:color w:val="19352D"/>
+          <w:sz w:val="22"/>
+        </w:rPr>
+      </w:r>
+      <w:r>
+        <w:rPr>
+          <w:rFonts w:ascii="DFKai-SB" w:hAnsi="DFKai-SB" w:eastAsia="DFKai-SB" w:cs="DFKai-SB"/>
+          <w:b w:val="0"/>
+          <w:i/>
+          <w:color w:val="19352D"/>
+          <w:sz w:val="22"/>
+        </w:rPr>
+        <w:t>里慕伊．阿紀小說的鄉土與性別書寫</w:t>
+      </w:r>
+      <w:r>
+        <w:rPr>
+          <w:rFonts w:ascii="DFKai-SB" w:hAnsi="DFKai-SB" w:eastAsia="DFKai-SB" w:cs="DFKai-SB"/>
+          <w:b w:val="0"/>
+          <w:i w:val="0"/>
+          <w:color w:val="19352D"/>
+          <w:sz w:val="22"/>
+        </w:rPr>
+        <w:t>（無日期）。［學位論文］。臺灣博碩士論文知識加值系統。</w:t>
+      </w:r>
+      <w:hyperlink r:id="rId49">
+        <w:r>
+          <w:rPr>
+            <w:rFonts w:ascii="DFKai-SB" w:hAnsi="DFKai-SB" w:eastAsia="DFKai-SB" w:cs="DFKai-SB"/>
+            <w:color w:val="0563C1"/>
+            <w:u w:val="single"/>
+            <w:sz w:val="22"/>
+          </w:rPr>
+          <w:t>https://hdl.handle.net/11296/8cbxk7</w:t>
+        </w:r>
+      </w:hyperlink>
+    </w:p>
+    <w:p>
+      <w:pPr>
+        <w:widowControl/>
+        <w:spacing w:line="480" w:lineRule="auto" w:after="0"/>
+        <w:ind w:left="720" w:hanging="720"/>
+        <w:jc w:val="left"/>
+      </w:pPr>
+      <w:r>
+        <w:rPr>
+          <w:rFonts w:ascii="DFKai-SB" w:hAnsi="DFKai-SB" w:eastAsia="DFKai-SB" w:cs="DFKai-SB"/>
+          <w:b w:val="0"/>
+          <w:i w:val="0"/>
+          <w:color w:val="19352D"/>
+          <w:sz w:val="22"/>
+        </w:rPr>
+      </w:r>
+      <w:r>
+        <w:rPr>
+          <w:rFonts w:ascii="DFKai-SB" w:hAnsi="DFKai-SB" w:eastAsia="DFKai-SB" w:cs="DFKai-SB"/>
+          <w:b w:val="0"/>
+          <w:i/>
+          <w:color w:val="19352D"/>
+          <w:sz w:val="22"/>
+        </w:rPr>
+        <w:t>阿美族語失語症患者評估測驗之初步發展</w:t>
+      </w:r>
+      <w:r>
+        <w:rPr>
+          <w:rFonts w:ascii="DFKai-SB" w:hAnsi="DFKai-SB" w:eastAsia="DFKai-SB" w:cs="DFKai-SB"/>
+          <w:b w:val="0"/>
+          <w:i w:val="0"/>
+          <w:color w:val="19352D"/>
+          <w:sz w:val="22"/>
+        </w:rPr>
+        <w:t>（無日期）。［學位論文］。臺灣博碩士論文知識加值系統。</w:t>
+      </w:r>
+      <w:hyperlink r:id="rId50">
+        <w:r>
+          <w:rPr>
+            <w:rFonts w:ascii="DFKai-SB" w:hAnsi="DFKai-SB" w:eastAsia="DFKai-SB" w:cs="DFKai-SB"/>
+            <w:color w:val="0563C1"/>
+            <w:u w:val="single"/>
+            <w:sz w:val="22"/>
+          </w:rPr>
+          <w:t>https://hdl.handle.net/11296/vs275u</w:t>
+        </w:r>
+      </w:hyperlink>
+    </w:p>
+    <w:p>
+      <w:pPr>
+        <w:widowControl/>
+        <w:spacing w:line="480" w:lineRule="auto" w:after="0"/>
+        <w:ind w:left="720" w:hanging="720"/>
+        <w:jc w:val="left"/>
+      </w:pPr>
+      <w:r>
+        <w:rPr>
+          <w:rFonts w:ascii="DFKai-SB" w:hAnsi="DFKai-SB" w:eastAsia="DFKai-SB" w:cs="DFKai-SB"/>
+          <w:b w:val="0"/>
+          <w:i w:val="0"/>
+          <w:color w:val="19352D"/>
+          <w:sz w:val="22"/>
+        </w:rPr>
+      </w:r>
+      <w:r>
+        <w:rPr>
+          <w:rFonts w:ascii="DFKai-SB" w:hAnsi="DFKai-SB" w:eastAsia="DFKai-SB" w:cs="DFKai-SB"/>
+          <w:b w:val="0"/>
+          <w:i/>
+          <w:color w:val="19352D"/>
+          <w:sz w:val="22"/>
+        </w:rPr>
+        <w:t>阿美族語戲劇對語言傳承與保護策略之初探</w:t>
+      </w:r>
+      <w:r>
+        <w:rPr>
+          <w:rFonts w:ascii="DFKai-SB" w:hAnsi="DFKai-SB" w:eastAsia="DFKai-SB" w:cs="DFKai-SB"/>
+          <w:b w:val="0"/>
+          <w:i w:val="0"/>
+          <w:color w:val="19352D"/>
+          <w:sz w:val="22"/>
+        </w:rPr>
+        <w:t>（無日期）。［學位論文］。臺灣博碩士論文知識加值系統。</w:t>
+      </w:r>
+      <w:hyperlink r:id="rId51">
+        <w:r>
+          <w:rPr>
+            <w:rFonts w:ascii="DFKai-SB" w:hAnsi="DFKai-SB" w:eastAsia="DFKai-SB" w:cs="DFKai-SB"/>
+            <w:color w:val="0563C1"/>
+            <w:u w:val="single"/>
+            <w:sz w:val="22"/>
+          </w:rPr>
+          <w:t>https://hdl.handle.net/11296/866qf4</w:t>
+        </w:r>
+      </w:hyperlink>
+    </w:p>
+    <w:p>
+      <w:pPr>
+        <w:widowControl/>
+        <w:spacing w:line="480" w:lineRule="auto" w:after="0"/>
+        <w:ind w:left="720" w:hanging="720"/>
+        <w:jc w:val="left"/>
+      </w:pPr>
+      <w:r>
+        <w:rPr>
+          <w:rFonts w:ascii="DFKai-SB" w:hAnsi="DFKai-SB" w:eastAsia="DFKai-SB" w:cs="DFKai-SB"/>
+          <w:b w:val="0"/>
+          <w:i w:val="0"/>
+          <w:color w:val="19352D"/>
+          <w:sz w:val="22"/>
+        </w:rPr>
+        <w:t>陳誼誠（2017）。</w:t>
+      </w:r>
+      <w:r>
+        <w:rPr>
+          <w:rFonts w:ascii="DFKai-SB" w:hAnsi="DFKai-SB" w:eastAsia="DFKai-SB" w:cs="DFKai-SB"/>
+          <w:b w:val="0"/>
+          <w:i/>
+          <w:color w:val="19352D"/>
+          <w:sz w:val="22"/>
+        </w:rPr>
+        <w:t>《阿美族語的語言活力》［博士論文，國立政治大學］。</w:t>
+      </w:r>
+      <w:hyperlink r:id="rId52">
+        <w:r>
+          <w:rPr>
+            <w:rFonts w:ascii="DFKai-SB" w:hAnsi="DFKai-SB" w:eastAsia="DFKai-SB" w:cs="DFKai-SB"/>
+            <w:color w:val="0563C1"/>
+            <w:u w:val="single"/>
+            <w:sz w:val="22"/>
+          </w:rPr>
+          <w:t>https://hdl.handle.net/11296/z7y53e</w:t>
+        </w:r>
+      </w:hyperlink>
+    </w:p>
+    <w:p>
+      <w:pPr>
+        <w:widowControl/>
+        <w:spacing w:line="480" w:lineRule="auto" w:after="0"/>
+        <w:ind w:left="720" w:hanging="720"/>
+        <w:jc w:val="left"/>
+      </w:pPr>
+      <w:r>
+        <w:rPr>
+          <w:rFonts w:ascii="DFKai-SB" w:hAnsi="DFKai-SB" w:eastAsia="DFKai-SB" w:cs="DFKai-SB"/>
+          <w:b w:val="0"/>
+          <w:i w:val="0"/>
+          <w:color w:val="19352D"/>
+          <w:sz w:val="22"/>
+        </w:rPr>
+      </w:r>
+      <w:r>
+        <w:rPr>
+          <w:rFonts w:ascii="DFKai-SB" w:hAnsi="DFKai-SB" w:eastAsia="DFKai-SB" w:cs="DFKai-SB"/>
+          <w:b w:val="0"/>
+          <w:i/>
+          <w:color w:val="19352D"/>
+          <w:sz w:val="22"/>
+        </w:rPr>
+        <w:t>阿美語語言轉移與語言減退 —以花蓮縣豐濱鄉靜浦部落為例—</w:t>
+      </w:r>
+      <w:r>
+        <w:rPr>
+          <w:rFonts w:ascii="DFKai-SB" w:hAnsi="DFKai-SB" w:eastAsia="DFKai-SB" w:cs="DFKai-SB"/>
+          <w:b w:val="0"/>
+          <w:i w:val="0"/>
+          <w:color w:val="19352D"/>
+          <w:sz w:val="22"/>
+        </w:rPr>
+        <w:t>（無日期）。［學位論文］。臺灣博碩士論文知識加值系統。</w:t>
+      </w:r>
+      <w:hyperlink r:id="rId53">
+        <w:r>
+          <w:rPr>
+            <w:rFonts w:ascii="DFKai-SB" w:hAnsi="DFKai-SB" w:eastAsia="DFKai-SB" w:cs="DFKai-SB"/>
+            <w:color w:val="0563C1"/>
+            <w:u w:val="single"/>
+            <w:sz w:val="22"/>
+          </w:rPr>
+          <w:t>https://hdl.handle.net/11296/z2553h</w:t>
+        </w:r>
+      </w:hyperlink>
+    </w:p>
+    <w:p/>
+    <w:p>
+      <w:pPr>
+        <w:keepNext/>
+        <w:spacing w:before="200" w:after="160"/>
+      </w:pPr>
+      <w:r>
+        <w:rPr>
+          <w:rFonts w:ascii="DFKai-SB" w:hAnsi="DFKai-SB" w:eastAsia="DFKai-SB" w:cs="DFKai-SB"/>
+          <w:b/>
+          <w:i w:val="0"/>
+          <w:color w:val="D7653E"/>
+          <w:sz w:val="26"/>
+        </w:rPr>
+        <w:t>英文書籍及章節</w:t>
+      </w:r>
+    </w:p>
+    <w:p>
+      <w:pPr>
+        <w:widowControl/>
+        <w:spacing w:line="480" w:lineRule="auto" w:after="0"/>
+        <w:ind w:left="720" w:hanging="720"/>
+        <w:jc w:val="left"/>
+      </w:pPr>
+      <w:r>
+        <w:rPr>
+          <w:rFonts w:ascii="DFKai-SB" w:hAnsi="DFKai-SB" w:eastAsia="DFKai-SB" w:cs="DFKai-SB"/>
+          <w:b w:val="0"/>
+          <w:i w:val="0"/>
+          <w:color w:val="19352D"/>
+          <w:sz w:val="22"/>
+        </w:rPr>
+        <w:t xml:space="preserve">Britain, D., &amp; Matsumoto, K. (2005). Language, communities, networks and practices. In M. J. Ball (Ed.), </w:t>
+      </w:r>
+      <w:r>
+        <w:rPr>
+          <w:rFonts w:ascii="DFKai-SB" w:hAnsi="DFKai-SB" w:eastAsia="DFKai-SB" w:cs="DFKai-SB"/>
+          <w:b w:val="0"/>
+          <w:i/>
+          <w:color w:val="19352D"/>
+          <w:sz w:val="22"/>
+        </w:rPr>
+        <w:t>Clinical sociolinguistics</w:t>
+      </w:r>
+      <w:r>
+        <w:rPr>
+          <w:rFonts w:ascii="DFKai-SB" w:hAnsi="DFKai-SB" w:eastAsia="DFKai-SB" w:cs="DFKai-SB"/>
+          <w:b w:val="0"/>
+          <w:i w:val="0"/>
+          <w:color w:val="19352D"/>
+          <w:sz w:val="22"/>
+        </w:rPr>
+        <w:t xml:space="preserve"> (pp. 1–14). Blackwell Publishing. </w:t>
+      </w:r>
+      <w:hyperlink r:id="rId54">
+        <w:r>
+          <w:rPr>
+            <w:rFonts w:ascii="DFKai-SB" w:hAnsi="DFKai-SB" w:eastAsia="DFKai-SB" w:cs="DFKai-SB"/>
+            <w:color w:val="0563C1"/>
+            <w:u w:val="single"/>
+            <w:sz w:val="22"/>
+          </w:rPr>
+          <w:t>https://doi.org/10.1002/9780470754856.ch1</w:t>
+        </w:r>
+      </w:hyperlink>
+    </w:p>
+    <w:p>
+      <w:pPr>
+        <w:widowControl/>
+        <w:spacing w:line="480" w:lineRule="auto" w:after="0"/>
+        <w:ind w:left="720" w:hanging="720"/>
+        <w:jc w:val="left"/>
+      </w:pPr>
+      <w:r>
+        <w:rPr>
+          <w:rFonts w:ascii="DFKai-SB" w:hAnsi="DFKai-SB" w:eastAsia="DFKai-SB" w:cs="DFKai-SB"/>
+          <w:b w:val="0"/>
+          <w:i w:val="0"/>
+          <w:color w:val="19352D"/>
+          <w:sz w:val="22"/>
+        </w:rPr>
+        <w:t xml:space="preserve">Clopper, C. G., &amp; Pisoni, D. B. (2005). Speech perception, hearing impairment and linguistic variation. In M. J. Ball (Ed.), </w:t>
+      </w:r>
+      <w:r>
+        <w:rPr>
+          <w:rFonts w:ascii="DFKai-SB" w:hAnsi="DFKai-SB" w:eastAsia="DFKai-SB" w:cs="DFKai-SB"/>
+          <w:b w:val="0"/>
+          <w:i/>
+          <w:color w:val="19352D"/>
+          <w:sz w:val="22"/>
+        </w:rPr>
+        <w:t>Clinical sociolinguistics</w:t>
+      </w:r>
+      <w:r>
+        <w:rPr>
+          <w:rFonts w:ascii="DFKai-SB" w:hAnsi="DFKai-SB" w:eastAsia="DFKai-SB" w:cs="DFKai-SB"/>
+          <w:b w:val="0"/>
+          <w:i w:val="0"/>
+          <w:color w:val="19352D"/>
+          <w:sz w:val="22"/>
+        </w:rPr>
+        <w:t xml:space="preserve"> (pp. 207–218). Blackwell Publishing. </w:t>
+      </w:r>
+      <w:hyperlink r:id="rId55">
+        <w:r>
+          <w:rPr>
+            <w:rFonts w:ascii="DFKai-SB" w:hAnsi="DFKai-SB" w:eastAsia="DFKai-SB" w:cs="DFKai-SB"/>
+            <w:color w:val="0563C1"/>
+            <w:u w:val="single"/>
+            <w:sz w:val="22"/>
+          </w:rPr>
+          <w:t>https://doi.org/10.1002/9780470754856.ch16</w:t>
+        </w:r>
+      </w:hyperlink>
+    </w:p>
+    <w:p>
+      <w:pPr>
+        <w:widowControl/>
+        <w:spacing w:line="480" w:lineRule="auto" w:after="0"/>
+        <w:ind w:left="720" w:hanging="720"/>
+        <w:jc w:val="left"/>
+      </w:pPr>
+      <w:r>
+        <w:rPr>
+          <w:rFonts w:ascii="DFKai-SB" w:hAnsi="DFKai-SB" w:eastAsia="DFKai-SB" w:cs="DFKai-SB"/>
+          <w:b w:val="0"/>
+          <w:i w:val="0"/>
+          <w:color w:val="19352D"/>
+          <w:sz w:val="22"/>
+        </w:rPr>
+        <w:t xml:space="preserve">Damico, J. S., Nelson, R. L., &amp; Bryan, L. (2005). Literacy as a sociolinguistic process for clinical purposes. In M. J. Ball (Ed.), </w:t>
+      </w:r>
+      <w:r>
+        <w:rPr>
+          <w:rFonts w:ascii="DFKai-SB" w:hAnsi="DFKai-SB" w:eastAsia="DFKai-SB" w:cs="DFKai-SB"/>
+          <w:b w:val="0"/>
+          <w:i/>
+          <w:color w:val="19352D"/>
+          <w:sz w:val="22"/>
+        </w:rPr>
+        <w:t>Clinical sociolinguistics</w:t>
+      </w:r>
+      <w:r>
+        <w:rPr>
+          <w:rFonts w:ascii="DFKai-SB" w:hAnsi="DFKai-SB" w:eastAsia="DFKai-SB" w:cs="DFKai-SB"/>
+          <w:b w:val="0"/>
+          <w:i w:val="0"/>
+          <w:color w:val="19352D"/>
+          <w:sz w:val="22"/>
+        </w:rPr>
+        <w:t xml:space="preserve"> (pp. 242–249). Blackwell Publishing. </w:t>
+      </w:r>
+      <w:hyperlink r:id="rId56">
+        <w:r>
+          <w:rPr>
+            <w:rFonts w:ascii="DFKai-SB" w:hAnsi="DFKai-SB" w:eastAsia="DFKai-SB" w:cs="DFKai-SB"/>
+            <w:color w:val="0563C1"/>
+            <w:u w:val="single"/>
+            <w:sz w:val="22"/>
+          </w:rPr>
+          <w:t>https://doi.org/10.1002/9780470754856.ch19</w:t>
+        </w:r>
+      </w:hyperlink>
+    </w:p>
+    <w:p>
+      <w:pPr>
+        <w:widowControl/>
+        <w:spacing w:line="480" w:lineRule="auto" w:after="0"/>
+        <w:ind w:left="720" w:hanging="720"/>
+        <w:jc w:val="left"/>
+      </w:pPr>
+      <w:r>
+        <w:rPr>
+          <w:rFonts w:ascii="DFKai-SB" w:hAnsi="DFKai-SB" w:eastAsia="DFKai-SB" w:cs="DFKai-SB"/>
+          <w:b w:val="0"/>
+          <w:i w:val="0"/>
+          <w:color w:val="19352D"/>
+          <w:sz w:val="22"/>
+        </w:rPr>
+        <w:t xml:space="preserve">Damico, J. S., Simmons-Mackie, N., &amp; Hawley, H. (2005). Language and power. In M. J. Ball (Ed.), </w:t>
+      </w:r>
+      <w:r>
+        <w:rPr>
+          <w:rFonts w:ascii="DFKai-SB" w:hAnsi="DFKai-SB" w:eastAsia="DFKai-SB" w:cs="DFKai-SB"/>
+          <w:b w:val="0"/>
+          <w:i/>
+          <w:color w:val="19352D"/>
+          <w:sz w:val="22"/>
+        </w:rPr>
+        <w:t>Clinical sociolinguistics</w:t>
+      </w:r>
+      <w:r>
+        <w:rPr>
+          <w:rFonts w:ascii="DFKai-SB" w:hAnsi="DFKai-SB" w:eastAsia="DFKai-SB" w:cs="DFKai-SB"/>
+          <w:b w:val="0"/>
+          <w:i w:val="0"/>
+          <w:color w:val="19352D"/>
+          <w:sz w:val="22"/>
+        </w:rPr>
+        <w:t xml:space="preserve"> (pp. 63–73). Blackwell Publishing. </w:t>
+      </w:r>
+      <w:hyperlink r:id="rId57">
+        <w:r>
+          <w:rPr>
+            <w:rFonts w:ascii="DFKai-SB" w:hAnsi="DFKai-SB" w:eastAsia="DFKai-SB" w:cs="DFKai-SB"/>
+            <w:color w:val="0563C1"/>
+            <w:u w:val="single"/>
+            <w:sz w:val="22"/>
+          </w:rPr>
+          <w:t>https://doi.org/10.1002/9780470754856.ch6</w:t>
+        </w:r>
+      </w:hyperlink>
+    </w:p>
+    <w:p>
+      <w:pPr>
+        <w:widowControl/>
+        <w:spacing w:line="480" w:lineRule="auto" w:after="0"/>
+        <w:ind w:left="720" w:hanging="720"/>
+        <w:jc w:val="left"/>
+      </w:pPr>
+      <w:r>
+        <w:rPr>
+          <w:rFonts w:ascii="DFKai-SB" w:hAnsi="DFKai-SB" w:eastAsia="DFKai-SB" w:cs="DFKai-SB"/>
+          <w:b w:val="0"/>
+          <w:i w:val="0"/>
+          <w:color w:val="19352D"/>
+          <w:sz w:val="22"/>
+        </w:rPr>
+        <w:t xml:space="preserve">Edwards, J. (2005). Bilingualism and multilingualism. In M. J. Ball (Ed.), </w:t>
+      </w:r>
+      <w:r>
+        <w:rPr>
+          <w:rFonts w:ascii="DFKai-SB" w:hAnsi="DFKai-SB" w:eastAsia="DFKai-SB" w:cs="DFKai-SB"/>
+          <w:b w:val="0"/>
+          <w:i/>
+          <w:color w:val="19352D"/>
+          <w:sz w:val="22"/>
+        </w:rPr>
+        <w:t>Clinical sociolinguistics</w:t>
+      </w:r>
+      <w:r>
+        <w:rPr>
+          <w:rFonts w:ascii="DFKai-SB" w:hAnsi="DFKai-SB" w:eastAsia="DFKai-SB" w:cs="DFKai-SB"/>
+          <w:b w:val="0"/>
+          <w:i w:val="0"/>
+          <w:color w:val="19352D"/>
+          <w:sz w:val="22"/>
+        </w:rPr>
+        <w:t xml:space="preserve"> (pp. 36–48). Blackwell Publishing. </w:t>
+      </w:r>
+      <w:hyperlink r:id="rId58">
+        <w:r>
+          <w:rPr>
+            <w:rFonts w:ascii="DFKai-SB" w:hAnsi="DFKai-SB" w:eastAsia="DFKai-SB" w:cs="DFKai-SB"/>
+            <w:color w:val="0563C1"/>
+            <w:u w:val="single"/>
+            <w:sz w:val="22"/>
+          </w:rPr>
+          <w:t>https://doi.org/10.1002/9780470754856.ch4</w:t>
+        </w:r>
+      </w:hyperlink>
+    </w:p>
+    <w:p>
+      <w:pPr>
+        <w:widowControl/>
+        <w:spacing w:line="480" w:lineRule="auto" w:after="0"/>
+        <w:ind w:left="720" w:hanging="720"/>
+        <w:jc w:val="left"/>
+      </w:pPr>
+      <w:r>
+        <w:rPr>
+          <w:rFonts w:ascii="DFKai-SB" w:hAnsi="DFKai-SB" w:eastAsia="DFKai-SB" w:cs="DFKai-SB"/>
+          <w:b w:val="0"/>
+          <w:i w:val="0"/>
+          <w:color w:val="19352D"/>
+          <w:sz w:val="22"/>
+        </w:rPr>
+        <w:t xml:space="preserve">Gitterman, M. R. (2005). Aphasia in multilingual populations. In M. J. Ball (Ed.), </w:t>
+      </w:r>
+      <w:r>
+        <w:rPr>
+          <w:rFonts w:ascii="DFKai-SB" w:hAnsi="DFKai-SB" w:eastAsia="DFKai-SB" w:cs="DFKai-SB"/>
+          <w:b w:val="0"/>
+          <w:i/>
+          <w:color w:val="19352D"/>
+          <w:sz w:val="22"/>
+        </w:rPr>
+        <w:t>Clinical sociolinguistics</w:t>
+      </w:r>
+      <w:r>
+        <w:rPr>
+          <w:rFonts w:ascii="DFKai-SB" w:hAnsi="DFKai-SB" w:eastAsia="DFKai-SB" w:cs="DFKai-SB"/>
+          <w:b w:val="0"/>
+          <w:i w:val="0"/>
+          <w:color w:val="19352D"/>
+          <w:sz w:val="22"/>
+        </w:rPr>
+        <w:t xml:space="preserve"> (pp. 219–229). Blackwell Publishing. </w:t>
+      </w:r>
+      <w:hyperlink r:id="rId59">
+        <w:r>
+          <w:rPr>
+            <w:rFonts w:ascii="DFKai-SB" w:hAnsi="DFKai-SB" w:eastAsia="DFKai-SB" w:cs="DFKai-SB"/>
+            <w:color w:val="0563C1"/>
+            <w:u w:val="single"/>
+            <w:sz w:val="22"/>
+          </w:rPr>
+          <w:t>https://doi.org/10.1002/9780470754856.ch17</w:t>
+        </w:r>
+      </w:hyperlink>
+    </w:p>
+    <w:p>
+      <w:pPr>
+        <w:widowControl/>
+        <w:spacing w:line="480" w:lineRule="auto" w:after="0"/>
+        <w:ind w:left="720" w:hanging="720"/>
+        <w:jc w:val="left"/>
+      </w:pPr>
+      <w:r>
+        <w:rPr>
+          <w:rFonts w:ascii="DFKai-SB" w:hAnsi="DFKai-SB" w:eastAsia="DFKai-SB" w:cs="DFKai-SB"/>
+          <w:b w:val="0"/>
+          <w:i w:val="0"/>
+          <w:color w:val="19352D"/>
+          <w:sz w:val="22"/>
+        </w:rPr>
+        <w:t xml:space="preserve">Guendouzi, J. (2005). Language and gender. In M. J. Ball (Ed.), </w:t>
+      </w:r>
+      <w:r>
+        <w:rPr>
+          <w:rFonts w:ascii="DFKai-SB" w:hAnsi="DFKai-SB" w:eastAsia="DFKai-SB" w:cs="DFKai-SB"/>
+          <w:b w:val="0"/>
+          <w:i/>
+          <w:color w:val="19352D"/>
+          <w:sz w:val="22"/>
+        </w:rPr>
+        <w:t>Clinical sociolinguistics</w:t>
+      </w:r>
+      <w:r>
+        <w:rPr>
+          <w:rFonts w:ascii="DFKai-SB" w:hAnsi="DFKai-SB" w:eastAsia="DFKai-SB" w:cs="DFKai-SB"/>
+          <w:b w:val="0"/>
+          <w:i w:val="0"/>
+          <w:color w:val="19352D"/>
+          <w:sz w:val="22"/>
+        </w:rPr>
+        <w:t xml:space="preserve"> (pp. 26–35). Blackwell Publishing. </w:t>
+      </w:r>
+      <w:hyperlink r:id="rId60">
+        <w:r>
+          <w:rPr>
+            <w:rFonts w:ascii="DFKai-SB" w:hAnsi="DFKai-SB" w:eastAsia="DFKai-SB" w:cs="DFKai-SB"/>
+            <w:color w:val="0563C1"/>
+            <w:u w:val="single"/>
+            <w:sz w:val="22"/>
+          </w:rPr>
+          <w:t>https://doi.org/10.1002/9780470754856.ch3</w:t>
+        </w:r>
+      </w:hyperlink>
+    </w:p>
+    <w:p>
+      <w:pPr>
+        <w:widowControl/>
+        <w:spacing w:line="480" w:lineRule="auto" w:after="0"/>
+        <w:ind w:left="720" w:hanging="720"/>
+        <w:jc w:val="left"/>
+      </w:pPr>
+      <w:r>
+        <w:rPr>
+          <w:rFonts w:ascii="DFKai-SB" w:hAnsi="DFKai-SB" w:eastAsia="DFKai-SB" w:cs="DFKai-SB"/>
+          <w:b w:val="0"/>
+          <w:i w:val="0"/>
+          <w:color w:val="19352D"/>
+          <w:sz w:val="22"/>
+        </w:rPr>
+        <w:t xml:space="preserve">Hua, Z., &amp; Wei, L. (2005). Bi- and multilingual language acquisition. In M. J. Ball (Ed.), </w:t>
+      </w:r>
+      <w:r>
+        <w:rPr>
+          <w:rFonts w:ascii="DFKai-SB" w:hAnsi="DFKai-SB" w:eastAsia="DFKai-SB" w:cs="DFKai-SB"/>
+          <w:b w:val="0"/>
+          <w:i/>
+          <w:color w:val="19352D"/>
+          <w:sz w:val="22"/>
+        </w:rPr>
+        <w:t>Clinical sociolinguistics</w:t>
+      </w:r>
+      <w:r>
+        <w:rPr>
+          <w:rFonts w:ascii="DFKai-SB" w:hAnsi="DFKai-SB" w:eastAsia="DFKai-SB" w:cs="DFKai-SB"/>
+          <w:b w:val="0"/>
+          <w:i w:val="0"/>
+          <w:color w:val="19352D"/>
+          <w:sz w:val="22"/>
+        </w:rPr>
+        <w:t xml:space="preserve"> (pp. 165–179). Blackwell Publishing. </w:t>
+      </w:r>
+      <w:hyperlink r:id="rId61">
+        <w:r>
+          <w:rPr>
+            <w:rFonts w:ascii="DFKai-SB" w:hAnsi="DFKai-SB" w:eastAsia="DFKai-SB" w:cs="DFKai-SB"/>
+            <w:color w:val="0563C1"/>
+            <w:u w:val="single"/>
+            <w:sz w:val="22"/>
+          </w:rPr>
+          <w:t>https://doi.org/10.1002/9780470754856.ch13</w:t>
+        </w:r>
+      </w:hyperlink>
+    </w:p>
+    <w:p>
+      <w:pPr>
+        <w:widowControl/>
+        <w:spacing w:line="480" w:lineRule="auto" w:after="0"/>
+        <w:ind w:left="720" w:hanging="720"/>
+        <w:jc w:val="left"/>
+      </w:pPr>
+      <w:r>
+        <w:rPr>
+          <w:rFonts w:ascii="DFKai-SB" w:hAnsi="DFKai-SB" w:eastAsia="DFKai-SB" w:cs="DFKai-SB"/>
+          <w:b w:val="0"/>
+          <w:i w:val="0"/>
+          <w:color w:val="19352D"/>
+          <w:sz w:val="22"/>
+        </w:rPr>
+        <w:t xml:space="preserve">Isaac, K. M. (2005). Managing linguistic diversity in the clinic: Interpreters in speech-language pathology. In M. J. Ball (Ed.), </w:t>
+      </w:r>
+      <w:r>
+        <w:rPr>
+          <w:rFonts w:ascii="DFKai-SB" w:hAnsi="DFKai-SB" w:eastAsia="DFKai-SB" w:cs="DFKai-SB"/>
+          <w:b w:val="0"/>
+          <w:i/>
+          <w:color w:val="19352D"/>
+          <w:sz w:val="22"/>
+        </w:rPr>
+        <w:t>Clinical sociolinguistics</w:t>
+      </w:r>
+      <w:r>
+        <w:rPr>
+          <w:rFonts w:ascii="DFKai-SB" w:hAnsi="DFKai-SB" w:eastAsia="DFKai-SB" w:cs="DFKai-SB"/>
+          <w:b w:val="0"/>
+          <w:i w:val="0"/>
+          <w:color w:val="19352D"/>
+          <w:sz w:val="22"/>
+        </w:rPr>
+        <w:t xml:space="preserve"> (pp. 265–280). Blackwell Publishing. </w:t>
+      </w:r>
+      <w:hyperlink r:id="rId62">
+        <w:r>
+          <w:rPr>
+            <w:rFonts w:ascii="DFKai-SB" w:hAnsi="DFKai-SB" w:eastAsia="DFKai-SB" w:cs="DFKai-SB"/>
+            <w:color w:val="0563C1"/>
+            <w:u w:val="single"/>
+            <w:sz w:val="22"/>
+          </w:rPr>
+          <w:t>https://doi.org/10.1002/9780470754856.ch21</w:t>
+        </w:r>
+      </w:hyperlink>
+    </w:p>
+    <w:p>
+      <w:pPr>
+        <w:widowControl/>
+        <w:spacing w:line="480" w:lineRule="auto" w:after="0"/>
+        <w:ind w:left="720" w:hanging="720"/>
+        <w:jc w:val="left"/>
+      </w:pPr>
+      <w:r>
+        <w:rPr>
+          <w:rFonts w:ascii="DFKai-SB" w:hAnsi="DFKai-SB" w:eastAsia="DFKai-SB" w:cs="DFKai-SB"/>
+          <w:b w:val="0"/>
+          <w:i w:val="0"/>
+          <w:color w:val="19352D"/>
+          <w:sz w:val="22"/>
+        </w:rPr>
+        <w:t xml:space="preserve">Lucas, C., Bayley, R., &amp; Kelly, A. B. (2005). The sociolinguistics of sign languages. In M. J. Ball (Ed.), </w:t>
+      </w:r>
+      <w:r>
+        <w:rPr>
+          <w:rFonts w:ascii="DFKai-SB" w:hAnsi="DFKai-SB" w:eastAsia="DFKai-SB" w:cs="DFKai-SB"/>
+          <w:b w:val="0"/>
+          <w:i/>
+          <w:color w:val="19352D"/>
+          <w:sz w:val="22"/>
+        </w:rPr>
+        <w:t>Clinical sociolinguistics</w:t>
+      </w:r>
+      <w:r>
+        <w:rPr>
+          <w:rFonts w:ascii="DFKai-SB" w:hAnsi="DFKai-SB" w:eastAsia="DFKai-SB" w:cs="DFKai-SB"/>
+          <w:b w:val="0"/>
+          <w:i w:val="0"/>
+          <w:color w:val="19352D"/>
+          <w:sz w:val="22"/>
+        </w:rPr>
+        <w:t xml:space="preserve"> (pp. 250–264). Blackwell Publishing. </w:t>
+      </w:r>
+      <w:hyperlink r:id="rId63">
+        <w:r>
+          <w:rPr>
+            <w:rFonts w:ascii="DFKai-SB" w:hAnsi="DFKai-SB" w:eastAsia="DFKai-SB" w:cs="DFKai-SB"/>
+            <w:color w:val="0563C1"/>
+            <w:u w:val="single"/>
+            <w:sz w:val="22"/>
+          </w:rPr>
+          <w:t>https://doi.org/10.1002/9780470754856.ch20</w:t>
+        </w:r>
+      </w:hyperlink>
+    </w:p>
+    <w:p>
+      <w:pPr>
+        <w:widowControl/>
+        <w:spacing w:line="480" w:lineRule="auto" w:after="0"/>
+        <w:ind w:left="720" w:hanging="720"/>
+        <w:jc w:val="left"/>
+      </w:pPr>
+      <w:r>
+        <w:rPr>
+          <w:rFonts w:ascii="DFKai-SB" w:hAnsi="DFKai-SB" w:eastAsia="DFKai-SB" w:cs="DFKai-SB"/>
+          <w:b w:val="0"/>
+          <w:i w:val="0"/>
+          <w:color w:val="19352D"/>
+          <w:sz w:val="22"/>
+        </w:rPr>
+        <w:t xml:space="preserve">Maclagan, M. (2005). Regional and social variation. In M. J. Ball (Ed.), </w:t>
+      </w:r>
+      <w:r>
+        <w:rPr>
+          <w:rFonts w:ascii="DFKai-SB" w:hAnsi="DFKai-SB" w:eastAsia="DFKai-SB" w:cs="DFKai-SB"/>
+          <w:b w:val="0"/>
+          <w:i/>
+          <w:color w:val="19352D"/>
+          <w:sz w:val="22"/>
+        </w:rPr>
+        <w:t>Clinical sociolinguistics</w:t>
+      </w:r>
+      <w:r>
+        <w:rPr>
+          <w:rFonts w:ascii="DFKai-SB" w:hAnsi="DFKai-SB" w:eastAsia="DFKai-SB" w:cs="DFKai-SB"/>
+          <w:b w:val="0"/>
+          <w:i w:val="0"/>
+          <w:color w:val="19352D"/>
+          <w:sz w:val="22"/>
+        </w:rPr>
+        <w:t xml:space="preserve"> (pp. 15–25). Blackwell Publishing. </w:t>
+      </w:r>
+      <w:hyperlink r:id="rId64">
+        <w:r>
+          <w:rPr>
+            <w:rFonts w:ascii="DFKai-SB" w:hAnsi="DFKai-SB" w:eastAsia="DFKai-SB" w:cs="DFKai-SB"/>
+            <w:color w:val="0563C1"/>
+            <w:u w:val="single"/>
+            <w:sz w:val="22"/>
+          </w:rPr>
+          <w:t>https://doi.org/10.1002/9780470754856.ch2</w:t>
+        </w:r>
+      </w:hyperlink>
+    </w:p>
+    <w:p>
+      <w:pPr>
+        <w:widowControl/>
+        <w:spacing w:line="480" w:lineRule="auto" w:after="0"/>
+        <w:ind w:left="720" w:hanging="720"/>
+        <w:jc w:val="left"/>
+      </w:pPr>
+      <w:r>
+        <w:rPr>
+          <w:rFonts w:ascii="DFKai-SB" w:hAnsi="DFKai-SB" w:eastAsia="DFKai-SB" w:cs="DFKai-SB"/>
+          <w:b w:val="0"/>
+          <w:i w:val="0"/>
+          <w:color w:val="19352D"/>
+          <w:sz w:val="22"/>
+        </w:rPr>
+        <w:t xml:space="preserve">Müller, N., &amp; Ball, M. J. (2005). Code-switching and diglossia. In M. J. Ball (Ed.), </w:t>
+      </w:r>
+      <w:r>
+        <w:rPr>
+          <w:rFonts w:ascii="DFKai-SB" w:hAnsi="DFKai-SB" w:eastAsia="DFKai-SB" w:cs="DFKai-SB"/>
+          <w:b w:val="0"/>
+          <w:i/>
+          <w:color w:val="19352D"/>
+          <w:sz w:val="22"/>
+        </w:rPr>
+        <w:t>Clinical sociolinguistics</w:t>
+      </w:r>
+      <w:r>
+        <w:rPr>
+          <w:rFonts w:ascii="DFKai-SB" w:hAnsi="DFKai-SB" w:eastAsia="DFKai-SB" w:cs="DFKai-SB"/>
+          <w:b w:val="0"/>
+          <w:i w:val="0"/>
+          <w:color w:val="19352D"/>
+          <w:sz w:val="22"/>
+        </w:rPr>
+        <w:t xml:space="preserve"> (pp. 49–62). Blackwell Publishing. </w:t>
+      </w:r>
+      <w:hyperlink r:id="rId65">
+        <w:r>
+          <w:rPr>
+            <w:rFonts w:ascii="DFKai-SB" w:hAnsi="DFKai-SB" w:eastAsia="DFKai-SB" w:cs="DFKai-SB"/>
+            <w:color w:val="0563C1"/>
+            <w:u w:val="single"/>
+            <w:sz w:val="22"/>
+          </w:rPr>
+          <w:t>https://doi.org/10.1002/9780470754856.ch5</w:t>
+        </w:r>
+      </w:hyperlink>
+    </w:p>
+    <w:p>
+      <w:pPr>
+        <w:widowControl/>
+        <w:spacing w:line="480" w:lineRule="auto" w:after="0"/>
+        <w:ind w:left="720" w:hanging="720"/>
+        <w:jc w:val="left"/>
+      </w:pPr>
+      <w:r>
+        <w:rPr>
+          <w:rFonts w:ascii="DFKai-SB" w:hAnsi="DFKai-SB" w:eastAsia="DFKai-SB" w:cs="DFKai-SB"/>
+          <w:b w:val="0"/>
+          <w:i w:val="0"/>
+          <w:color w:val="19352D"/>
+          <w:sz w:val="22"/>
+        </w:rPr>
+        <w:t xml:space="preserve">Oetting, J. B. (2005). Assessing language in children who speak a nonmainstream dialect of English. In M. J. Ball (Ed.), </w:t>
+      </w:r>
+      <w:r>
+        <w:rPr>
+          <w:rFonts w:ascii="DFKai-SB" w:hAnsi="DFKai-SB" w:eastAsia="DFKai-SB" w:cs="DFKai-SB"/>
+          <w:b w:val="0"/>
+          <w:i/>
+          <w:color w:val="19352D"/>
+          <w:sz w:val="22"/>
+        </w:rPr>
+        <w:t>Clinical sociolinguistics</w:t>
+      </w:r>
+      <w:r>
+        <w:rPr>
+          <w:rFonts w:ascii="DFKai-SB" w:hAnsi="DFKai-SB" w:eastAsia="DFKai-SB" w:cs="DFKai-SB"/>
+          <w:b w:val="0"/>
+          <w:i w:val="0"/>
+          <w:color w:val="19352D"/>
+          <w:sz w:val="22"/>
+        </w:rPr>
+        <w:t xml:space="preserve"> (pp. 180–192). Blackwell Publishing. </w:t>
+      </w:r>
+      <w:hyperlink r:id="rId66">
+        <w:r>
+          <w:rPr>
+            <w:rFonts w:ascii="DFKai-SB" w:hAnsi="DFKai-SB" w:eastAsia="DFKai-SB" w:cs="DFKai-SB"/>
+            <w:color w:val="0563C1"/>
+            <w:u w:val="single"/>
+            <w:sz w:val="22"/>
+          </w:rPr>
+          <w:t>https://doi.org/10.1002/9780470754856.ch14</w:t>
+        </w:r>
+      </w:hyperlink>
+    </w:p>
+    <w:p>
+      <w:pPr>
+        <w:widowControl/>
+        <w:spacing w:line="480" w:lineRule="auto" w:after="0"/>
+        <w:ind w:left="720" w:hanging="720"/>
+        <w:jc w:val="left"/>
+      </w:pPr>
+      <w:r>
+        <w:rPr>
+          <w:rFonts w:ascii="DFKai-SB" w:hAnsi="DFKai-SB" w:eastAsia="DFKai-SB" w:cs="DFKai-SB"/>
+          <w:b w:val="0"/>
+          <w:i w:val="0"/>
+          <w:color w:val="19352D"/>
+          <w:sz w:val="22"/>
+        </w:rPr>
+        <w:t xml:space="preserve">Patterson, J. L., &amp; Rodríguez, B. L. (2005). Designing assessments for multilingual children. In M. J. Ball (Ed.), </w:t>
+      </w:r>
+      <w:r>
+        <w:rPr>
+          <w:rFonts w:ascii="DFKai-SB" w:hAnsi="DFKai-SB" w:eastAsia="DFKai-SB" w:cs="DFKai-SB"/>
+          <w:b w:val="0"/>
+          <w:i/>
+          <w:color w:val="19352D"/>
+          <w:sz w:val="22"/>
+        </w:rPr>
+        <w:t>Clinical sociolinguistics</w:t>
+      </w:r>
+      <w:r>
+        <w:rPr>
+          <w:rFonts w:ascii="DFKai-SB" w:hAnsi="DFKai-SB" w:eastAsia="DFKai-SB" w:cs="DFKai-SB"/>
+          <w:b w:val="0"/>
+          <w:i w:val="0"/>
+          <w:color w:val="19352D"/>
+          <w:sz w:val="22"/>
+        </w:rPr>
+        <w:t xml:space="preserve"> (pp. 230–241). Blackwell Publishing. </w:t>
+      </w:r>
+      <w:hyperlink r:id="rId67">
+        <w:r>
+          <w:rPr>
+            <w:rFonts w:ascii="DFKai-SB" w:hAnsi="DFKai-SB" w:eastAsia="DFKai-SB" w:cs="DFKai-SB"/>
+            <w:color w:val="0563C1"/>
+            <w:u w:val="single"/>
+            <w:sz w:val="22"/>
+          </w:rPr>
+          <w:t>https://doi.org/10.1002/9780470754856.ch18</w:t>
+        </w:r>
+      </w:hyperlink>
+    </w:p>
+    <w:p>
+      <w:pPr>
+        <w:widowControl/>
+        <w:spacing w:line="480" w:lineRule="auto" w:after="0"/>
+        <w:ind w:left="720" w:hanging="720"/>
+        <w:jc w:val="left"/>
+      </w:pPr>
+      <w:r>
+        <w:rPr>
+          <w:rFonts w:ascii="DFKai-SB" w:hAnsi="DFKai-SB" w:eastAsia="DFKai-SB" w:cs="DFKai-SB"/>
+          <w:b w:val="0"/>
+          <w:i w:val="0"/>
+          <w:color w:val="19352D"/>
+          <w:sz w:val="22"/>
+        </w:rPr>
+        <w:t xml:space="preserve">Preston, D. R., &amp; Robinson, G. C. (2005). Dialect perception and attitudes to variation. In M. J. Ball (Ed.), </w:t>
+      </w:r>
+      <w:r>
+        <w:rPr>
+          <w:rFonts w:ascii="DFKai-SB" w:hAnsi="DFKai-SB" w:eastAsia="DFKai-SB" w:cs="DFKai-SB"/>
+          <w:b w:val="0"/>
+          <w:i/>
+          <w:color w:val="19352D"/>
+          <w:sz w:val="22"/>
+        </w:rPr>
+        <w:t>Clinical sociolinguistics</w:t>
+      </w:r>
+      <w:r>
+        <w:rPr>
+          <w:rFonts w:ascii="DFKai-SB" w:hAnsi="DFKai-SB" w:eastAsia="DFKai-SB" w:cs="DFKai-SB"/>
+          <w:b w:val="0"/>
+          <w:i w:val="0"/>
+          <w:color w:val="19352D"/>
+          <w:sz w:val="22"/>
+        </w:rPr>
+        <w:t xml:space="preserve"> (pp. 133–149). Blackwell Publishing. </w:t>
+      </w:r>
+      <w:hyperlink r:id="rId68">
+        <w:r>
+          <w:rPr>
+            <w:rFonts w:ascii="DFKai-SB" w:hAnsi="DFKai-SB" w:eastAsia="DFKai-SB" w:cs="DFKai-SB"/>
+            <w:color w:val="0563C1"/>
+            <w:u w:val="single"/>
+            <w:sz w:val="22"/>
+          </w:rPr>
+          <w:t>https://doi.org/10.1002/9780470754856.ch11</w:t>
+        </w:r>
+      </w:hyperlink>
+    </w:p>
+    <w:p>
+      <w:pPr>
+        <w:widowControl/>
+        <w:spacing w:line="480" w:lineRule="auto" w:after="0"/>
+        <w:ind w:left="720" w:hanging="720"/>
+        <w:jc w:val="left"/>
+      </w:pPr>
+      <w:r>
+        <w:rPr>
+          <w:rFonts w:ascii="DFKai-SB" w:hAnsi="DFKai-SB" w:eastAsia="DFKai-SB" w:cs="DFKai-SB"/>
+          <w:b w:val="0"/>
+          <w:i w:val="0"/>
+          <w:color w:val="19352D"/>
+          <w:sz w:val="22"/>
+        </w:rPr>
+        <w:t xml:space="preserve">Roberts, J. (2005). Acquisition of sociolinguistic variation. In M. J. Ball (Ed.), </w:t>
+      </w:r>
+      <w:r>
+        <w:rPr>
+          <w:rFonts w:ascii="DFKai-SB" w:hAnsi="DFKai-SB" w:eastAsia="DFKai-SB" w:cs="DFKai-SB"/>
+          <w:b w:val="0"/>
+          <w:i/>
+          <w:color w:val="19352D"/>
+          <w:sz w:val="22"/>
+        </w:rPr>
+        <w:t>Clinical sociolinguistics</w:t>
+      </w:r>
+      <w:r>
+        <w:rPr>
+          <w:rFonts w:ascii="DFKai-SB" w:hAnsi="DFKai-SB" w:eastAsia="DFKai-SB" w:cs="DFKai-SB"/>
+          <w:b w:val="0"/>
+          <w:i w:val="0"/>
+          <w:color w:val="19352D"/>
+          <w:sz w:val="22"/>
+        </w:rPr>
+        <w:t xml:space="preserve"> (pp. 151–164). Blackwell Publishing. </w:t>
+      </w:r>
+      <w:hyperlink r:id="rId69">
+        <w:r>
+          <w:rPr>
+            <w:rFonts w:ascii="DFKai-SB" w:hAnsi="DFKai-SB" w:eastAsia="DFKai-SB" w:cs="DFKai-SB"/>
+            <w:color w:val="0563C1"/>
+            <w:u w:val="single"/>
+            <w:sz w:val="22"/>
+          </w:rPr>
+          <w:t>https://doi.org/10.1002/9780470754856.ch12</w:t>
+        </w:r>
+      </w:hyperlink>
+    </w:p>
+    <w:p>
+      <w:pPr>
+        <w:widowControl/>
+        <w:spacing w:line="480" w:lineRule="auto" w:after="0"/>
+        <w:ind w:left="720" w:hanging="720"/>
+        <w:jc w:val="left"/>
+      </w:pPr>
+      <w:r>
+        <w:rPr>
+          <w:rFonts w:ascii="DFKai-SB" w:hAnsi="DFKai-SB" w:eastAsia="DFKai-SB" w:cs="DFKai-SB"/>
+          <w:b w:val="0"/>
+          <w:i w:val="0"/>
+          <w:color w:val="19352D"/>
+          <w:sz w:val="22"/>
+        </w:rPr>
+        <w:t xml:space="preserve">Taylor, N., &amp; Mendoza-Denton, N. (2005). Language and culture. In M. J. Ball (Ed.), </w:t>
+      </w:r>
+      <w:r>
+        <w:rPr>
+          <w:rFonts w:ascii="DFKai-SB" w:hAnsi="DFKai-SB" w:eastAsia="DFKai-SB" w:cs="DFKai-SB"/>
+          <w:b w:val="0"/>
+          <w:i/>
+          <w:color w:val="19352D"/>
+          <w:sz w:val="22"/>
+        </w:rPr>
+        <w:t>Clinical sociolinguistics</w:t>
+      </w:r>
+      <w:r>
+        <w:rPr>
+          <w:rFonts w:ascii="DFKai-SB" w:hAnsi="DFKai-SB" w:eastAsia="DFKai-SB" w:cs="DFKai-SB"/>
+          <w:b w:val="0"/>
+          <w:i w:val="0"/>
+          <w:color w:val="19352D"/>
+          <w:sz w:val="22"/>
+        </w:rPr>
+        <w:t xml:space="preserve"> (pp. 74–86). Blackwell Publishing. </w:t>
+      </w:r>
+      <w:hyperlink r:id="rId70">
+        <w:r>
+          <w:rPr>
+            <w:rFonts w:ascii="DFKai-SB" w:hAnsi="DFKai-SB" w:eastAsia="DFKai-SB" w:cs="DFKai-SB"/>
+            <w:color w:val="0563C1"/>
+            <w:u w:val="single"/>
+            <w:sz w:val="22"/>
+          </w:rPr>
+          <w:t>https://doi.org/10.1002/9780470754856.ch7</w:t>
+        </w:r>
+      </w:hyperlink>
+    </w:p>
+    <w:p>
+      <w:pPr>
+        <w:widowControl/>
+        <w:spacing w:line="480" w:lineRule="auto" w:after="0"/>
+        <w:ind w:left="720" w:hanging="720"/>
+        <w:jc w:val="left"/>
+      </w:pPr>
+      <w:r>
+        <w:rPr>
+          <w:rFonts w:ascii="DFKai-SB" w:hAnsi="DFKai-SB" w:eastAsia="DFKai-SB" w:cs="DFKai-SB"/>
+          <w:b w:val="0"/>
+          <w:i w:val="0"/>
+          <w:color w:val="19352D"/>
+          <w:sz w:val="22"/>
+        </w:rPr>
+        <w:t xml:space="preserve">Tonkin, H. (2005). Language planning. In M. J. Ball (Ed.), </w:t>
+      </w:r>
+      <w:r>
+        <w:rPr>
+          <w:rFonts w:ascii="DFKai-SB" w:hAnsi="DFKai-SB" w:eastAsia="DFKai-SB" w:cs="DFKai-SB"/>
+          <w:b w:val="0"/>
+          <w:i/>
+          <w:color w:val="19352D"/>
+          <w:sz w:val="22"/>
+        </w:rPr>
+        <w:t>Clinical sociolinguistics</w:t>
+      </w:r>
+      <w:r>
+        <w:rPr>
+          <w:rFonts w:ascii="DFKai-SB" w:hAnsi="DFKai-SB" w:eastAsia="DFKai-SB" w:cs="DFKai-SB"/>
+          <w:b w:val="0"/>
+          <w:i w:val="0"/>
+          <w:color w:val="19352D"/>
+          <w:sz w:val="22"/>
+        </w:rPr>
+        <w:t xml:space="preserve"> (pp. 120–132). Blackwell Publishing. </w:t>
+      </w:r>
+      <w:hyperlink r:id="rId71">
+        <w:r>
+          <w:rPr>
+            <w:rFonts w:ascii="DFKai-SB" w:hAnsi="DFKai-SB" w:eastAsia="DFKai-SB" w:cs="DFKai-SB"/>
+            <w:color w:val="0563C1"/>
+            <w:u w:val="single"/>
+            <w:sz w:val="22"/>
+          </w:rPr>
+          <w:t>https://doi.org/10.1002/9780470754856.ch10</w:t>
+        </w:r>
+      </w:hyperlink>
+    </w:p>
+    <w:p>
+      <w:pPr>
+        <w:widowControl/>
+        <w:spacing w:line="480" w:lineRule="auto" w:after="0"/>
+        <w:ind w:left="720" w:hanging="720"/>
+        <w:jc w:val="left"/>
+      </w:pPr>
+      <w:r>
+        <w:rPr>
+          <w:rFonts w:ascii="DFKai-SB" w:hAnsi="DFKai-SB" w:eastAsia="DFKai-SB" w:cs="DFKai-SB"/>
+          <w:b w:val="0"/>
+          <w:i w:val="0"/>
+          <w:color w:val="19352D"/>
+          <w:sz w:val="22"/>
+        </w:rPr>
+        <w:t xml:space="preserve">Watt, D., &amp; Smith, J. (2005). Language change. In M. J. Ball (Ed.), </w:t>
+      </w:r>
+      <w:r>
+        <w:rPr>
+          <w:rFonts w:ascii="DFKai-SB" w:hAnsi="DFKai-SB" w:eastAsia="DFKai-SB" w:cs="DFKai-SB"/>
+          <w:b w:val="0"/>
+          <w:i/>
+          <w:color w:val="19352D"/>
+          <w:sz w:val="22"/>
+        </w:rPr>
+        <w:t>Clinical sociolinguistics</w:t>
+      </w:r>
+      <w:r>
+        <w:rPr>
+          <w:rFonts w:ascii="DFKai-SB" w:hAnsi="DFKai-SB" w:eastAsia="DFKai-SB" w:cs="DFKai-SB"/>
+          <w:b w:val="0"/>
+          <w:i w:val="0"/>
+          <w:color w:val="19352D"/>
+          <w:sz w:val="22"/>
+        </w:rPr>
+        <w:t xml:space="preserve"> (pp. 101–119). Blackwell Publishing. </w:t>
+      </w:r>
+      <w:hyperlink r:id="rId72">
+        <w:r>
+          <w:rPr>
+            <w:rFonts w:ascii="DFKai-SB" w:hAnsi="DFKai-SB" w:eastAsia="DFKai-SB" w:cs="DFKai-SB"/>
+            <w:color w:val="0563C1"/>
+            <w:u w:val="single"/>
+            <w:sz w:val="22"/>
+          </w:rPr>
+          <w:t>https://doi.org/10.1002/9780470754856.ch9</w:t>
+        </w:r>
+      </w:hyperlink>
+    </w:p>
+    <w:p>
+      <w:pPr>
+        <w:widowControl/>
+        <w:spacing w:line="480" w:lineRule="auto" w:after="0"/>
+        <w:ind w:left="720" w:hanging="720"/>
+        <w:jc w:val="left"/>
+      </w:pPr>
+      <w:r>
+        <w:rPr>
+          <w:rFonts w:ascii="DFKai-SB" w:hAnsi="DFKai-SB" w:eastAsia="DFKai-SB" w:cs="DFKai-SB"/>
+          <w:b w:val="0"/>
+          <w:i w:val="0"/>
+          <w:color w:val="19352D"/>
+          <w:sz w:val="22"/>
+        </w:rPr>
+        <w:t xml:space="preserve">Wei, L., Miller, N., Dodd, B., &amp; Hua, Z. (2005). Childhood bilingualism: Distinguishing difference from disorder. In M. J. Ball (Ed.), </w:t>
+      </w:r>
+      <w:r>
+        <w:rPr>
+          <w:rFonts w:ascii="DFKai-SB" w:hAnsi="DFKai-SB" w:eastAsia="DFKai-SB" w:cs="DFKai-SB"/>
+          <w:b w:val="0"/>
+          <w:i/>
+          <w:color w:val="19352D"/>
+          <w:sz w:val="22"/>
+        </w:rPr>
+        <w:t>Clinical sociolinguistics</w:t>
+      </w:r>
+      <w:r>
+        <w:rPr>
+          <w:rFonts w:ascii="DFKai-SB" w:hAnsi="DFKai-SB" w:eastAsia="DFKai-SB" w:cs="DFKai-SB"/>
+          <w:b w:val="0"/>
+          <w:i w:val="0"/>
+          <w:color w:val="19352D"/>
+          <w:sz w:val="22"/>
+        </w:rPr>
+        <w:t xml:space="preserve"> (pp. 193–206). Blackwell Publishing. </w:t>
+      </w:r>
+      <w:hyperlink r:id="rId73">
+        <w:r>
+          <w:rPr>
+            <w:rFonts w:ascii="DFKai-SB" w:hAnsi="DFKai-SB" w:eastAsia="DFKai-SB" w:cs="DFKai-SB"/>
+            <w:color w:val="0563C1"/>
+            <w:u w:val="single"/>
+            <w:sz w:val="22"/>
+          </w:rPr>
+          <w:t>https://doi.org/10.1002/9780470754856.ch15</w:t>
+        </w:r>
+      </w:hyperlink>
+    </w:p>
+    <w:p>
+      <w:pPr>
+        <w:widowControl/>
+        <w:spacing w:line="480" w:lineRule="auto" w:after="0"/>
+        <w:ind w:left="720" w:hanging="720"/>
+        <w:jc w:val="left"/>
+      </w:pPr>
+      <w:r>
+        <w:rPr>
+          <w:rFonts w:ascii="DFKai-SB" w:hAnsi="DFKai-SB" w:eastAsia="DFKai-SB" w:cs="DFKai-SB"/>
+          <w:b w:val="0"/>
+          <w:i w:val="0"/>
+          <w:color w:val="19352D"/>
+          <w:sz w:val="22"/>
+        </w:rPr>
+        <w:t xml:space="preserve">Wolfram, W. (2005). African American English. In M. J. Ball (Ed.), </w:t>
+      </w:r>
+      <w:r>
+        <w:rPr>
+          <w:rFonts w:ascii="DFKai-SB" w:hAnsi="DFKai-SB" w:eastAsia="DFKai-SB" w:cs="DFKai-SB"/>
+          <w:b w:val="0"/>
+          <w:i/>
+          <w:color w:val="19352D"/>
+          <w:sz w:val="22"/>
+        </w:rPr>
+        <w:t>Clinical sociolinguistics</w:t>
+      </w:r>
+      <w:r>
+        <w:rPr>
+          <w:rFonts w:ascii="DFKai-SB" w:hAnsi="DFKai-SB" w:eastAsia="DFKai-SB" w:cs="DFKai-SB"/>
+          <w:b w:val="0"/>
+          <w:i w:val="0"/>
+          <w:color w:val="19352D"/>
+          <w:sz w:val="22"/>
+        </w:rPr>
+        <w:t xml:space="preserve"> (pp. 87–100). Blackwell Publishing. </w:t>
+      </w:r>
+      <w:hyperlink r:id="rId74">
+        <w:r>
+          <w:rPr>
+            <w:rFonts w:ascii="DFKai-SB" w:hAnsi="DFKai-SB" w:eastAsia="DFKai-SB" w:cs="DFKai-SB"/>
+            <w:color w:val="0563C1"/>
+            <w:u w:val="single"/>
+            <w:sz w:val="22"/>
+          </w:rPr>
+          <w:t>https://doi.org/10.1002/9780470754856.ch8</w:t>
+        </w:r>
+      </w:hyperlink>
+    </w:p>
+    <w:p>
+      <w:pPr>
+        <w:widowControl/>
+        <w:spacing w:line="480" w:lineRule="auto" w:after="0"/>
+        <w:ind w:left="720" w:hanging="720"/>
+        <w:jc w:val="left"/>
+      </w:pPr>
+      <w:r>
+        <w:rPr>
+          <w:rFonts w:ascii="DFKai-SB" w:hAnsi="DFKai-SB" w:eastAsia="DFKai-SB" w:cs="DFKai-SB"/>
+          <w:b w:val="0"/>
+          <w:i w:val="0"/>
+          <w:color w:val="19352D"/>
+          <w:sz w:val="22"/>
+        </w:rPr>
+        <w:t xml:space="preserve">Ball, M. J. (Ed.). (2005). </w:t>
+      </w:r>
+      <w:r>
+        <w:rPr>
+          <w:rFonts w:ascii="DFKai-SB" w:hAnsi="DFKai-SB" w:eastAsia="DFKai-SB" w:cs="DFKai-SB"/>
+          <w:b w:val="0"/>
+          <w:i/>
+          <w:color w:val="19352D"/>
+          <w:sz w:val="22"/>
+        </w:rPr>
+        <w:t>Clinical sociolinguistics</w:t>
+      </w:r>
+      <w:r>
+        <w:rPr>
+          <w:rFonts w:ascii="DFKai-SB" w:hAnsi="DFKai-SB" w:eastAsia="DFKai-SB" w:cs="DFKai-SB"/>
+          <w:b w:val="0"/>
+          <w:i w:val="0"/>
+          <w:color w:val="19352D"/>
+          <w:sz w:val="22"/>
+        </w:rPr>
+        <w:t>. Blackwell Publishing.</w:t>
+      </w:r>
     </w:p>
     <w:p>
       <w:pPr>

</xml_diff>